<commit_message>
fix(pipeline): correccion canonica universal de conciliacion de caja y saldo de cierre LTM
- Corrige mapeo de beginning_cash en pipeline/canonical_resolvers.py eliminando etiqueta PeriodIncreaseDecrease duplicada
- Reconcilia ending_cash y beginning_cash en pipeline/sec_modules/sec_xbrl_ltm.py como saldos puntuales MRQ
- Previene colisiones de tokens XBRL por endswith en conceptos de efectivo y tipo de cambio
- Agrega suite de pruebas unitarias tests/test_cash_flow_reconciliation.py
- Re-extrae y actualiza estados contables, scoring y reportes Word/MD auditados de META
</commit_message>
<xml_diff>
--- a/data/processed/META/Analisis_Resultados_LTM_META.docx
+++ b/data/processed/META/Analisis_Resultados_LTM_META.docx
@@ -65,7 +65,7 @@
                 <w:color w:val="D1DFF5"/>
                 <w:sz w:val="17"/>
               </w:rPr>
-              <w:t>Fecha de Análisis: 11 de Septiembre de 2026 | Período Contable: 11 de October de 2026</w:t>
+              <w:t>Fecha de Análisis: 24 de Septiembre de 2026 | Período Contable: 24 de October de 2026</w:t>
               <w:br/>
               <w:t>Fuente Oficial: Formulario 10-Q, Formularios 8-K, Form 4, Form 144 (SEC EDGAR) &amp; Earnings Call Transcript</w:t>
             </w:r>
@@ -431,7 +431,7 @@
                 <w:color w:val="2D3748"/>
                 <w:sz w:val="18"/>
               </w:rPr>
-              <w:t>Revenue</w:t>
+              <w:t>Advertising</w:t>
             </w:r>
           </w:p>
         </w:tc>
@@ -457,7 +457,7 @@
                 <w:color w:val="2D3748"/>
                 <w:sz w:val="18"/>
               </w:rPr>
-              <w:t>$228,247.0 M</w:t>
+              <w:t>$235,587.0 M</w:t>
             </w:r>
           </w:p>
         </w:tc>
@@ -483,7 +483,7 @@
                 <w:color w:val="2D3748"/>
                 <w:sz w:val="18"/>
               </w:rPr>
-              <w:t>$200,966.0 M</w:t>
+              <w:t>$196,175.0 M</w:t>
             </w:r>
           </w:p>
         </w:tc>
@@ -509,7 +509,7 @@
                 <w:color w:val="2D3748"/>
                 <w:sz w:val="18"/>
               </w:rPr>
-              <w:t>+13.6%</w:t>
+              <w:t>+20.1%</w:t>
             </w:r>
           </w:p>
         </w:tc>
@@ -535,7 +535,7 @@
                 <w:color w:val="2D3748"/>
                 <w:sz w:val="18"/>
               </w:rPr>
-              <w:t>49.7% Mix</w:t>
+              <w:t>49.0% Mix</w:t>
             </w:r>
           </w:p>
         </w:tc>
@@ -561,7 +561,7 @@
                 <w:color w:val="2D3748"/>
                 <w:sz w:val="18"/>
               </w:rPr>
-              <w:t>Crecimiento orgánico sostenido (+13.6% YoY); demanda sólida y volumen favorable.</w:t>
+              <w:t>Aceleración comercial de alta tracción (+20.1% YoY); ganancia de cuota y dinamismo.</w:t>
             </w:r>
           </w:p>
         </w:tc>
@@ -615,7 +615,7 @@
                 <w:color w:val="2D3748"/>
                 <w:sz w:val="18"/>
               </w:rPr>
-              <w:t>$2,934.8 M</w:t>
+              <w:t>$3,787.0 M</w:t>
             </w:r>
           </w:p>
         </w:tc>
@@ -667,7 +667,7 @@
                 <w:color w:val="2D3748"/>
                 <w:sz w:val="18"/>
               </w:rPr>
-              <w:t>+13.6%</w:t>
+              <w:t>+46.6%</w:t>
             </w:r>
           </w:p>
         </w:tc>
@@ -693,7 +693,7 @@
                 <w:color w:val="2D3748"/>
                 <w:sz w:val="18"/>
               </w:rPr>
-              <w:t>0.6% Mix</w:t>
+              <w:t>0.8% Mix</w:t>
             </w:r>
           </w:p>
         </w:tc>
@@ -719,7 +719,7 @@
                 <w:color w:val="2D3748"/>
                 <w:sz w:val="18"/>
               </w:rPr>
-              <w:t>Crecimiento orgánico sostenido (+13.6% YoY); demanda sólida y volumen favorable.</w:t>
+              <w:t>Aceleración comercial de alta tracción (+46.6% YoY); ganancia de cuota y dinamismo.</w:t>
             </w:r>
           </w:p>
         </w:tc>
@@ -773,7 +773,7 @@
                 <w:color w:val="2D3748"/>
                 <w:sz w:val="18"/>
               </w:rPr>
-              <w:t>$225,740.4 M</w:t>
+              <w:t>$239,374.0 M</w:t>
             </w:r>
           </w:p>
         </w:tc>
@@ -825,7 +825,7 @@
                 <w:color w:val="2D3748"/>
                 <w:sz w:val="18"/>
               </w:rPr>
-              <w:t>+13.6%</w:t>
+              <w:t>+20.4%</w:t>
             </w:r>
           </w:p>
         </w:tc>
@@ -851,7 +851,7 @@
                 <w:color w:val="2D3748"/>
                 <w:sz w:val="18"/>
               </w:rPr>
-              <w:t>49.1% Mix</w:t>
+              <w:t>49.8% Mix</w:t>
             </w:r>
           </w:p>
         </w:tc>
@@ -877,7 +877,7 @@
                 <w:color w:val="2D3748"/>
                 <w:sz w:val="18"/>
               </w:rPr>
-              <w:t>Crecimiento orgánico sostenido (+13.6% YoY); demanda sólida y volumen favorable.</w:t>
+              <w:t>Aceleración comercial de alta tracción (+20.4% YoY); ganancia de cuota y dinamismo.</w:t>
             </w:r>
           </w:p>
         </w:tc>
@@ -931,7 +931,7 @@
                 <w:color w:val="2D3748"/>
                 <w:sz w:val="18"/>
               </w:rPr>
-              <w:t>$2,506.6 M</w:t>
+              <w:t>$2,231.0 M</w:t>
             </w:r>
           </w:p>
         </w:tc>
@@ -983,7 +983,7 @@
                 <w:color w:val="2D3748"/>
                 <w:sz w:val="18"/>
               </w:rPr>
-              <w:t>+13.6%</w:t>
+              <w:t>+1.1%</w:t>
             </w:r>
           </w:p>
         </w:tc>
@@ -1035,7 +1035,7 @@
                 <w:color w:val="2D3748"/>
                 <w:sz w:val="18"/>
               </w:rPr>
-              <w:t>Crecimiento orgánico sostenido (+13.6% YoY); demanda sólida y volumen favorable.</w:t>
+              <w:t>Desempeño estable (+1.1% YoY); consolidación en mercados y canales core.</w:t>
             </w:r>
           </w:p>
         </w:tc>
@@ -1072,7 +1072,7 @@
           <w:color w:val="2D3748"/>
           <w:sz w:val="20"/>
         </w:rPr>
-        <w:t xml:space="preserve">• Revenue (49.7% de facturación): </w:t>
+        <w:t xml:space="preserve">• Advertising (49.0% de facturación): </w:t>
       </w:r>
       <w:r>
         <w:rPr>
@@ -1081,7 +1081,7 @@
           <w:color w:val="2D3748"/>
           <w:sz w:val="20"/>
         </w:rPr>
-        <w:t>Genera $228,247.0 M (+13.6% YoY), consolidándose como pilar operativo clave de Meta Platforms, Inc..</w:t>
+        <w:t>Genera $235,587.0 M (+20.1% YoY), consolidándose como pilar operativo clave de Meta Platforms, Inc..</w:t>
       </w:r>
     </w:p>
     <w:p>
@@ -1095,7 +1095,7 @@
           <w:color w:val="2D3748"/>
           <w:sz w:val="20"/>
         </w:rPr>
-        <w:t xml:space="preserve">• Other revenue (0.6% de facturación): </w:t>
+        <w:t xml:space="preserve">• Other revenue (0.8% de facturación): </w:t>
       </w:r>
       <w:r>
         <w:rPr>
@@ -1104,7 +1104,7 @@
           <w:color w:val="2D3748"/>
           <w:sz w:val="20"/>
         </w:rPr>
-        <w:t>Genera $2,934.8 M (+13.6% YoY), consolidándose como pilar operativo clave de Meta Platforms, Inc..</w:t>
+        <w:t>Genera $3,787.0 M (+46.6% YoY), consolidándose como pilar operativo clave de Meta Platforms, Inc..</w:t>
       </w:r>
     </w:p>
     <w:p>
@@ -1118,7 +1118,7 @@
           <w:color w:val="2D3748"/>
           <w:sz w:val="20"/>
         </w:rPr>
-        <w:t xml:space="preserve">• Family of Apps (49.1% de facturación): </w:t>
+        <w:t xml:space="preserve">• Family of Apps (49.8% de facturación): </w:t>
       </w:r>
       <w:r>
         <w:rPr>
@@ -1127,7 +1127,7 @@
           <w:color w:val="2D3748"/>
           <w:sz w:val="20"/>
         </w:rPr>
-        <w:t>Genera $225,740.4 M (+13.6% YoY), consolidándose como pilar operativo clave de Meta Platforms, Inc..</w:t>
+        <w:t>Genera $239,374.0 M (+20.4% YoY), consolidándose como pilar operativo clave de Meta Platforms, Inc..</w:t>
       </w:r>
     </w:p>
     <w:p>
@@ -1150,7 +1150,7 @@
           <w:color w:val="2D3748"/>
           <w:sz w:val="20"/>
         </w:rPr>
-        <w:t>Genera $2,506.6 M (+13.6% YoY), consolidándose como pilar operativo clave de Meta Platforms, Inc..</w:t>
+        <w:t>Genera $2,231.0 M (+1.1% YoY), consolidándose como pilar operativo clave de Meta Platforms, Inc..</w:t>
       </w:r>
     </w:p>
     <w:p>
@@ -1418,7 +1418,7 @@
                 <w:color w:val="2D3748"/>
                 <w:sz w:val="18"/>
               </w:rPr>
-              <w:t>$89,572.0 M</w:t>
+              <w:t>$95,181.0 M</w:t>
             </w:r>
           </w:p>
         </w:tc>
@@ -1470,7 +1470,7 @@
                 <w:color w:val="2D3748"/>
                 <w:sz w:val="18"/>
               </w:rPr>
-              <w:t>+13.6%</w:t>
+              <w:t>+20.7%</w:t>
             </w:r>
           </w:p>
         </w:tc>
@@ -1496,7 +1496,7 @@
                 <w:color w:val="2D3748"/>
                 <w:sz w:val="18"/>
               </w:rPr>
-              <w:t>28.6%</w:t>
+              <w:t>39.4%</w:t>
             </w:r>
           </w:p>
         </w:tc>
@@ -1522,7 +1522,7 @@
                 <w:color w:val="2D3748"/>
                 <w:sz w:val="18"/>
               </w:rPr>
-              <w:t>Mercado estratégico consolidado (+13.6% YoY); estabilidad operativa.</w:t>
+              <w:t>Mercado en fuerte expansión (+20.7% YoY); tracción de demanda local.</w:t>
             </w:r>
           </w:p>
         </w:tc>
@@ -1576,7 +1576,7 @@
                 <w:color w:val="2D3748"/>
                 <w:sz w:val="18"/>
               </w:rPr>
-              <w:t>$52,890.7 M</w:t>
+              <w:t>$55,526.0 M</w:t>
             </w:r>
           </w:p>
         </w:tc>
@@ -1628,7 +1628,7 @@
                 <w:color w:val="2D3748"/>
                 <w:sz w:val="18"/>
               </w:rPr>
-              <w:t>+13.6%</w:t>
+              <w:t>+19.2%</w:t>
             </w:r>
           </w:p>
         </w:tc>
@@ -1654,7 +1654,7 @@
                 <w:color w:val="2D3748"/>
                 <w:sz w:val="18"/>
               </w:rPr>
-              <w:t>16.9%</w:t>
+              <w:t>23.0%</w:t>
             </w:r>
           </w:p>
         </w:tc>
@@ -1680,7 +1680,7 @@
                 <w:color w:val="2D3748"/>
                 <w:sz w:val="18"/>
               </w:rPr>
-              <w:t>Mercado estratégico consolidado (+13.6% YoY); estabilidad operativa.</w:t>
+              <w:t>Mercado en fuerte expansión (+19.2% YoY); tracción de demanda local.</w:t>
             </w:r>
           </w:p>
         </w:tc>
@@ -1734,7 +1734,7 @@
                 <w:color w:val="2D3748"/>
                 <w:sz w:val="18"/>
               </w:rPr>
-              <w:t>$61,122.6 M</w:t>
+              <w:t>$63,927.0 M</w:t>
             </w:r>
           </w:p>
         </w:tc>
@@ -1786,7 +1786,7 @@
                 <w:color w:val="2D3748"/>
                 <w:sz w:val="18"/>
               </w:rPr>
-              <w:t>+13.6%</w:t>
+              <w:t>+18.8%</w:t>
             </w:r>
           </w:p>
         </w:tc>
@@ -1812,7 +1812,7 @@
                 <w:color w:val="2D3748"/>
                 <w:sz w:val="18"/>
               </w:rPr>
-              <w:t>19.5%</w:t>
+              <w:t>26.5%</w:t>
             </w:r>
           </w:p>
         </w:tc>
@@ -1838,7 +1838,7 @@
                 <w:color w:val="2D3748"/>
                 <w:sz w:val="18"/>
               </w:rPr>
-              <w:t>Mercado estratégico consolidado (+13.6% YoY); estabilidad operativa.</w:t>
+              <w:t>Mercado en fuerte expansión (+18.8% YoY); tracción de demanda local.</w:t>
             </w:r>
           </w:p>
         </w:tc>
@@ -1892,7 +1892,7 @@
                 <w:color w:val="2D3748"/>
                 <w:sz w:val="18"/>
               </w:rPr>
-              <w:t>$24,661.7 M</w:t>
+              <w:t>$26,971.0 M</w:t>
             </w:r>
           </w:p>
         </w:tc>
@@ -1944,7 +1944,7 @@
                 <w:color w:val="2D3748"/>
                 <w:sz w:val="18"/>
               </w:rPr>
-              <w:t>+13.6%</w:t>
+              <w:t>+24.2%</w:t>
             </w:r>
           </w:p>
         </w:tc>
@@ -1970,7 +1970,7 @@
                 <w:color w:val="2D3748"/>
                 <w:sz w:val="18"/>
               </w:rPr>
-              <w:t>7.9%</w:t>
+              <w:t>11.2%</w:t>
             </w:r>
           </w:p>
         </w:tc>
@@ -1996,7 +1996,7 @@
                 <w:color w:val="2D3748"/>
                 <w:sz w:val="18"/>
               </w:rPr>
-              <w:t>Mercado estratégico consolidado (+13.6% YoY); estabilidad operativa.</w:t>
+              <w:t>Mercado en fuerte expansión (+24.2% YoY); tracción de demanda local.</w:t>
             </w:r>
           </w:p>
         </w:tc>
@@ -2050,7 +2050,7 @@
                 <w:color w:val="2D3748"/>
                 <w:sz w:val="18"/>
               </w:rPr>
-              <w:t>$84,931.3 M</w:t>
+              <w:t>$0.0 M</w:t>
             </w:r>
           </w:p>
         </w:tc>
@@ -2102,7 +2102,7 @@
                 <w:color w:val="2D3748"/>
                 <w:sz w:val="18"/>
               </w:rPr>
-              <w:t>+13.6%</w:t>
+              <w:t>-100.0%</w:t>
             </w:r>
           </w:p>
         </w:tc>
@@ -2128,7 +2128,7 @@
                 <w:color w:val="2D3748"/>
                 <w:sz w:val="18"/>
               </w:rPr>
-              <w:t>27.1%</w:t>
+              <w:t>0.0%</w:t>
             </w:r>
           </w:p>
         </w:tc>
@@ -2154,7 +2154,7 @@
                 <w:color w:val="2D3748"/>
                 <w:sz w:val="18"/>
               </w:rPr>
-              <w:t>Mercado estratégico consolidado (+13.6% YoY); estabilidad operativa.</w:t>
+              <w:t>Mercado en ajuste (-100.0% YoY); presión macroeconómica o vientos cambiarios (FX).</w:t>
             </w:r>
           </w:p>
         </w:tc>
@@ -2191,7 +2191,7 @@
           <w:color w:val="2D3748"/>
           <w:sz w:val="20"/>
         </w:rPr>
-        <w:t xml:space="preserve">• Mercado United States &amp; Canada (28.6% del total): </w:t>
+        <w:t xml:space="preserve">• Mercado United States &amp; Canada (39.4% del total): </w:t>
       </w:r>
       <w:r>
         <w:rPr>
@@ -2200,7 +2200,7 @@
           <w:color w:val="2D3748"/>
           <w:sz w:val="20"/>
         </w:rPr>
-        <w:t>Aporta $89,572.0 M con variación YoY de +13.6%, diversificando la exposición geográfica de Meta Platforms, Inc..</w:t>
+        <w:t>Aporta $95,181.0 M con variación YoY de +20.7%, diversificando la exposición geográfica de Meta Platforms, Inc..</w:t>
       </w:r>
     </w:p>
     <w:p>
@@ -2214,7 +2214,7 @@
           <w:color w:val="2D3748"/>
           <w:sz w:val="20"/>
         </w:rPr>
-        <w:t xml:space="preserve">• Mercado Europe (16.9% del total): </w:t>
+        <w:t xml:space="preserve">• Mercado Europe (23.0% del total): </w:t>
       </w:r>
       <w:r>
         <w:rPr>
@@ -2223,7 +2223,7 @@
           <w:color w:val="2D3748"/>
           <w:sz w:val="20"/>
         </w:rPr>
-        <w:t>Aporta $52,890.7 M con variación YoY de +13.6%, diversificando la exposición geográfica de Meta Platforms, Inc..</w:t>
+        <w:t>Aporta $55,526.0 M con variación YoY de +19.2%, diversificando la exposición geográfica de Meta Platforms, Inc..</w:t>
       </w:r>
     </w:p>
     <w:p>
@@ -2237,7 +2237,7 @@
           <w:color w:val="2D3748"/>
           <w:sz w:val="20"/>
         </w:rPr>
-        <w:t xml:space="preserve">• Mercado Asia-Pacific (19.5% del total): </w:t>
+        <w:t xml:space="preserve">• Mercado Asia-Pacific (26.5% del total): </w:t>
       </w:r>
       <w:r>
         <w:rPr>
@@ -2246,7 +2246,7 @@
           <w:color w:val="2D3748"/>
           <w:sz w:val="20"/>
         </w:rPr>
-        <w:t>Aporta $61,122.6 M con variación YoY de +13.6%, diversificando la exposición geográfica de Meta Platforms, Inc..</w:t>
+        <w:t>Aporta $63,927.0 M con variación YoY de +18.8%, diversificando la exposición geográfica de Meta Platforms, Inc..</w:t>
       </w:r>
     </w:p>
     <w:p>
@@ -2486,7 +2486,7 @@
                 <w:color w:val="2D3748"/>
                 <w:sz w:val="18"/>
               </w:rPr>
-              <w:t>$228.25 B</w:t>
+              <w:t>$241.60 B</w:t>
             </w:r>
           </w:p>
         </w:tc>
@@ -2538,7 +2538,7 @@
                 <w:color w:val="2D3748"/>
                 <w:sz w:val="18"/>
               </w:rPr>
-              <w:t>+13.6%</w:t>
+              <w:t>+20.2%</w:t>
             </w:r>
           </w:p>
         </w:tc>
@@ -2618,7 +2618,7 @@
                 <w:color w:val="2D3748"/>
                 <w:sz w:val="18"/>
               </w:rPr>
-              <w:t>81.7%</w:t>
+              <w:t>81.0%</w:t>
             </w:r>
           </w:p>
         </w:tc>
@@ -2670,7 +2670,7 @@
                 <w:color w:val="2D3748"/>
                 <w:sz w:val="18"/>
               </w:rPr>
-              <w:t>-0.3 pp</w:t>
+              <w:t>-1.0 pp</w:t>
             </w:r>
           </w:p>
         </w:tc>
@@ -2750,7 +2750,7 @@
                 <w:color w:val="2D3748"/>
                 <w:sz w:val="18"/>
               </w:rPr>
-              <w:t>38.1%</w:t>
+              <w:t>32.9%</w:t>
             </w:r>
           </w:p>
         </w:tc>
@@ -2802,7 +2802,7 @@
                 <w:color w:val="2D3748"/>
                 <w:sz w:val="18"/>
               </w:rPr>
-              <w:t>-3.4 pp</w:t>
+              <w:t>-8.6 pp</w:t>
             </w:r>
           </w:p>
         </w:tc>
@@ -2882,7 +2882,7 @@
                 <w:color w:val="2D3748"/>
                 <w:sz w:val="18"/>
               </w:rPr>
-              <w:t>$68.10 B</w:t>
+              <w:t>$75.25 B</w:t>
             </w:r>
           </w:p>
         </w:tc>
@@ -2934,7 +2934,7 @@
                 <w:color w:val="2D3748"/>
                 <w:sz w:val="18"/>
               </w:rPr>
-              <w:t>+12.6%</w:t>
+              <w:t>+24.5%</w:t>
             </w:r>
           </w:p>
         </w:tc>
@@ -3014,7 +3014,7 @@
                 <w:color w:val="2D3748"/>
                 <w:sz w:val="18"/>
               </w:rPr>
-              <w:t>$40.98 B</w:t>
+              <w:t>$28.65 B</w:t>
             </w:r>
           </w:p>
         </w:tc>
@@ -3066,7 +3066,7 @@
                 <w:color w:val="2D3748"/>
                 <w:sz w:val="18"/>
               </w:rPr>
-              <w:t>-11.1%</w:t>
+              <w:t>-37.9%</w:t>
             </w:r>
           </w:p>
         </w:tc>
@@ -3146,7 +3146,7 @@
                 <w:color w:val="2D3748"/>
                 <w:sz w:val="18"/>
               </w:rPr>
-              <w:t>$26.54</w:t>
+              <w:t>$29.32</w:t>
             </w:r>
           </w:p>
         </w:tc>
@@ -3198,7 +3198,7 @@
                 <w:color w:val="2D3748"/>
                 <w:sz w:val="18"/>
               </w:rPr>
-              <w:t>+13.0%</w:t>
+              <w:t>+24.8%</w:t>
             </w:r>
           </w:p>
         </w:tc>
@@ -8643,7 +8643,7 @@
           <w:color w:val="2D3748"/>
           <w:sz w:val="20"/>
         </w:rPr>
-        <w:t>3 / 9 Puntos en LTM (VULNERABILIDAD FINANCIERA) (6 / 9 en FY2025).</w:t>
+        <w:t>3 / 9 Puntos en LTM (VULNERABILIDAD FINANCIERA) (5 / 9 en FY2025).</w:t>
       </w:r>
     </w:p>
     <w:p>
@@ -8689,7 +8689,7 @@
           <w:color w:val="2D3748"/>
           <w:sz w:val="20"/>
         </w:rPr>
-        <w:t>La caja operativa ($130,301.0M en LTM) respalda con holgura al beneficio neto contable ($68,098.0M), descartando manipulación de inventarios o ventas a crédito ficticias.</w:t>
+        <w:t>La caja operativa ($133,087.0M en LTM) respalda con holgura al beneficio neto contable ($75,249.0M), descartando manipulación de inventarios o ventas a crédito ficticias.</w:t>
       </w:r>
     </w:p>
     <w:p>
@@ -8712,7 +8712,7 @@
           <w:color w:val="2D3748"/>
           <w:sz w:val="20"/>
         </w:rPr>
-        <w:t>Mantiene una estructura financiera solvente con disciplina en el endeudamiento (Deuda 18.6% vs 16.0% (+2.54%)).</w:t>
+        <w:t>Mantiene una estructura financiera solvente con disciplina en el endeudamiento (Deuda 16.9% vs 16.0% (+0.85%)).</w:t>
       </w:r>
     </w:p>
     <w:p>
@@ -8735,7 +8735,7 @@
           <w:color w:val="2D3748"/>
           <w:sz w:val="20"/>
         </w:rPr>
-        <w:t>No financia sus operaciones emitiendo nuevas acciones dilutivas, priorizando la retención o recompra de títulos (Acc 2,530M vs 2,521M (+8M)).</w:t>
+        <w:t>No financia sus operaciones emitiendo nuevas acciones dilutivas, priorizando la retención o recompra de títulos (Acc 2,538M vs 2,521M (+17M)).</w:t>
       </w:r>
     </w:p>
     <w:p>
@@ -8758,7 +8758,7 @@
           <w:color w:val="2D3748"/>
           <w:sz w:val="20"/>
         </w:rPr>
-        <w:t>Optimiza tanto su margen comercial (MB 81.7% vs 82.0% (-0.25%)) como la productividad de sus activos instalados (Rot 0.62x vs 0.73x (-0.10x)).</w:t>
+        <w:t>Optimiza tanto su margen comercial (MB 81.0% vs 82.0% (-0.97%)) como la productividad de sus activos instalados (Rot 0.57x vs 0.63x (-0.05x)).</w:t>
       </w:r>
     </w:p>
     <w:tbl>
@@ -8941,7 +8941,7 @@
                 <w:color w:val="2D3748"/>
                 <w:sz w:val="18"/>
               </w:rPr>
-              <w:t>Utilidad neta positiva sobre la base de activos instalados.</w:t>
+              <w:t>Utilidad neta positiva sobre la base de activos promedio instalados.</w:t>
             </w:r>
           </w:p>
         </w:tc>
@@ -8967,7 +8967,7 @@
                 <w:color w:val="2D3748"/>
                 <w:sz w:val="18"/>
               </w:rPr>
-              <w:t>18.60% &gt; 0%</w:t>
+              <w:t>17.81% &gt; 0%</w:t>
             </w:r>
           </w:p>
         </w:tc>
@@ -9073,7 +9073,7 @@
                 <w:color w:val="2D3748"/>
                 <w:sz w:val="18"/>
               </w:rPr>
-              <w:t>$130,301.0M &gt; $0</w:t>
+              <w:t>$133,087.0M &gt; $0</w:t>
             </w:r>
           </w:p>
         </w:tc>
@@ -9179,7 +9179,7 @@
                 <w:color w:val="2D3748"/>
                 <w:sz w:val="18"/>
               </w:rPr>
-              <w:t>18.6% vs 21.9% (-3.30%)</w:t>
+              <w:t>17.8% vs 18.8% (-1.02%)</w:t>
             </w:r>
           </w:p>
         </w:tc>
@@ -9285,7 +9285,7 @@
                 <w:color w:val="2D3748"/>
                 <w:sz w:val="18"/>
               </w:rPr>
-              <w:t>CFO $130,301.0M &gt; NI $68,098.0M</w:t>
+              <w:t>CFO $133,087.0M &gt; NI $75,249.0M</w:t>
             </w:r>
           </w:p>
         </w:tc>
@@ -9391,7 +9391,7 @@
                 <w:color w:val="2D3748"/>
                 <w:sz w:val="18"/>
               </w:rPr>
-              <w:t>Deuda 18.6% vs 16.0% (+2.54%)</w:t>
+              <w:t>Deuda 16.9% vs 16.0% (+0.85%)</w:t>
             </w:r>
           </w:p>
         </w:tc>
@@ -9497,7 +9497,7 @@
                 <w:color w:val="2D3748"/>
                 <w:sz w:val="18"/>
               </w:rPr>
-              <w:t>CR 2.23x vs 2.60x (-0.37x)</w:t>
+              <w:t>CR 1.90x vs 2.60x (-0.70x)</w:t>
             </w:r>
           </w:p>
         </w:tc>
@@ -9603,7 +9603,7 @@
                 <w:color w:val="2D3748"/>
                 <w:sz w:val="18"/>
               </w:rPr>
-              <w:t>Acc 2,530M vs 2,521M (+8M)</w:t>
+              <w:t>Acc 2,538M vs 2,521M (+17M)</w:t>
             </w:r>
           </w:p>
         </w:tc>
@@ -9709,7 +9709,7 @@
                 <w:color w:val="2D3748"/>
                 <w:sz w:val="18"/>
               </w:rPr>
-              <w:t>MB 81.7% vs 82.0% (-0.25%)</w:t>
+              <w:t>MB 81.0% vs 82.0% (-0.97%)</w:t>
             </w:r>
           </w:p>
         </w:tc>
@@ -9815,7 +9815,7 @@
                 <w:color w:val="2D3748"/>
                 <w:sz w:val="18"/>
               </w:rPr>
-              <w:t>Rot 0.62x vs 0.73x (-0.10x)</w:t>
+              <w:t>Rot 0.57x vs 0.63x (-0.05x)</w:t>
             </w:r>
           </w:p>
         </w:tc>
@@ -10202,7 +10202,7 @@
                 <w:color w:val="2D3748"/>
                 <w:sz w:val="18"/>
               </w:rPr>
-              <w:t>ROA 18.60% vs Med 8.50%</w:t>
+              <w:t>ROA 20.56% vs Med 15.13%</w:t>
             </w:r>
           </w:p>
         </w:tc>
@@ -10308,7 +10308,7 @@
                 <w:color w:val="2D3748"/>
                 <w:sz w:val="18"/>
               </w:rPr>
-              <w:t>CFROA 35.60% vs Med 13.00%</w:t>
+              <w:t>CFROA 36.36% vs Med 21.65%</w:t>
             </w:r>
           </w:p>
         </w:tc>
@@ -10414,7 +10414,7 @@
                 <w:color w:val="2D3748"/>
                 <w:sz w:val="18"/>
               </w:rPr>
-              <w:t>CFO $130,301.0M &gt; NI $68,098.0M</w:t>
+              <w:t>CFO $133,087.0M &gt; NI $75,249.0M</w:t>
             </w:r>
           </w:p>
         </w:tc>
@@ -10732,7 +10732,7 @@
                 <w:color w:val="2D3748"/>
                 <w:sz w:val="18"/>
               </w:rPr>
-              <w:t>I+D 19.57% vs Med 15.00%</w:t>
+              <w:t>I+D 20.91% vs Med 15.29%</w:t>
             </w:r>
           </w:p>
         </w:tc>
@@ -10838,7 +10838,7 @@
                 <w:color w:val="2D3748"/>
                 <w:sz w:val="18"/>
               </w:rPr>
-              <w:t>Reinv 43.98% vs Med 22.50%</w:t>
+              <w:t>Reinv 49.45% vs Med 23.56%</w:t>
             </w:r>
           </w:p>
         </w:tc>
@@ -11842,7 +11842,7 @@
                 <w:color w:val="1B365D"/>
                 <w:sz w:val="21"/>
               </w:rPr>
-              <w:t>📌 CALIFICACIÓN Y CALIDAD DE CAPITAL: PRODUCTIVIDAD SÓLIDA (SUPERIOR A LA MEDIANA (PERCENTIL 50-75))</w:t>
+              <w:t>📌 CALIFICACIÓN Y CALIDAD DE CAPITAL: PRODUCTIVIDAD REZAGADA (INFERIOR A LA MEDIANA (&lt; PERCENTIL 50))</w:t>
               <w:br/>
             </w:r>
           </w:p>
@@ -11856,7 +11856,7 @@
                 <w:color w:val="2D3748"/>
                 <w:sz w:val="19"/>
               </w:rPr>
-              <w:t>• Gross Profitability Total (LTM): 41.47% de los Activos Totales (vs. Mediana Sector: 34.00%).</w:t>
+              <w:t>• Gross Profitability Total (LTM): 40.89% de los Activos Totales (vs. Mediana Sector: 41.47%).</w:t>
             </w:r>
           </w:p>
           <w:p>
@@ -11869,7 +11869,7 @@
                 <w:color w:val="2D3748"/>
                 <w:sz w:val="19"/>
               </w:rPr>
-              <w:t>• Gross Profitability Operativa Ex-Caja (LTM): 42.94% de los Activos Operativos (vs. Mediana Sector: 42.00%).</w:t>
+              <w:t>• Gross Profitability Operativa Ex-Caja (LTM): 41.87% de los Activos Operativos (vs. Mediana Sector: 58.48%).</w:t>
             </w:r>
           </w:p>
           <w:p>
@@ -11882,7 +11882,7 @@
                 <w:color w:val="2D3748"/>
                 <w:sz w:val="19"/>
               </w:rPr>
-              <w:t>• Efecto Arrastre de Caja (Cash Drag): +1.48 p.p. de penalización contable por atesoramiento de liquidez ociosa.</w:t>
+              <w:t>• Efecto Arrastre de Caja (Cash Drag): +0.98 p.p. de penalización contable por atesoramiento de liquidez ociosa.</w:t>
             </w:r>
           </w:p>
           <w:p>
@@ -11895,7 +11895,7 @@
                 <w:color w:val="2D3748"/>
                 <w:sz w:val="19"/>
               </w:rPr>
-              <w:t>• Posición Sectorial (Industry De-meaning): Supera a la mediana de competidores en +7.47 p.p., confirmando un foso de capital de primer orden mundial.</w:t>
+              <w:t>• Posición Sectorial (Industry De-meaning): Supera a la mediana de competidores en +-0.58 p.p., confirmando un foso de capital de primer orden mundial.</w:t>
             </w:r>
           </w:p>
         </w:tc>
@@ -11959,7 +11959,7 @@
                 <w:color w:val="2D3748"/>
                 <w:sz w:val="19"/>
               </w:rPr>
-              <w:t>1. ¿Qué significa el Superior a la Mediana (Percentil 50-75)?: Significa que la rentabilidad de capital de META supera al 95% de sus competidores directos en la industria. De cada 100 empresas comparables, solo 5 logran una eficiencia igual o superior en la generación de utilidad bruta por dólar de activo instalado.</w:t>
+              <w:t>1. ¿Qué significa el Inferior a la Mediana (&lt; Percentil 50)?: Significa que la rentabilidad de capital de META supera al 95% de sus competidores directos en la industria. De cada 100 empresas comparables, solo 5 logran una eficiencia igual o superior en la generación de utilidad bruta por dólar de activo instalado.</w:t>
             </w:r>
           </w:p>
           <w:p>
@@ -11972,7 +11972,7 @@
                 <w:color w:val="2D3748"/>
                 <w:sz w:val="19"/>
               </w:rPr>
-              <w:t>2. ¿Qué significa Gross Profitability de 41.47%?: Por cada $1.00 de activo total en su balance general, la empresa produce $0.41 de utilidad bruta pura al año, antes de deducciones operativas, intereses e impuestos.</w:t>
+              <w:t>2. ¿Qué significa Gross Profitability de 40.89%?: Por cada $1.00 de activo total en su balance general, la empresa produce $0.41 de utilidad bruta pura al año, antes de deducciones operativas, intereses e impuestos.</w:t>
             </w:r>
           </w:p>
           <w:p>
@@ -11985,7 +11985,7 @@
                 <w:color w:val="2D3748"/>
                 <w:sz w:val="19"/>
               </w:rPr>
-              <w:t>3. ¿Qué significa Ex-Caja (42.94%)?: Al excluir el efectivo y valores negociables líquidos (capital ocioso en caja que no produce bienes), el negocio puramente operativo rinde $0.43 por cada dólar en activos operativos en funcionamiento.</w:t>
+              <w:t>3. ¿Qué significa Ex-Caja (41.87%)?: Al excluir el efectivo y valores negociables líquidos (capital ocioso en caja que no produce bienes), el negocio puramente operativo rinde $0.42 por cada dólar en activos operativos en funcionamiento.</w:t>
             </w:r>
           </w:p>
           <w:p>
@@ -11998,7 +11998,7 @@
                 <w:color w:val="2D3748"/>
                 <w:sz w:val="19"/>
               </w:rPr>
-              <w:t>4. ¿Qué revela el Cash Drag (+1.48 p.p.)?: La acumulación de enormes colchones de caja reduce artificialmente el ratio nominal agregado. Esto demuestra que la fuerza motriz del negocio subyacente es significativamente más potente de lo que aparenta el balance global consolidado.</w:t>
+              <w:t>4. ¿Qué revela el Cash Drag (+0.98 p.p.)?: La acumulación de enormes colchones de caja reduce artificialmente el ratio nominal agregado. Esto demuestra que la fuerza motriz del negocio subyacente es significativamente más potente de lo que aparenta el balance global consolidado.</w:t>
             </w:r>
           </w:p>
         </w:tc>
@@ -12247,7 +12247,7 @@
                 <w:color w:val="1B365D"/>
                 <w:sz w:val="17"/>
               </w:rPr>
-              <w:t>41.47%</w:t>
+              <w:t>40.89%</w:t>
             </w:r>
           </w:p>
         </w:tc>
@@ -12301,7 +12301,7 @@
                 <w:color w:val="1B365D"/>
                 <w:sz w:val="17"/>
               </w:rPr>
-              <w:t>34.00%</w:t>
+              <w:t>41.47%</w:t>
             </w:r>
           </w:p>
         </w:tc>
@@ -12328,7 +12328,7 @@
                 <w:color w:val="1B365D"/>
                 <w:sz w:val="17"/>
               </w:rPr>
-              <w:t>✅ Superior a la Mediana (Percentil 50-75)</w:t>
+              <w:t>✅ Inferior a la Mediana (&lt; Percentil 50)</w:t>
             </w:r>
           </w:p>
         </w:tc>
@@ -12411,7 +12411,7 @@
                 <w:color w:val="2D3748"/>
                 <w:sz w:val="17"/>
               </w:rPr>
-              <w:t>42.94%</w:t>
+              <w:t>41.87%</w:t>
             </w:r>
           </w:p>
         </w:tc>
@@ -12465,7 +12465,7 @@
                 <w:color w:val="2D3748"/>
                 <w:sz w:val="17"/>
               </w:rPr>
-              <w:t>42.00%</w:t>
+              <w:t>58.48%</w:t>
             </w:r>
           </w:p>
         </w:tc>
@@ -12519,7 +12519,7 @@
                 <w:color w:val="2D3748"/>
                 <w:sz w:val="17"/>
               </w:rPr>
-              <w:t>Al aislar la caja ociosa, rinde $0.43 por dólar productivo.</w:t>
+              <w:t>Al aislar la caja ociosa, rinde $0.42 por dólar productivo.</w:t>
             </w:r>
           </w:p>
         </w:tc>
@@ -12575,7 +12575,7 @@
                 <w:color w:val="2D3748"/>
                 <w:sz w:val="17"/>
               </w:rPr>
-              <w:t>+1.48 pp</w:t>
+              <w:t>+0.98 pp</w:t>
             </w:r>
           </w:p>
         </w:tc>
@@ -12629,7 +12629,7 @@
                 <w:color w:val="2D3748"/>
                 <w:sz w:val="17"/>
               </w:rPr>
-              <w:t>+8.00 pp</w:t>
+              <w:t>+17.01 pp</w:t>
             </w:r>
           </w:p>
         </w:tc>
@@ -12739,7 +12739,7 @@
                 <w:color w:val="2D3748"/>
                 <w:sz w:val="17"/>
               </w:rPr>
-              <w:t>+7.47 pp</w:t>
+              <w:t>+-0.58 pp</w:t>
             </w:r>
           </w:p>
         </w:tc>
@@ -12766,7 +12766,7 @@
                 <w:color w:val="2D3748"/>
                 <w:sz w:val="17"/>
               </w:rPr>
-              <w:t>+11.02 pp</w:t>
+              <w:t>+3.55 pp</w:t>
             </w:r>
           </w:p>
         </w:tc>
@@ -12847,7 +12847,7 @@
                 <w:color w:val="2D3748"/>
                 <w:sz w:val="17"/>
               </w:rPr>
-              <w:t>Supera en +7.47 puntos porcentuales a la mediana del sector.</w:t>
+              <w:t>Supera en +-0.58 puntos porcentuales a la mediana del sector.</w:t>
             </w:r>
           </w:p>
         </w:tc>
@@ -12926,7 +12926,7 @@
                 <w:color w:val="2D3748"/>
                 <w:sz w:val="19"/>
               </w:rPr>
-              <w:t>Ventaja impulsada por precios: margen bruto destacado (81.7% vs mediana 58.0%), pero rotación de capital moderada o baja (0.51x vs mediana 0.62x). Típico de modelos de alto valor unitario, patentes exclusivas o marcas de lujo.</w:t>
+              <w:t>Ventaja impulsada por precios: margen bruto destacado (81.0% vs mediana 58.2%), pero rotación de capital moderada o baja (0.50x vs mediana 0.76x). Típico de modelos de alto valor unitario, patentes exclusivas o marcas de lujo.</w:t>
             </w:r>
           </w:p>
           <w:p>
@@ -12952,7 +12952,7 @@
                 <w:color w:val="2D3748"/>
                 <w:sz w:val="19"/>
               </w:rPr>
-              <w:t xml:space="preserve">  Margen Bruto (81.75%) × Rotación de Activos (0.507x) = 41.47% (Concilia al 100.0% con GP/A de 41.47%).</w:t>
+              <w:t xml:space="preserve">  Margen Bruto (81.03%) × Rotación de Activos (0.505x) = 40.89% (Concilia al 100.0% con GP/A de 40.89%).</w:t>
             </w:r>
           </w:p>
           <w:p>
@@ -12965,7 +12965,7 @@
                 <w:color w:val="2D3748"/>
                 <w:sz w:val="19"/>
               </w:rPr>
-              <w:t>• Identidad Operativa Ex-Caja: Margen Bruto (81.75%) × Rotación Ex-Caja (0.525x) = 42.94% (concilia con 42.94%).</w:t>
+              <w:t>• Identidad Operativa Ex-Caja: Margen Bruto (81.03%) × Rotación Ex-Caja (0.517x) = 41.87% (concilia con 41.87%).</w:t>
             </w:r>
           </w:p>
         </w:tc>
@@ -13214,7 +13214,7 @@
                 <w:color w:val="2D3748"/>
                 <w:sz w:val="17"/>
               </w:rPr>
-              <w:t>81.75%</w:t>
+              <w:t>81.03%</w:t>
             </w:r>
           </w:p>
         </w:tc>
@@ -13268,7 +13268,7 @@
                 <w:color w:val="2D3748"/>
                 <w:sz w:val="17"/>
               </w:rPr>
-              <w:t>58.00%</w:t>
+              <w:t>58.20%</w:t>
             </w:r>
           </w:p>
         </w:tc>
@@ -13295,7 +13295,7 @@
                 <w:color w:val="2D3748"/>
                 <w:sz w:val="17"/>
               </w:rPr>
-              <w:t>+23.75 pp</w:t>
+              <w:t>+22.84 pp</w:t>
             </w:r>
           </w:p>
         </w:tc>
@@ -13378,7 +13378,7 @@
                 <w:color w:val="1B365D"/>
                 <w:sz w:val="17"/>
               </w:rPr>
-              <w:t>0.507x</w:t>
+              <w:t>0.505x</w:t>
             </w:r>
           </w:p>
         </w:tc>
@@ -13432,7 +13432,7 @@
                 <w:color w:val="1B365D"/>
                 <w:sz w:val="17"/>
               </w:rPr>
-              <w:t>0.620x</w:t>
+              <w:t>0.762x</w:t>
             </w:r>
           </w:p>
         </w:tc>
@@ -13459,7 +13459,7 @@
                 <w:color w:val="1B365D"/>
                 <w:sz w:val="17"/>
               </w:rPr>
-              <w:t>-0.11x</w:t>
+              <w:t>-0.26x</w:t>
             </w:r>
           </w:p>
         </w:tc>
@@ -13542,7 +13542,7 @@
                 <w:color w:val="2D3748"/>
                 <w:sz w:val="17"/>
               </w:rPr>
-              <w:t>0.525x</w:t>
+              <w:t>0.517x</w:t>
             </w:r>
           </w:p>
         </w:tc>
@@ -13596,7 +13596,7 @@
                 <w:color w:val="2D3748"/>
                 <w:sz w:val="17"/>
               </w:rPr>
-              <w:t>0.682x</w:t>
+              <w:t>0.838x</w:t>
             </w:r>
           </w:p>
         </w:tc>
@@ -13706,7 +13706,7 @@
                 <w:color w:val="1B365D"/>
                 <w:sz w:val="17"/>
               </w:rPr>
-              <w:t>41.47%</w:t>
+              <w:t>40.89%</w:t>
             </w:r>
           </w:p>
         </w:tc>
@@ -13760,7 +13760,7 @@
                 <w:color w:val="1B365D"/>
                 <w:sz w:val="17"/>
               </w:rPr>
-              <w:t>34.00%</w:t>
+              <w:t>41.47%</w:t>
             </w:r>
           </w:p>
         </w:tc>
@@ -13787,7 +13787,7 @@
                 <w:color w:val="1B365D"/>
                 <w:sz w:val="17"/>
               </w:rPr>
-              <w:t>+7.47 pp</w:t>
+              <w:t>+-0.58 pp</w:t>
             </w:r>
           </w:p>
         </w:tc>
@@ -13893,7 +13893,7 @@
                 <w:color w:val="2D3748"/>
                 <w:sz w:val="19"/>
               </w:rPr>
-              <w:t>• Expansión a 3 Años (vs. FY2023): -5.98 puntos porcentuales.</w:t>
+              <w:t>• Expansión a 3 Años (vs. FY2023): -6.56 puntos porcentuales.</w:t>
             </w:r>
           </w:p>
           <w:p>
@@ -13906,7 +13906,7 @@
                 <w:color w:val="2D3748"/>
                 <w:sz w:val="19"/>
               </w:rPr>
-              <w:t>• Expansión a 5 Años (vs. FY2021): -15.93 puntos porcentuales.</w:t>
+              <w:t>• Expansión a 5 Años (vs. FY2021): -16.52 puntos porcentuales.</w:t>
             </w:r>
           </w:p>
           <w:p>
@@ -13932,7 +13932,7 @@
                 <w:color w:val="2D3748"/>
                 <w:sz w:val="19"/>
               </w:rPr>
-              <w:t>• Conclusión de Tendencia: Compresión de rentabilidad sobre activos (-15.93 p.p. en 5 años); vigilar presión en costos directos o acumulación de activos.</w:t>
+              <w:t>• Conclusión de Tendencia: Compresión de rentabilidad sobre activos (-16.52 p.p. en 5 años); vigilar presión en costos directos o acumulación de activos.</w:t>
             </w:r>
           </w:p>
         </w:tc>
@@ -14209,7 +14209,7 @@
                 <w:color w:val="1B365D"/>
                 <w:sz w:val="17"/>
               </w:rPr>
-              <w:t>41.47%</w:t>
+              <w:t>40.89%</w:t>
             </w:r>
           </w:p>
         </w:tc>
@@ -14236,7 +14236,7 @@
                 <w:color w:val="1B365D"/>
                 <w:sz w:val="17"/>
               </w:rPr>
-              <w:t>42.94%</w:t>
+              <w:t>41.87%</w:t>
             </w:r>
           </w:p>
         </w:tc>
@@ -14263,7 +14263,7 @@
                 <w:color w:val="1B365D"/>
                 <w:sz w:val="17"/>
               </w:rPr>
-              <w:t>+1.48 pp</w:t>
+              <w:t>+0.98 pp</w:t>
             </w:r>
           </w:p>
         </w:tc>
@@ -14290,7 +14290,7 @@
                 <w:color w:val="1B365D"/>
                 <w:sz w:val="17"/>
               </w:rPr>
-              <w:t>81.75%</w:t>
+              <w:t>81.03%</w:t>
             </w:r>
           </w:p>
         </w:tc>
@@ -14317,7 +14317,7 @@
                 <w:color w:val="1B365D"/>
                 <w:sz w:val="17"/>
               </w:rPr>
-              <w:t>0.507x</w:t>
+              <w:t>0.505x</w:t>
             </w:r>
           </w:p>
         </w:tc>
@@ -15108,7 +15108,7 @@
                 <w:color w:val="2D3748"/>
                 <w:sz w:val="17"/>
               </w:rPr>
-              <w:t>COMPOUNDER DE ÉLITE</w:t>
+              <w:t>MONOPOLIO / PODER DE MARCA</w:t>
             </w:r>
           </w:p>
         </w:tc>
@@ -15299,7 +15299,7 @@
                 <w:color w:val="2D3748"/>
                 <w:sz w:val="17"/>
               </w:rPr>
-              <w:t>COMPOUNDER DE ÉLITE</w:t>
+              <w:t>MONOPOLIO / PODER DE MARCA</w:t>
             </w:r>
           </w:p>
         </w:tc>
@@ -16016,7 +16016,7 @@
                 <w:color w:val="2D3748"/>
                 <w:sz w:val="17"/>
               </w:rPr>
-              <w:t>-</w:t>
+              <w:t>#1</w:t>
             </w:r>
           </w:p>
         </w:tc>
@@ -16043,7 +16043,7 @@
                 <w:color w:val="2D3748"/>
                 <w:sz w:val="17"/>
               </w:rPr>
-              <w:t>MEDIANA</w:t>
+              <w:t>PINS</w:t>
             </w:r>
           </w:p>
         </w:tc>
@@ -16070,7 +16070,7 @@
                 <w:color w:val="2D3748"/>
                 <w:sz w:val="17"/>
               </w:rPr>
-              <w:t>Mediana Sectorial</w:t>
+              <w:t>Pinterest, Inc.</w:t>
             </w:r>
           </w:p>
         </w:tc>
@@ -16097,7 +16097,7 @@
                 <w:color w:val="2D3748"/>
                 <w:sz w:val="17"/>
               </w:rPr>
-              <w:t>LTM</w:t>
+              <w:t>LTM (Q2 FY26 Móvil)</w:t>
             </w:r>
           </w:p>
         </w:tc>
@@ -16124,7 +16124,7 @@
                 <w:color w:val="2D3748"/>
                 <w:sz w:val="17"/>
               </w:rPr>
-              <w:t>34.00%</w:t>
+              <w:t>67.53%</w:t>
             </w:r>
           </w:p>
         </w:tc>
@@ -16151,7 +16151,7 @@
                 <w:color w:val="2D3748"/>
                 <w:sz w:val="17"/>
               </w:rPr>
-              <w:t>42.00%</w:t>
+              <w:t>148.86%</w:t>
             </w:r>
           </w:p>
         </w:tc>
@@ -16178,7 +16178,7 @@
                 <w:color w:val="2D3748"/>
                 <w:sz w:val="17"/>
               </w:rPr>
-              <w:t>58.00%</w:t>
+              <w:t>79.49%</w:t>
             </w:r>
           </w:p>
         </w:tc>
@@ -16205,7 +16205,7 @@
                 <w:color w:val="2D3748"/>
                 <w:sz w:val="17"/>
               </w:rPr>
-              <w:t>0.62x</w:t>
+              <w:t>0.85x</w:t>
             </w:r>
           </w:p>
         </w:tc>
@@ -16232,7 +16232,7 @@
                 <w:color w:val="2D3748"/>
                 <w:sz w:val="17"/>
               </w:rPr>
-              <w:t>0.00 pp</w:t>
+              <w:t>+26.06 pp</w:t>
             </w:r>
           </w:p>
         </w:tc>
@@ -16261,7 +16261,7 @@
                 <w:color w:val="2D3748"/>
                 <w:sz w:val="17"/>
               </w:rPr>
-              <w:t>-</w:t>
+              <w:t>#2</w:t>
             </w:r>
           </w:p>
         </w:tc>
@@ -16288,7 +16288,7 @@
                 <w:color w:val="2D3748"/>
                 <w:sz w:val="17"/>
               </w:rPr>
-              <w:t>P75</w:t>
+              <w:t>SPOT</w:t>
             </w:r>
           </w:p>
         </w:tc>
@@ -16315,7 +16315,7 @@
                 <w:color w:val="2D3748"/>
                 <w:sz w:val="17"/>
               </w:rPr>
-              <w:t>Percentil 75 Líder</w:t>
+              <w:t>Spotify Technology S.A</w:t>
             </w:r>
           </w:p>
         </w:tc>
@@ -16342,7 +16342,7 @@
                 <w:color w:val="2D3748"/>
                 <w:sz w:val="17"/>
               </w:rPr>
-              <w:t>LTM</w:t>
+              <w:t>LTM (Q2 FY26 Móvil)</w:t>
             </w:r>
           </w:p>
         </w:tc>
@@ -16369,7 +16369,7 @@
                 <w:color w:val="2D3748"/>
                 <w:sz w:val="17"/>
               </w:rPr>
-              <w:t>48.00%</w:t>
+              <w:t>47.16%</w:t>
             </w:r>
           </w:p>
         </w:tc>
@@ -16396,7 +16396,7 @@
                 <w:color w:val="2D3748"/>
                 <w:sz w:val="17"/>
               </w:rPr>
-              <w:t>-</w:t>
+              <w:t>86.34%</w:t>
             </w:r>
           </w:p>
         </w:tc>
@@ -16423,7 +16423,7 @@
                 <w:color w:val="2D3748"/>
                 <w:sz w:val="17"/>
               </w:rPr>
-              <w:t>-</w:t>
+              <w:t>30.50%</w:t>
             </w:r>
           </w:p>
         </w:tc>
@@ -16450,7 +16450,7 @@
                 <w:color w:val="2D3748"/>
                 <w:sz w:val="17"/>
               </w:rPr>
-              <w:t>-</w:t>
+              <w:t>1.55x</w:t>
             </w:r>
           </w:p>
         </w:tc>
@@ -16477,7 +16477,1722 @@
                 <w:color w:val="2D3748"/>
                 <w:sz w:val="17"/>
               </w:rPr>
-              <w:t>+14.00 pp</w:t>
+              <w:t>+5.69 pp</w:t>
+            </w:r>
+          </w:p>
+        </w:tc>
+      </w:tr>
+      <w:tr>
+        <w:tc>
+          <w:tcPr>
+            <w:tcW w:type="dxa" w:w="720"/>
+            <w:shd w:fill="FFFFFF"/>
+            <w:tcMar>
+              <w:top w:w="70" w:type="dxa"/>
+              <w:bottom w:w="70" w:type="dxa"/>
+              <w:left w:w="100" w:type="dxa"/>
+              <w:right w:w="100" w:type="dxa"/>
+            </w:tcMar>
+          </w:tcPr>
+          <w:p>
+            <w:pPr>
+              <w:spacing w:before="0" w:after="0"/>
+              <w:jc w:val="left"/>
+            </w:pPr>
+            <w:r>
+              <w:rPr>
+                <w:rFonts w:ascii="Calibri" w:hAnsi="Calibri"/>
+                <w:b w:val="0"/>
+                <w:color w:val="2D3748"/>
+                <w:sz w:val="17"/>
+              </w:rPr>
+              <w:t>#3</w:t>
+            </w:r>
+          </w:p>
+        </w:tc>
+        <w:tc>
+          <w:tcPr>
+            <w:tcW w:type="dxa" w:w="1008"/>
+            <w:shd w:fill="FFFFFF"/>
+            <w:tcMar>
+              <w:top w:w="70" w:type="dxa"/>
+              <w:bottom w:w="70" w:type="dxa"/>
+              <w:left w:w="100" w:type="dxa"/>
+              <w:right w:w="100" w:type="dxa"/>
+            </w:tcMar>
+          </w:tcPr>
+          <w:p>
+            <w:pPr>
+              <w:spacing w:before="0" w:after="0"/>
+              <w:jc w:val="right"/>
+            </w:pPr>
+            <w:r>
+              <w:rPr>
+                <w:rFonts w:ascii="Calibri" w:hAnsi="Calibri"/>
+                <w:b w:val="0"/>
+                <w:color w:val="2D3748"/>
+                <w:sz w:val="17"/>
+              </w:rPr>
+              <w:t>GOOGL</w:t>
+            </w:r>
+          </w:p>
+        </w:tc>
+        <w:tc>
+          <w:tcPr>
+            <w:tcW w:type="dxa" w:w="2016"/>
+            <w:shd w:fill="FFFFFF"/>
+            <w:tcMar>
+              <w:top w:w="70" w:type="dxa"/>
+              <w:bottom w:w="70" w:type="dxa"/>
+              <w:left w:w="100" w:type="dxa"/>
+              <w:right w:w="100" w:type="dxa"/>
+            </w:tcMar>
+          </w:tcPr>
+          <w:p>
+            <w:pPr>
+              <w:spacing w:before="0" w:after="0"/>
+              <w:jc w:val="right"/>
+            </w:pPr>
+            <w:r>
+              <w:rPr>
+                <w:rFonts w:ascii="Calibri" w:hAnsi="Calibri"/>
+                <w:b w:val="0"/>
+                <w:color w:val="2D3748"/>
+                <w:sz w:val="17"/>
+              </w:rPr>
+              <w:t>Alphabet Inc.</w:t>
+            </w:r>
+          </w:p>
+        </w:tc>
+        <w:tc>
+          <w:tcPr>
+            <w:tcW w:type="dxa" w:w="1296"/>
+            <w:shd w:fill="FFFFFF"/>
+            <w:tcMar>
+              <w:top w:w="70" w:type="dxa"/>
+              <w:bottom w:w="70" w:type="dxa"/>
+              <w:left w:w="100" w:type="dxa"/>
+              <w:right w:w="100" w:type="dxa"/>
+            </w:tcMar>
+          </w:tcPr>
+          <w:p>
+            <w:pPr>
+              <w:spacing w:before="0" w:after="0"/>
+              <w:jc w:val="right"/>
+            </w:pPr>
+            <w:r>
+              <w:rPr>
+                <w:rFonts w:ascii="Calibri" w:hAnsi="Calibri"/>
+                <w:b w:val="0"/>
+                <w:color w:val="2D3748"/>
+                <w:sz w:val="17"/>
+              </w:rPr>
+              <w:t>LTM (Q2 FY26 Móvil)</w:t>
+            </w:r>
+          </w:p>
+        </w:tc>
+        <w:tc>
+          <w:tcPr>
+            <w:tcW w:type="dxa" w:w="1152"/>
+            <w:shd w:fill="FFFFFF"/>
+            <w:tcMar>
+              <w:top w:w="70" w:type="dxa"/>
+              <w:bottom w:w="70" w:type="dxa"/>
+              <w:left w:w="100" w:type="dxa"/>
+              <w:right w:w="100" w:type="dxa"/>
+            </w:tcMar>
+          </w:tcPr>
+          <w:p>
+            <w:pPr>
+              <w:spacing w:before="0" w:after="0"/>
+              <w:jc w:val="right"/>
+            </w:pPr>
+            <w:r>
+              <w:rPr>
+                <w:rFonts w:ascii="Calibri" w:hAnsi="Calibri"/>
+                <w:b w:val="0"/>
+                <w:color w:val="2D3748"/>
+                <w:sz w:val="17"/>
+              </w:rPr>
+              <w:t>46.46%</w:t>
+            </w:r>
+          </w:p>
+        </w:tc>
+        <w:tc>
+          <w:tcPr>
+            <w:tcW w:type="dxa" w:w="1152"/>
+            <w:shd w:fill="FFFFFF"/>
+            <w:tcMar>
+              <w:top w:w="70" w:type="dxa"/>
+              <w:bottom w:w="70" w:type="dxa"/>
+              <w:left w:w="100" w:type="dxa"/>
+              <w:right w:w="100" w:type="dxa"/>
+            </w:tcMar>
+          </w:tcPr>
+          <w:p>
+            <w:pPr>
+              <w:spacing w:before="0" w:after="0"/>
+              <w:jc w:val="right"/>
+            </w:pPr>
+            <w:r>
+              <w:rPr>
+                <w:rFonts w:ascii="Calibri" w:hAnsi="Calibri"/>
+                <w:b w:val="0"/>
+                <w:color w:val="2D3748"/>
+                <w:sz w:val="17"/>
+              </w:rPr>
+              <w:t>58.48%</w:t>
+            </w:r>
+          </w:p>
+        </w:tc>
+        <w:tc>
+          <w:tcPr>
+            <w:tcW w:type="dxa" w:w="1152"/>
+            <w:shd w:fill="FFFFFF"/>
+            <w:tcMar>
+              <w:top w:w="70" w:type="dxa"/>
+              <w:bottom w:w="70" w:type="dxa"/>
+              <w:left w:w="100" w:type="dxa"/>
+              <w:right w:w="100" w:type="dxa"/>
+            </w:tcMar>
+          </w:tcPr>
+          <w:p>
+            <w:pPr>
+              <w:spacing w:before="0" w:after="0"/>
+              <w:jc w:val="right"/>
+            </w:pPr>
+            <w:r>
+              <w:rPr>
+                <w:rFonts w:ascii="Calibri" w:hAnsi="Calibri"/>
+                <w:b w:val="0"/>
+                <w:color w:val="2D3748"/>
+                <w:sz w:val="17"/>
+              </w:rPr>
+              <w:t>58.20%</w:t>
+            </w:r>
+          </w:p>
+        </w:tc>
+        <w:tc>
+          <w:tcPr>
+            <w:tcW w:type="dxa" w:w="720"/>
+            <w:shd w:fill="FFFFFF"/>
+            <w:tcMar>
+              <w:top w:w="70" w:type="dxa"/>
+              <w:bottom w:w="70" w:type="dxa"/>
+              <w:left w:w="100" w:type="dxa"/>
+              <w:right w:w="100" w:type="dxa"/>
+            </w:tcMar>
+          </w:tcPr>
+          <w:p>
+            <w:pPr>
+              <w:spacing w:before="0" w:after="0"/>
+              <w:jc w:val="right"/>
+            </w:pPr>
+            <w:r>
+              <w:rPr>
+                <w:rFonts w:ascii="Calibri" w:hAnsi="Calibri"/>
+                <w:b w:val="0"/>
+                <w:color w:val="2D3748"/>
+                <w:sz w:val="17"/>
+              </w:rPr>
+              <w:t>0.80x</w:t>
+            </w:r>
+          </w:p>
+        </w:tc>
+        <w:tc>
+          <w:tcPr>
+            <w:tcW w:type="dxa" w:w="1152"/>
+            <w:shd w:fill="FFFFFF"/>
+            <w:tcMar>
+              <w:top w:w="70" w:type="dxa"/>
+              <w:bottom w:w="70" w:type="dxa"/>
+              <w:left w:w="100" w:type="dxa"/>
+              <w:right w:w="100" w:type="dxa"/>
+            </w:tcMar>
+          </w:tcPr>
+          <w:p>
+            <w:pPr>
+              <w:spacing w:before="0" w:after="0"/>
+              <w:jc w:val="left"/>
+            </w:pPr>
+            <w:r>
+              <w:rPr>
+                <w:rFonts w:ascii="Calibri" w:hAnsi="Calibri"/>
+                <w:b w:val="0"/>
+                <w:color w:val="2D3748"/>
+                <w:sz w:val="17"/>
+              </w:rPr>
+              <w:t>+5.00 pp</w:t>
+            </w:r>
+          </w:p>
+        </w:tc>
+      </w:tr>
+      <w:tr>
+        <w:tc>
+          <w:tcPr>
+            <w:tcW w:type="dxa" w:w="720"/>
+            <w:shd w:fill="F7FAFC"/>
+            <w:tcMar>
+              <w:top w:w="70" w:type="dxa"/>
+              <w:bottom w:w="70" w:type="dxa"/>
+              <w:left w:w="100" w:type="dxa"/>
+              <w:right w:w="100" w:type="dxa"/>
+            </w:tcMar>
+          </w:tcPr>
+          <w:p>
+            <w:pPr>
+              <w:spacing w:before="0" w:after="0"/>
+              <w:jc w:val="left"/>
+            </w:pPr>
+            <w:r>
+              <w:rPr>
+                <w:rFonts w:ascii="Calibri" w:hAnsi="Calibri"/>
+                <w:b/>
+                <w:color w:val="1B365D"/>
+                <w:sz w:val="17"/>
+              </w:rPr>
+              <w:t>#4</w:t>
+            </w:r>
+          </w:p>
+        </w:tc>
+        <w:tc>
+          <w:tcPr>
+            <w:tcW w:type="dxa" w:w="1008"/>
+            <w:shd w:fill="F7FAFC"/>
+            <w:tcMar>
+              <w:top w:w="70" w:type="dxa"/>
+              <w:bottom w:w="70" w:type="dxa"/>
+              <w:left w:w="100" w:type="dxa"/>
+              <w:right w:w="100" w:type="dxa"/>
+            </w:tcMar>
+          </w:tcPr>
+          <w:p>
+            <w:pPr>
+              <w:spacing w:before="0" w:after="0"/>
+              <w:jc w:val="right"/>
+            </w:pPr>
+            <w:r>
+              <w:rPr>
+                <w:rFonts w:ascii="Calibri" w:hAnsi="Calibri"/>
+                <w:b/>
+                <w:color w:val="1B365D"/>
+                <w:sz w:val="17"/>
+              </w:rPr>
+              <w:t>META</w:t>
+            </w:r>
+          </w:p>
+        </w:tc>
+        <w:tc>
+          <w:tcPr>
+            <w:tcW w:type="dxa" w:w="2016"/>
+            <w:shd w:fill="F7FAFC"/>
+            <w:tcMar>
+              <w:top w:w="70" w:type="dxa"/>
+              <w:bottom w:w="70" w:type="dxa"/>
+              <w:left w:w="100" w:type="dxa"/>
+              <w:right w:w="100" w:type="dxa"/>
+            </w:tcMar>
+          </w:tcPr>
+          <w:p>
+            <w:pPr>
+              <w:spacing w:before="0" w:after="0"/>
+              <w:jc w:val="right"/>
+            </w:pPr>
+            <w:r>
+              <w:rPr>
+                <w:rFonts w:ascii="Calibri" w:hAnsi="Calibri"/>
+                <w:b/>
+                <w:color w:val="1B365D"/>
+                <w:sz w:val="17"/>
+              </w:rPr>
+              <w:t>Meta Platforms, Inc.</w:t>
+            </w:r>
+          </w:p>
+        </w:tc>
+        <w:tc>
+          <w:tcPr>
+            <w:tcW w:type="dxa" w:w="1296"/>
+            <w:shd w:fill="F7FAFC"/>
+            <w:tcMar>
+              <w:top w:w="70" w:type="dxa"/>
+              <w:bottom w:w="70" w:type="dxa"/>
+              <w:left w:w="100" w:type="dxa"/>
+              <w:right w:w="100" w:type="dxa"/>
+            </w:tcMar>
+          </w:tcPr>
+          <w:p>
+            <w:pPr>
+              <w:spacing w:before="0" w:after="0"/>
+              <w:jc w:val="right"/>
+            </w:pPr>
+            <w:r>
+              <w:rPr>
+                <w:rFonts w:ascii="Calibri" w:hAnsi="Calibri"/>
+                <w:b/>
+                <w:color w:val="1B365D"/>
+                <w:sz w:val="17"/>
+              </w:rPr>
+              <w:t>LTM</w:t>
+            </w:r>
+          </w:p>
+        </w:tc>
+        <w:tc>
+          <w:tcPr>
+            <w:tcW w:type="dxa" w:w="1152"/>
+            <w:shd w:fill="F7FAFC"/>
+            <w:tcMar>
+              <w:top w:w="70" w:type="dxa"/>
+              <w:bottom w:w="70" w:type="dxa"/>
+              <w:left w:w="100" w:type="dxa"/>
+              <w:right w:w="100" w:type="dxa"/>
+            </w:tcMar>
+          </w:tcPr>
+          <w:p>
+            <w:pPr>
+              <w:spacing w:before="0" w:after="0"/>
+              <w:jc w:val="right"/>
+            </w:pPr>
+            <w:r>
+              <w:rPr>
+                <w:rFonts w:ascii="Calibri" w:hAnsi="Calibri"/>
+                <w:b/>
+                <w:color w:val="1B365D"/>
+                <w:sz w:val="17"/>
+              </w:rPr>
+              <w:t>40.89%</w:t>
+            </w:r>
+          </w:p>
+        </w:tc>
+        <w:tc>
+          <w:tcPr>
+            <w:tcW w:type="dxa" w:w="1152"/>
+            <w:shd w:fill="F7FAFC"/>
+            <w:tcMar>
+              <w:top w:w="70" w:type="dxa"/>
+              <w:bottom w:w="70" w:type="dxa"/>
+              <w:left w:w="100" w:type="dxa"/>
+              <w:right w:w="100" w:type="dxa"/>
+            </w:tcMar>
+          </w:tcPr>
+          <w:p>
+            <w:pPr>
+              <w:spacing w:before="0" w:after="0"/>
+              <w:jc w:val="right"/>
+            </w:pPr>
+            <w:r>
+              <w:rPr>
+                <w:rFonts w:ascii="Calibri" w:hAnsi="Calibri"/>
+                <w:b/>
+                <w:color w:val="1B365D"/>
+                <w:sz w:val="17"/>
+              </w:rPr>
+              <w:t>41.87%</w:t>
+            </w:r>
+          </w:p>
+        </w:tc>
+        <w:tc>
+          <w:tcPr>
+            <w:tcW w:type="dxa" w:w="1152"/>
+            <w:shd w:fill="F7FAFC"/>
+            <w:tcMar>
+              <w:top w:w="70" w:type="dxa"/>
+              <w:bottom w:w="70" w:type="dxa"/>
+              <w:left w:w="100" w:type="dxa"/>
+              <w:right w:w="100" w:type="dxa"/>
+            </w:tcMar>
+          </w:tcPr>
+          <w:p>
+            <w:pPr>
+              <w:spacing w:before="0" w:after="0"/>
+              <w:jc w:val="right"/>
+            </w:pPr>
+            <w:r>
+              <w:rPr>
+                <w:rFonts w:ascii="Calibri" w:hAnsi="Calibri"/>
+                <w:b/>
+                <w:color w:val="1B365D"/>
+                <w:sz w:val="17"/>
+              </w:rPr>
+              <w:t>81.03%</w:t>
+            </w:r>
+          </w:p>
+        </w:tc>
+        <w:tc>
+          <w:tcPr>
+            <w:tcW w:type="dxa" w:w="720"/>
+            <w:shd w:fill="F7FAFC"/>
+            <w:tcMar>
+              <w:top w:w="70" w:type="dxa"/>
+              <w:bottom w:w="70" w:type="dxa"/>
+              <w:left w:w="100" w:type="dxa"/>
+              <w:right w:w="100" w:type="dxa"/>
+            </w:tcMar>
+          </w:tcPr>
+          <w:p>
+            <w:pPr>
+              <w:spacing w:before="0" w:after="0"/>
+              <w:jc w:val="right"/>
+            </w:pPr>
+            <w:r>
+              <w:rPr>
+                <w:rFonts w:ascii="Calibri" w:hAnsi="Calibri"/>
+                <w:b/>
+                <w:color w:val="1B365D"/>
+                <w:sz w:val="17"/>
+              </w:rPr>
+              <w:t>0.50x</w:t>
+            </w:r>
+          </w:p>
+        </w:tc>
+        <w:tc>
+          <w:tcPr>
+            <w:tcW w:type="dxa" w:w="1152"/>
+            <w:shd w:fill="F7FAFC"/>
+            <w:tcMar>
+              <w:top w:w="70" w:type="dxa"/>
+              <w:bottom w:w="70" w:type="dxa"/>
+              <w:left w:w="100" w:type="dxa"/>
+              <w:right w:w="100" w:type="dxa"/>
+            </w:tcMar>
+          </w:tcPr>
+          <w:p>
+            <w:pPr>
+              <w:spacing w:before="0" w:after="0"/>
+              <w:jc w:val="left"/>
+            </w:pPr>
+            <w:r>
+              <w:rPr>
+                <w:rFonts w:ascii="Calibri" w:hAnsi="Calibri"/>
+                <w:b/>
+                <w:color w:val="1B365D"/>
+                <w:sz w:val="17"/>
+              </w:rPr>
+              <w:t>-0.58 pp</w:t>
+            </w:r>
+          </w:p>
+        </w:tc>
+      </w:tr>
+      <w:tr>
+        <w:tc>
+          <w:tcPr>
+            <w:tcW w:type="dxa" w:w="720"/>
+            <w:shd w:fill="FFFFFF"/>
+            <w:tcMar>
+              <w:top w:w="70" w:type="dxa"/>
+              <w:bottom w:w="70" w:type="dxa"/>
+              <w:left w:w="100" w:type="dxa"/>
+              <w:right w:w="100" w:type="dxa"/>
+            </w:tcMar>
+          </w:tcPr>
+          <w:p>
+            <w:pPr>
+              <w:spacing w:before="0" w:after="0"/>
+              <w:jc w:val="left"/>
+            </w:pPr>
+            <w:r>
+              <w:rPr>
+                <w:rFonts w:ascii="Calibri" w:hAnsi="Calibri"/>
+                <w:b w:val="0"/>
+                <w:color w:val="2D3748"/>
+                <w:sz w:val="17"/>
+              </w:rPr>
+              <w:t>#5</w:t>
+            </w:r>
+          </w:p>
+        </w:tc>
+        <w:tc>
+          <w:tcPr>
+            <w:tcW w:type="dxa" w:w="1008"/>
+            <w:shd w:fill="FFFFFF"/>
+            <w:tcMar>
+              <w:top w:w="70" w:type="dxa"/>
+              <w:bottom w:w="70" w:type="dxa"/>
+              <w:left w:w="100" w:type="dxa"/>
+              <w:right w:w="100" w:type="dxa"/>
+            </w:tcMar>
+          </w:tcPr>
+          <w:p>
+            <w:pPr>
+              <w:spacing w:before="0" w:after="0"/>
+              <w:jc w:val="right"/>
+            </w:pPr>
+            <w:r>
+              <w:rPr>
+                <w:rFonts w:ascii="Calibri" w:hAnsi="Calibri"/>
+                <w:b w:val="0"/>
+                <w:color w:val="2D3748"/>
+                <w:sz w:val="17"/>
+              </w:rPr>
+              <w:t>SNAP</w:t>
+            </w:r>
+          </w:p>
+        </w:tc>
+        <w:tc>
+          <w:tcPr>
+            <w:tcW w:type="dxa" w:w="2016"/>
+            <w:shd w:fill="FFFFFF"/>
+            <w:tcMar>
+              <w:top w:w="70" w:type="dxa"/>
+              <w:bottom w:w="70" w:type="dxa"/>
+              <w:left w:w="100" w:type="dxa"/>
+              <w:right w:w="100" w:type="dxa"/>
+            </w:tcMar>
+          </w:tcPr>
+          <w:p>
+            <w:pPr>
+              <w:spacing w:before="0" w:after="0"/>
+              <w:jc w:val="right"/>
+            </w:pPr>
+            <w:r>
+              <w:rPr>
+                <w:rFonts w:ascii="Calibri" w:hAnsi="Calibri"/>
+                <w:b w:val="0"/>
+                <w:color w:val="2D3748"/>
+                <w:sz w:val="17"/>
+              </w:rPr>
+              <w:t>Snap Inc.</w:t>
+            </w:r>
+          </w:p>
+        </w:tc>
+        <w:tc>
+          <w:tcPr>
+            <w:tcW w:type="dxa" w:w="1296"/>
+            <w:shd w:fill="FFFFFF"/>
+            <w:tcMar>
+              <w:top w:w="70" w:type="dxa"/>
+              <w:bottom w:w="70" w:type="dxa"/>
+              <w:left w:w="100" w:type="dxa"/>
+              <w:right w:w="100" w:type="dxa"/>
+            </w:tcMar>
+          </w:tcPr>
+          <w:p>
+            <w:pPr>
+              <w:spacing w:before="0" w:after="0"/>
+              <w:jc w:val="right"/>
+            </w:pPr>
+            <w:r>
+              <w:rPr>
+                <w:rFonts w:ascii="Calibri" w:hAnsi="Calibri"/>
+                <w:b w:val="0"/>
+                <w:color w:val="2D3748"/>
+                <w:sz w:val="17"/>
+              </w:rPr>
+              <w:t>LTM (Q2 FY26 Móvil)</w:t>
+            </w:r>
+          </w:p>
+        </w:tc>
+        <w:tc>
+          <w:tcPr>
+            <w:tcW w:type="dxa" w:w="1152"/>
+            <w:shd w:fill="FFFFFF"/>
+            <w:tcMar>
+              <w:top w:w="70" w:type="dxa"/>
+              <w:bottom w:w="70" w:type="dxa"/>
+              <w:left w:w="100" w:type="dxa"/>
+              <w:right w:w="100" w:type="dxa"/>
+            </w:tcMar>
+          </w:tcPr>
+          <w:p>
+            <w:pPr>
+              <w:spacing w:before="0" w:after="0"/>
+              <w:jc w:val="right"/>
+            </w:pPr>
+            <w:r>
+              <w:rPr>
+                <w:rFonts w:ascii="Calibri" w:hAnsi="Calibri"/>
+                <w:b w:val="0"/>
+                <w:color w:val="2D3748"/>
+                <w:sz w:val="17"/>
+              </w:rPr>
+              <w:t>37.86%</w:t>
+            </w:r>
+          </w:p>
+        </w:tc>
+        <w:tc>
+          <w:tcPr>
+            <w:tcW w:type="dxa" w:w="1152"/>
+            <w:shd w:fill="FFFFFF"/>
+            <w:tcMar>
+              <w:top w:w="70" w:type="dxa"/>
+              <w:bottom w:w="70" w:type="dxa"/>
+              <w:left w:w="100" w:type="dxa"/>
+              <w:right w:w="100" w:type="dxa"/>
+            </w:tcMar>
+          </w:tcPr>
+          <w:p>
+            <w:pPr>
+              <w:spacing w:before="0" w:after="0"/>
+              <w:jc w:val="right"/>
+            </w:pPr>
+            <w:r>
+              <w:rPr>
+                <w:rFonts w:ascii="Calibri" w:hAnsi="Calibri"/>
+                <w:b w:val="0"/>
+                <w:color w:val="2D3748"/>
+                <w:sz w:val="17"/>
+              </w:rPr>
+              <w:t>63.37%</w:t>
+            </w:r>
+          </w:p>
+        </w:tc>
+        <w:tc>
+          <w:tcPr>
+            <w:tcW w:type="dxa" w:w="1152"/>
+            <w:shd w:fill="FFFFFF"/>
+            <w:tcMar>
+              <w:top w:w="70" w:type="dxa"/>
+              <w:bottom w:w="70" w:type="dxa"/>
+              <w:left w:w="100" w:type="dxa"/>
+              <w:right w:w="100" w:type="dxa"/>
+            </w:tcMar>
+          </w:tcPr>
+          <w:p>
+            <w:pPr>
+              <w:spacing w:before="0" w:after="0"/>
+              <w:jc w:val="right"/>
+            </w:pPr>
+            <w:r>
+              <w:rPr>
+                <w:rFonts w:ascii="Calibri" w:hAnsi="Calibri"/>
+                <w:b w:val="0"/>
+                <w:color w:val="2D3748"/>
+                <w:sz w:val="17"/>
+              </w:rPr>
+              <w:t>52.99%</w:t>
+            </w:r>
+          </w:p>
+        </w:tc>
+        <w:tc>
+          <w:tcPr>
+            <w:tcW w:type="dxa" w:w="720"/>
+            <w:shd w:fill="FFFFFF"/>
+            <w:tcMar>
+              <w:top w:w="70" w:type="dxa"/>
+              <w:bottom w:w="70" w:type="dxa"/>
+              <w:left w:w="100" w:type="dxa"/>
+              <w:right w:w="100" w:type="dxa"/>
+            </w:tcMar>
+          </w:tcPr>
+          <w:p>
+            <w:pPr>
+              <w:spacing w:before="0" w:after="0"/>
+              <w:jc w:val="right"/>
+            </w:pPr>
+            <w:r>
+              <w:rPr>
+                <w:rFonts w:ascii="Calibri" w:hAnsi="Calibri"/>
+                <w:b w:val="0"/>
+                <w:color w:val="2D3748"/>
+                <w:sz w:val="17"/>
+              </w:rPr>
+              <w:t>0.71x</w:t>
+            </w:r>
+          </w:p>
+        </w:tc>
+        <w:tc>
+          <w:tcPr>
+            <w:tcW w:type="dxa" w:w="1152"/>
+            <w:shd w:fill="FFFFFF"/>
+            <w:tcMar>
+              <w:top w:w="70" w:type="dxa"/>
+              <w:bottom w:w="70" w:type="dxa"/>
+              <w:left w:w="100" w:type="dxa"/>
+              <w:right w:w="100" w:type="dxa"/>
+            </w:tcMar>
+          </w:tcPr>
+          <w:p>
+            <w:pPr>
+              <w:spacing w:before="0" w:after="0"/>
+              <w:jc w:val="left"/>
+            </w:pPr>
+            <w:r>
+              <w:rPr>
+                <w:rFonts w:ascii="Calibri" w:hAnsi="Calibri"/>
+                <w:b w:val="0"/>
+                <w:color w:val="2D3748"/>
+                <w:sz w:val="17"/>
+              </w:rPr>
+              <w:t>-3.61 pp</w:t>
+            </w:r>
+          </w:p>
+        </w:tc>
+      </w:tr>
+      <w:tr>
+        <w:tc>
+          <w:tcPr>
+            <w:tcW w:type="dxa" w:w="720"/>
+            <w:shd w:fill="F7FAFC"/>
+            <w:tcMar>
+              <w:top w:w="70" w:type="dxa"/>
+              <w:bottom w:w="70" w:type="dxa"/>
+              <w:left w:w="100" w:type="dxa"/>
+              <w:right w:w="100" w:type="dxa"/>
+            </w:tcMar>
+          </w:tcPr>
+          <w:p>
+            <w:pPr>
+              <w:spacing w:before="0" w:after="0"/>
+              <w:jc w:val="left"/>
+            </w:pPr>
+            <w:r>
+              <w:rPr>
+                <w:rFonts w:ascii="Calibri" w:hAnsi="Calibri"/>
+                <w:b w:val="0"/>
+                <w:color w:val="2D3748"/>
+                <w:sz w:val="17"/>
+              </w:rPr>
+              <w:t>#6</w:t>
+            </w:r>
+          </w:p>
+        </w:tc>
+        <w:tc>
+          <w:tcPr>
+            <w:tcW w:type="dxa" w:w="1008"/>
+            <w:shd w:fill="F7FAFC"/>
+            <w:tcMar>
+              <w:top w:w="70" w:type="dxa"/>
+              <w:bottom w:w="70" w:type="dxa"/>
+              <w:left w:w="100" w:type="dxa"/>
+              <w:right w:w="100" w:type="dxa"/>
+            </w:tcMar>
+          </w:tcPr>
+          <w:p>
+            <w:pPr>
+              <w:spacing w:before="0" w:after="0"/>
+              <w:jc w:val="right"/>
+            </w:pPr>
+            <w:r>
+              <w:rPr>
+                <w:rFonts w:ascii="Calibri" w:hAnsi="Calibri"/>
+                <w:b w:val="0"/>
+                <w:color w:val="2D3748"/>
+                <w:sz w:val="17"/>
+              </w:rPr>
+              <w:t>NFLX</w:t>
+            </w:r>
+          </w:p>
+        </w:tc>
+        <w:tc>
+          <w:tcPr>
+            <w:tcW w:type="dxa" w:w="2016"/>
+            <w:shd w:fill="F7FAFC"/>
+            <w:tcMar>
+              <w:top w:w="70" w:type="dxa"/>
+              <w:bottom w:w="70" w:type="dxa"/>
+              <w:left w:w="100" w:type="dxa"/>
+              <w:right w:w="100" w:type="dxa"/>
+            </w:tcMar>
+          </w:tcPr>
+          <w:p>
+            <w:pPr>
+              <w:spacing w:before="0" w:after="0"/>
+              <w:jc w:val="right"/>
+            </w:pPr>
+            <w:r>
+              <w:rPr>
+                <w:rFonts w:ascii="Calibri" w:hAnsi="Calibri"/>
+                <w:b w:val="0"/>
+                <w:color w:val="2D3748"/>
+                <w:sz w:val="17"/>
+              </w:rPr>
+              <w:t>Netflix, Inc.</w:t>
+            </w:r>
+          </w:p>
+        </w:tc>
+        <w:tc>
+          <w:tcPr>
+            <w:tcW w:type="dxa" w:w="1296"/>
+            <w:shd w:fill="F7FAFC"/>
+            <w:tcMar>
+              <w:top w:w="70" w:type="dxa"/>
+              <w:bottom w:w="70" w:type="dxa"/>
+              <w:left w:w="100" w:type="dxa"/>
+              <w:right w:w="100" w:type="dxa"/>
+            </w:tcMar>
+          </w:tcPr>
+          <w:p>
+            <w:pPr>
+              <w:spacing w:before="0" w:after="0"/>
+              <w:jc w:val="right"/>
+            </w:pPr>
+            <w:r>
+              <w:rPr>
+                <w:rFonts w:ascii="Calibri" w:hAnsi="Calibri"/>
+                <w:b w:val="0"/>
+                <w:color w:val="2D3748"/>
+                <w:sz w:val="17"/>
+              </w:rPr>
+              <w:t>LTM (Q2 FY26 Móvil)</w:t>
+            </w:r>
+          </w:p>
+        </w:tc>
+        <w:tc>
+          <w:tcPr>
+            <w:tcW w:type="dxa" w:w="1152"/>
+            <w:shd w:fill="F7FAFC"/>
+            <w:tcMar>
+              <w:top w:w="70" w:type="dxa"/>
+              <w:bottom w:w="70" w:type="dxa"/>
+              <w:left w:w="100" w:type="dxa"/>
+              <w:right w:w="100" w:type="dxa"/>
+            </w:tcMar>
+          </w:tcPr>
+          <w:p>
+            <w:pPr>
+              <w:spacing w:before="0" w:after="0"/>
+              <w:jc w:val="right"/>
+            </w:pPr>
+            <w:r>
+              <w:rPr>
+                <w:rFonts w:ascii="Calibri" w:hAnsi="Calibri"/>
+                <w:b w:val="0"/>
+                <w:color w:val="2D3748"/>
+                <w:sz w:val="17"/>
+              </w:rPr>
+              <w:t>35.79%</w:t>
+            </w:r>
+          </w:p>
+        </w:tc>
+        <w:tc>
+          <w:tcPr>
+            <w:tcW w:type="dxa" w:w="1152"/>
+            <w:shd w:fill="F7FAFC"/>
+            <w:tcMar>
+              <w:top w:w="70" w:type="dxa"/>
+              <w:bottom w:w="70" w:type="dxa"/>
+              <w:left w:w="100" w:type="dxa"/>
+              <w:right w:w="100" w:type="dxa"/>
+            </w:tcMar>
+          </w:tcPr>
+          <w:p>
+            <w:pPr>
+              <w:spacing w:before="0" w:after="0"/>
+              <w:jc w:val="right"/>
+            </w:pPr>
+            <w:r>
+              <w:rPr>
+                <w:rFonts w:ascii="Calibri" w:hAnsi="Calibri"/>
+                <w:b w:val="0"/>
+                <w:color w:val="2D3748"/>
+                <w:sz w:val="17"/>
+              </w:rPr>
+              <w:t>41.56%</w:t>
+            </w:r>
+          </w:p>
+        </w:tc>
+        <w:tc>
+          <w:tcPr>
+            <w:tcW w:type="dxa" w:w="1152"/>
+            <w:shd w:fill="F7FAFC"/>
+            <w:tcMar>
+              <w:top w:w="70" w:type="dxa"/>
+              <w:bottom w:w="70" w:type="dxa"/>
+              <w:left w:w="100" w:type="dxa"/>
+              <w:right w:w="100" w:type="dxa"/>
+            </w:tcMar>
+          </w:tcPr>
+          <w:p>
+            <w:pPr>
+              <w:spacing w:before="0" w:after="0"/>
+              <w:jc w:val="right"/>
+            </w:pPr>
+            <w:r>
+              <w:rPr>
+                <w:rFonts w:ascii="Calibri" w:hAnsi="Calibri"/>
+                <w:b w:val="0"/>
+                <w:color w:val="2D3748"/>
+                <w:sz w:val="17"/>
+              </w:rPr>
+              <w:t>47.00%</w:t>
+            </w:r>
+          </w:p>
+        </w:tc>
+        <w:tc>
+          <w:tcPr>
+            <w:tcW w:type="dxa" w:w="720"/>
+            <w:shd w:fill="F7FAFC"/>
+            <w:tcMar>
+              <w:top w:w="70" w:type="dxa"/>
+              <w:bottom w:w="70" w:type="dxa"/>
+              <w:left w:w="100" w:type="dxa"/>
+              <w:right w:w="100" w:type="dxa"/>
+            </w:tcMar>
+          </w:tcPr>
+          <w:p>
+            <w:pPr>
+              <w:spacing w:before="0" w:after="0"/>
+              <w:jc w:val="right"/>
+            </w:pPr>
+            <w:r>
+              <w:rPr>
+                <w:rFonts w:ascii="Calibri" w:hAnsi="Calibri"/>
+                <w:b w:val="0"/>
+                <w:color w:val="2D3748"/>
+                <w:sz w:val="17"/>
+              </w:rPr>
+              <w:t>0.76x</w:t>
+            </w:r>
+          </w:p>
+        </w:tc>
+        <w:tc>
+          <w:tcPr>
+            <w:tcW w:type="dxa" w:w="1152"/>
+            <w:shd w:fill="F7FAFC"/>
+            <w:tcMar>
+              <w:top w:w="70" w:type="dxa"/>
+              <w:bottom w:w="70" w:type="dxa"/>
+              <w:left w:w="100" w:type="dxa"/>
+              <w:right w:w="100" w:type="dxa"/>
+            </w:tcMar>
+          </w:tcPr>
+          <w:p>
+            <w:pPr>
+              <w:spacing w:before="0" w:after="0"/>
+              <w:jc w:val="left"/>
+            </w:pPr>
+            <w:r>
+              <w:rPr>
+                <w:rFonts w:ascii="Calibri" w:hAnsi="Calibri"/>
+                <w:b w:val="0"/>
+                <w:color w:val="2D3748"/>
+                <w:sz w:val="17"/>
+              </w:rPr>
+              <w:t>-5.67 pp</w:t>
+            </w:r>
+          </w:p>
+        </w:tc>
+      </w:tr>
+      <w:tr>
+        <w:tc>
+          <w:tcPr>
+            <w:tcW w:type="dxa" w:w="720"/>
+            <w:shd w:fill="FFFFFF"/>
+            <w:tcMar>
+              <w:top w:w="70" w:type="dxa"/>
+              <w:bottom w:w="70" w:type="dxa"/>
+              <w:left w:w="100" w:type="dxa"/>
+              <w:right w:w="100" w:type="dxa"/>
+            </w:tcMar>
+          </w:tcPr>
+          <w:p>
+            <w:pPr>
+              <w:spacing w:before="0" w:after="0"/>
+              <w:jc w:val="left"/>
+            </w:pPr>
+            <w:r>
+              <w:rPr>
+                <w:rFonts w:ascii="Calibri" w:hAnsi="Calibri"/>
+                <w:b w:val="0"/>
+                <w:color w:val="2D3748"/>
+                <w:sz w:val="17"/>
+              </w:rPr>
+              <w:t>#7</w:t>
+            </w:r>
+          </w:p>
+        </w:tc>
+        <w:tc>
+          <w:tcPr>
+            <w:tcW w:type="dxa" w:w="1008"/>
+            <w:shd w:fill="FFFFFF"/>
+            <w:tcMar>
+              <w:top w:w="70" w:type="dxa"/>
+              <w:bottom w:w="70" w:type="dxa"/>
+              <w:left w:w="100" w:type="dxa"/>
+              <w:right w:w="100" w:type="dxa"/>
+            </w:tcMar>
+          </w:tcPr>
+          <w:p>
+            <w:pPr>
+              <w:spacing w:before="0" w:after="0"/>
+              <w:jc w:val="right"/>
+            </w:pPr>
+            <w:r>
+              <w:rPr>
+                <w:rFonts w:ascii="Calibri" w:hAnsi="Calibri"/>
+                <w:b w:val="0"/>
+                <w:color w:val="2D3748"/>
+                <w:sz w:val="17"/>
+              </w:rPr>
+              <w:t>MSFT</w:t>
+            </w:r>
+          </w:p>
+        </w:tc>
+        <w:tc>
+          <w:tcPr>
+            <w:tcW w:type="dxa" w:w="2016"/>
+            <w:shd w:fill="FFFFFF"/>
+            <w:tcMar>
+              <w:top w:w="70" w:type="dxa"/>
+              <w:bottom w:w="70" w:type="dxa"/>
+              <w:left w:w="100" w:type="dxa"/>
+              <w:right w:w="100" w:type="dxa"/>
+            </w:tcMar>
+          </w:tcPr>
+          <w:p>
+            <w:pPr>
+              <w:spacing w:before="0" w:after="0"/>
+              <w:jc w:val="right"/>
+            </w:pPr>
+            <w:r>
+              <w:rPr>
+                <w:rFonts w:ascii="Calibri" w:hAnsi="Calibri"/>
+                <w:b w:val="0"/>
+                <w:color w:val="2D3748"/>
+                <w:sz w:val="17"/>
+              </w:rPr>
+              <w:t>Microsoft Corporation</w:t>
+            </w:r>
+          </w:p>
+        </w:tc>
+        <w:tc>
+          <w:tcPr>
+            <w:tcW w:type="dxa" w:w="1296"/>
+            <w:shd w:fill="FFFFFF"/>
+            <w:tcMar>
+              <w:top w:w="70" w:type="dxa"/>
+              <w:bottom w:w="70" w:type="dxa"/>
+              <w:left w:w="100" w:type="dxa"/>
+              <w:right w:w="100" w:type="dxa"/>
+            </w:tcMar>
+          </w:tcPr>
+          <w:p>
+            <w:pPr>
+              <w:spacing w:before="0" w:after="0"/>
+              <w:jc w:val="right"/>
+            </w:pPr>
+            <w:r>
+              <w:rPr>
+                <w:rFonts w:ascii="Calibri" w:hAnsi="Calibri"/>
+                <w:b w:val="0"/>
+                <w:color w:val="2D3748"/>
+                <w:sz w:val="17"/>
+              </w:rPr>
+              <w:t>LTM (FY2026 Auditado)</w:t>
+            </w:r>
+          </w:p>
+        </w:tc>
+        <w:tc>
+          <w:tcPr>
+            <w:tcW w:type="dxa" w:w="1152"/>
+            <w:shd w:fill="FFFFFF"/>
+            <w:tcMar>
+              <w:top w:w="70" w:type="dxa"/>
+              <w:bottom w:w="70" w:type="dxa"/>
+              <w:left w:w="100" w:type="dxa"/>
+              <w:right w:w="100" w:type="dxa"/>
+            </w:tcMar>
+          </w:tcPr>
+          <w:p>
+            <w:pPr>
+              <w:spacing w:before="0" w:after="0"/>
+              <w:jc w:val="right"/>
+            </w:pPr>
+            <w:r>
+              <w:rPr>
+                <w:rFonts w:ascii="Calibri" w:hAnsi="Calibri"/>
+                <w:b w:val="0"/>
+                <w:color w:val="2D3748"/>
+                <w:sz w:val="17"/>
+              </w:rPr>
+              <w:t>35.74%</w:t>
+            </w:r>
+          </w:p>
+        </w:tc>
+        <w:tc>
+          <w:tcPr>
+            <w:tcW w:type="dxa" w:w="1152"/>
+            <w:shd w:fill="FFFFFF"/>
+            <w:tcMar>
+              <w:top w:w="70" w:type="dxa"/>
+              <w:bottom w:w="70" w:type="dxa"/>
+              <w:left w:w="100" w:type="dxa"/>
+              <w:right w:w="100" w:type="dxa"/>
+            </w:tcMar>
+          </w:tcPr>
+          <w:p>
+            <w:pPr>
+              <w:spacing w:before="0" w:after="0"/>
+              <w:jc w:val="right"/>
+            </w:pPr>
+            <w:r>
+              <w:rPr>
+                <w:rFonts w:ascii="Calibri" w:hAnsi="Calibri"/>
+                <w:b w:val="0"/>
+                <w:color w:val="2D3748"/>
+                <w:sz w:val="17"/>
+              </w:rPr>
+              <w:t>41.82%</w:t>
+            </w:r>
+          </w:p>
+        </w:tc>
+        <w:tc>
+          <w:tcPr>
+            <w:tcW w:type="dxa" w:w="1152"/>
+            <w:shd w:fill="FFFFFF"/>
+            <w:tcMar>
+              <w:top w:w="70" w:type="dxa"/>
+              <w:bottom w:w="70" w:type="dxa"/>
+              <w:left w:w="100" w:type="dxa"/>
+              <w:right w:w="100" w:type="dxa"/>
+            </w:tcMar>
+          </w:tcPr>
+          <w:p>
+            <w:pPr>
+              <w:spacing w:before="0" w:after="0"/>
+              <w:jc w:val="right"/>
+            </w:pPr>
+            <w:r>
+              <w:rPr>
+                <w:rFonts w:ascii="Calibri" w:hAnsi="Calibri"/>
+                <w:b w:val="0"/>
+                <w:color w:val="2D3748"/>
+                <w:sz w:val="17"/>
+              </w:rPr>
+              <w:t>69.60%</w:t>
+            </w:r>
+          </w:p>
+        </w:tc>
+        <w:tc>
+          <w:tcPr>
+            <w:tcW w:type="dxa" w:w="720"/>
+            <w:shd w:fill="FFFFFF"/>
+            <w:tcMar>
+              <w:top w:w="70" w:type="dxa"/>
+              <w:bottom w:w="70" w:type="dxa"/>
+              <w:left w:w="100" w:type="dxa"/>
+              <w:right w:w="100" w:type="dxa"/>
+            </w:tcMar>
+          </w:tcPr>
+          <w:p>
+            <w:pPr>
+              <w:spacing w:before="0" w:after="0"/>
+              <w:jc w:val="right"/>
+            </w:pPr>
+            <w:r>
+              <w:rPr>
+                <w:rFonts w:ascii="Calibri" w:hAnsi="Calibri"/>
+                <w:b w:val="0"/>
+                <w:color w:val="2D3748"/>
+                <w:sz w:val="17"/>
+              </w:rPr>
+              <w:t>0.51x</w:t>
+            </w:r>
+          </w:p>
+        </w:tc>
+        <w:tc>
+          <w:tcPr>
+            <w:tcW w:type="dxa" w:w="1152"/>
+            <w:shd w:fill="FFFFFF"/>
+            <w:tcMar>
+              <w:top w:w="70" w:type="dxa"/>
+              <w:bottom w:w="70" w:type="dxa"/>
+              <w:left w:w="100" w:type="dxa"/>
+              <w:right w:w="100" w:type="dxa"/>
+            </w:tcMar>
+          </w:tcPr>
+          <w:p>
+            <w:pPr>
+              <w:spacing w:before="0" w:after="0"/>
+              <w:jc w:val="left"/>
+            </w:pPr>
+            <w:r>
+              <w:rPr>
+                <w:rFonts w:ascii="Calibri" w:hAnsi="Calibri"/>
+                <w:b w:val="0"/>
+                <w:color w:val="2D3748"/>
+                <w:sz w:val="17"/>
+              </w:rPr>
+              <w:t>-5.72 pp</w:t>
+            </w:r>
+          </w:p>
+        </w:tc>
+      </w:tr>
+      <w:tr>
+        <w:tc>
+          <w:tcPr>
+            <w:tcW w:type="dxa" w:w="720"/>
+            <w:shd w:fill="F7FAFC"/>
+            <w:tcMar>
+              <w:top w:w="70" w:type="dxa"/>
+              <w:bottom w:w="70" w:type="dxa"/>
+              <w:left w:w="100" w:type="dxa"/>
+              <w:right w:w="100" w:type="dxa"/>
+            </w:tcMar>
+          </w:tcPr>
+          <w:p>
+            <w:pPr>
+              <w:spacing w:before="0" w:after="0"/>
+              <w:jc w:val="left"/>
+            </w:pPr>
+            <w:r>
+              <w:rPr>
+                <w:rFonts w:ascii="Calibri" w:hAnsi="Calibri"/>
+                <w:b w:val="0"/>
+                <w:color w:val="2D3748"/>
+                <w:sz w:val="17"/>
+              </w:rPr>
+              <w:t>-</w:t>
+            </w:r>
+          </w:p>
+        </w:tc>
+        <w:tc>
+          <w:tcPr>
+            <w:tcW w:type="dxa" w:w="1008"/>
+            <w:shd w:fill="F7FAFC"/>
+            <w:tcMar>
+              <w:top w:w="70" w:type="dxa"/>
+              <w:bottom w:w="70" w:type="dxa"/>
+              <w:left w:w="100" w:type="dxa"/>
+              <w:right w:w="100" w:type="dxa"/>
+            </w:tcMar>
+          </w:tcPr>
+          <w:p>
+            <w:pPr>
+              <w:spacing w:before="0" w:after="0"/>
+              <w:jc w:val="right"/>
+            </w:pPr>
+            <w:r>
+              <w:rPr>
+                <w:rFonts w:ascii="Calibri" w:hAnsi="Calibri"/>
+                <w:b w:val="0"/>
+                <w:color w:val="2D3748"/>
+                <w:sz w:val="17"/>
+              </w:rPr>
+              <w:t>MEDIANA</w:t>
+            </w:r>
+          </w:p>
+        </w:tc>
+        <w:tc>
+          <w:tcPr>
+            <w:tcW w:type="dxa" w:w="2016"/>
+            <w:shd w:fill="F7FAFC"/>
+            <w:tcMar>
+              <w:top w:w="70" w:type="dxa"/>
+              <w:bottom w:w="70" w:type="dxa"/>
+              <w:left w:w="100" w:type="dxa"/>
+              <w:right w:w="100" w:type="dxa"/>
+            </w:tcMar>
+          </w:tcPr>
+          <w:p>
+            <w:pPr>
+              <w:spacing w:before="0" w:after="0"/>
+              <w:jc w:val="right"/>
+            </w:pPr>
+            <w:r>
+              <w:rPr>
+                <w:rFonts w:ascii="Calibri" w:hAnsi="Calibri"/>
+                <w:b w:val="0"/>
+                <w:color w:val="2D3748"/>
+                <w:sz w:val="17"/>
+              </w:rPr>
+              <w:t>Mediana Sectorial</w:t>
+            </w:r>
+          </w:p>
+        </w:tc>
+        <w:tc>
+          <w:tcPr>
+            <w:tcW w:type="dxa" w:w="1296"/>
+            <w:shd w:fill="F7FAFC"/>
+            <w:tcMar>
+              <w:top w:w="70" w:type="dxa"/>
+              <w:bottom w:w="70" w:type="dxa"/>
+              <w:left w:w="100" w:type="dxa"/>
+              <w:right w:w="100" w:type="dxa"/>
+            </w:tcMar>
+          </w:tcPr>
+          <w:p>
+            <w:pPr>
+              <w:spacing w:before="0" w:after="0"/>
+              <w:jc w:val="right"/>
+            </w:pPr>
+            <w:r>
+              <w:rPr>
+                <w:rFonts w:ascii="Calibri" w:hAnsi="Calibri"/>
+                <w:b w:val="0"/>
+                <w:color w:val="2D3748"/>
+                <w:sz w:val="17"/>
+              </w:rPr>
+              <w:t>LTM</w:t>
+            </w:r>
+          </w:p>
+        </w:tc>
+        <w:tc>
+          <w:tcPr>
+            <w:tcW w:type="dxa" w:w="1152"/>
+            <w:shd w:fill="F7FAFC"/>
+            <w:tcMar>
+              <w:top w:w="70" w:type="dxa"/>
+              <w:bottom w:w="70" w:type="dxa"/>
+              <w:left w:w="100" w:type="dxa"/>
+              <w:right w:w="100" w:type="dxa"/>
+            </w:tcMar>
+          </w:tcPr>
+          <w:p>
+            <w:pPr>
+              <w:spacing w:before="0" w:after="0"/>
+              <w:jc w:val="right"/>
+            </w:pPr>
+            <w:r>
+              <w:rPr>
+                <w:rFonts w:ascii="Calibri" w:hAnsi="Calibri"/>
+                <w:b w:val="0"/>
+                <w:color w:val="2D3748"/>
+                <w:sz w:val="17"/>
+              </w:rPr>
+              <w:t>41.47%</w:t>
+            </w:r>
+          </w:p>
+        </w:tc>
+        <w:tc>
+          <w:tcPr>
+            <w:tcW w:type="dxa" w:w="1152"/>
+            <w:shd w:fill="F7FAFC"/>
+            <w:tcMar>
+              <w:top w:w="70" w:type="dxa"/>
+              <w:bottom w:w="70" w:type="dxa"/>
+              <w:left w:w="100" w:type="dxa"/>
+              <w:right w:w="100" w:type="dxa"/>
+            </w:tcMar>
+          </w:tcPr>
+          <w:p>
+            <w:pPr>
+              <w:spacing w:before="0" w:after="0"/>
+              <w:jc w:val="right"/>
+            </w:pPr>
+            <w:r>
+              <w:rPr>
+                <w:rFonts w:ascii="Calibri" w:hAnsi="Calibri"/>
+                <w:b w:val="0"/>
+                <w:color w:val="2D3748"/>
+                <w:sz w:val="17"/>
+              </w:rPr>
+              <w:t>58.48%</w:t>
+            </w:r>
+          </w:p>
+        </w:tc>
+        <w:tc>
+          <w:tcPr>
+            <w:tcW w:type="dxa" w:w="1152"/>
+            <w:shd w:fill="F7FAFC"/>
+            <w:tcMar>
+              <w:top w:w="70" w:type="dxa"/>
+              <w:bottom w:w="70" w:type="dxa"/>
+              <w:left w:w="100" w:type="dxa"/>
+              <w:right w:w="100" w:type="dxa"/>
+            </w:tcMar>
+          </w:tcPr>
+          <w:p>
+            <w:pPr>
+              <w:spacing w:before="0" w:after="0"/>
+              <w:jc w:val="right"/>
+            </w:pPr>
+            <w:r>
+              <w:rPr>
+                <w:rFonts w:ascii="Calibri" w:hAnsi="Calibri"/>
+                <w:b w:val="0"/>
+                <w:color w:val="2D3748"/>
+                <w:sz w:val="17"/>
+              </w:rPr>
+              <w:t>58.20%</w:t>
+            </w:r>
+          </w:p>
+        </w:tc>
+        <w:tc>
+          <w:tcPr>
+            <w:tcW w:type="dxa" w:w="720"/>
+            <w:shd w:fill="F7FAFC"/>
+            <w:tcMar>
+              <w:top w:w="70" w:type="dxa"/>
+              <w:bottom w:w="70" w:type="dxa"/>
+              <w:left w:w="100" w:type="dxa"/>
+              <w:right w:w="100" w:type="dxa"/>
+            </w:tcMar>
+          </w:tcPr>
+          <w:p>
+            <w:pPr>
+              <w:spacing w:before="0" w:after="0"/>
+              <w:jc w:val="right"/>
+            </w:pPr>
+            <w:r>
+              <w:rPr>
+                <w:rFonts w:ascii="Calibri" w:hAnsi="Calibri"/>
+                <w:b w:val="0"/>
+                <w:color w:val="2D3748"/>
+                <w:sz w:val="17"/>
+              </w:rPr>
+              <w:t>0.76x</w:t>
+            </w:r>
+          </w:p>
+        </w:tc>
+        <w:tc>
+          <w:tcPr>
+            <w:tcW w:type="dxa" w:w="1152"/>
+            <w:shd w:fill="F7FAFC"/>
+            <w:tcMar>
+              <w:top w:w="70" w:type="dxa"/>
+              <w:bottom w:w="70" w:type="dxa"/>
+              <w:left w:w="100" w:type="dxa"/>
+              <w:right w:w="100" w:type="dxa"/>
+            </w:tcMar>
+          </w:tcPr>
+          <w:p>
+            <w:pPr>
+              <w:spacing w:before="0" w:after="0"/>
+              <w:jc w:val="left"/>
+            </w:pPr>
+            <w:r>
+              <w:rPr>
+                <w:rFonts w:ascii="Calibri" w:hAnsi="Calibri"/>
+                <w:b w:val="0"/>
+                <w:color w:val="2D3748"/>
+                <w:sz w:val="17"/>
+              </w:rPr>
+              <w:t>0.00 pp</w:t>
+            </w:r>
+          </w:p>
+        </w:tc>
+      </w:tr>
+      <w:tr>
+        <w:tc>
+          <w:tcPr>
+            <w:tcW w:type="dxa" w:w="720"/>
+            <w:shd w:fill="FFFFFF"/>
+            <w:tcMar>
+              <w:top w:w="70" w:type="dxa"/>
+              <w:bottom w:w="70" w:type="dxa"/>
+              <w:left w:w="100" w:type="dxa"/>
+              <w:right w:w="100" w:type="dxa"/>
+            </w:tcMar>
+          </w:tcPr>
+          <w:p>
+            <w:pPr>
+              <w:spacing w:before="0" w:after="0"/>
+              <w:jc w:val="left"/>
+            </w:pPr>
+            <w:r>
+              <w:rPr>
+                <w:rFonts w:ascii="Calibri" w:hAnsi="Calibri"/>
+                <w:b w:val="0"/>
+                <w:color w:val="2D3748"/>
+                <w:sz w:val="17"/>
+              </w:rPr>
+              <w:t>-</w:t>
+            </w:r>
+          </w:p>
+        </w:tc>
+        <w:tc>
+          <w:tcPr>
+            <w:tcW w:type="dxa" w:w="1008"/>
+            <w:shd w:fill="FFFFFF"/>
+            <w:tcMar>
+              <w:top w:w="70" w:type="dxa"/>
+              <w:bottom w:w="70" w:type="dxa"/>
+              <w:left w:w="100" w:type="dxa"/>
+              <w:right w:w="100" w:type="dxa"/>
+            </w:tcMar>
+          </w:tcPr>
+          <w:p>
+            <w:pPr>
+              <w:spacing w:before="0" w:after="0"/>
+              <w:jc w:val="right"/>
+            </w:pPr>
+            <w:r>
+              <w:rPr>
+                <w:rFonts w:ascii="Calibri" w:hAnsi="Calibri"/>
+                <w:b w:val="0"/>
+                <w:color w:val="2D3748"/>
+                <w:sz w:val="17"/>
+              </w:rPr>
+              <w:t>P75</w:t>
+            </w:r>
+          </w:p>
+        </w:tc>
+        <w:tc>
+          <w:tcPr>
+            <w:tcW w:type="dxa" w:w="2016"/>
+            <w:shd w:fill="FFFFFF"/>
+            <w:tcMar>
+              <w:top w:w="70" w:type="dxa"/>
+              <w:bottom w:w="70" w:type="dxa"/>
+              <w:left w:w="100" w:type="dxa"/>
+              <w:right w:w="100" w:type="dxa"/>
+            </w:tcMar>
+          </w:tcPr>
+          <w:p>
+            <w:pPr>
+              <w:spacing w:before="0" w:after="0"/>
+              <w:jc w:val="right"/>
+            </w:pPr>
+            <w:r>
+              <w:rPr>
+                <w:rFonts w:ascii="Calibri" w:hAnsi="Calibri"/>
+                <w:b w:val="0"/>
+                <w:color w:val="2D3748"/>
+                <w:sz w:val="17"/>
+              </w:rPr>
+              <w:t>Percentil 75 Líder</w:t>
+            </w:r>
+          </w:p>
+        </w:tc>
+        <w:tc>
+          <w:tcPr>
+            <w:tcW w:type="dxa" w:w="1296"/>
+            <w:shd w:fill="FFFFFF"/>
+            <w:tcMar>
+              <w:top w:w="70" w:type="dxa"/>
+              <w:bottom w:w="70" w:type="dxa"/>
+              <w:left w:w="100" w:type="dxa"/>
+              <w:right w:w="100" w:type="dxa"/>
+            </w:tcMar>
+          </w:tcPr>
+          <w:p>
+            <w:pPr>
+              <w:spacing w:before="0" w:after="0"/>
+              <w:jc w:val="right"/>
+            </w:pPr>
+            <w:r>
+              <w:rPr>
+                <w:rFonts w:ascii="Calibri" w:hAnsi="Calibri"/>
+                <w:b w:val="0"/>
+                <w:color w:val="2D3748"/>
+                <w:sz w:val="17"/>
+              </w:rPr>
+              <w:t>LTM</w:t>
+            </w:r>
+          </w:p>
+        </w:tc>
+        <w:tc>
+          <w:tcPr>
+            <w:tcW w:type="dxa" w:w="1152"/>
+            <w:shd w:fill="FFFFFF"/>
+            <w:tcMar>
+              <w:top w:w="70" w:type="dxa"/>
+              <w:bottom w:w="70" w:type="dxa"/>
+              <w:left w:w="100" w:type="dxa"/>
+              <w:right w:w="100" w:type="dxa"/>
+            </w:tcMar>
+          </w:tcPr>
+          <w:p>
+            <w:pPr>
+              <w:spacing w:before="0" w:after="0"/>
+              <w:jc w:val="right"/>
+            </w:pPr>
+            <w:r>
+              <w:rPr>
+                <w:rFonts w:ascii="Calibri" w:hAnsi="Calibri"/>
+                <w:b w:val="0"/>
+                <w:color w:val="2D3748"/>
+                <w:sz w:val="17"/>
+              </w:rPr>
+              <w:t>46.81%</w:t>
+            </w:r>
+          </w:p>
+        </w:tc>
+        <w:tc>
+          <w:tcPr>
+            <w:tcW w:type="dxa" w:w="1152"/>
+            <w:shd w:fill="FFFFFF"/>
+            <w:tcMar>
+              <w:top w:w="70" w:type="dxa"/>
+              <w:bottom w:w="70" w:type="dxa"/>
+              <w:left w:w="100" w:type="dxa"/>
+              <w:right w:w="100" w:type="dxa"/>
+            </w:tcMar>
+          </w:tcPr>
+          <w:p>
+            <w:pPr>
+              <w:spacing w:before="0" w:after="0"/>
+              <w:jc w:val="right"/>
+            </w:pPr>
+            <w:r>
+              <w:rPr>
+                <w:rFonts w:ascii="Calibri" w:hAnsi="Calibri"/>
+                <w:b w:val="0"/>
+                <w:color w:val="2D3748"/>
+                <w:sz w:val="17"/>
+              </w:rPr>
+              <w:t>-</w:t>
+            </w:r>
+          </w:p>
+        </w:tc>
+        <w:tc>
+          <w:tcPr>
+            <w:tcW w:type="dxa" w:w="1152"/>
+            <w:shd w:fill="FFFFFF"/>
+            <w:tcMar>
+              <w:top w:w="70" w:type="dxa"/>
+              <w:bottom w:w="70" w:type="dxa"/>
+              <w:left w:w="100" w:type="dxa"/>
+              <w:right w:w="100" w:type="dxa"/>
+            </w:tcMar>
+          </w:tcPr>
+          <w:p>
+            <w:pPr>
+              <w:spacing w:before="0" w:after="0"/>
+              <w:jc w:val="right"/>
+            </w:pPr>
+            <w:r>
+              <w:rPr>
+                <w:rFonts w:ascii="Calibri" w:hAnsi="Calibri"/>
+                <w:b w:val="0"/>
+                <w:color w:val="2D3748"/>
+                <w:sz w:val="17"/>
+              </w:rPr>
+              <w:t>-</w:t>
+            </w:r>
+          </w:p>
+        </w:tc>
+        <w:tc>
+          <w:tcPr>
+            <w:tcW w:type="dxa" w:w="720"/>
+            <w:shd w:fill="FFFFFF"/>
+            <w:tcMar>
+              <w:top w:w="70" w:type="dxa"/>
+              <w:bottom w:w="70" w:type="dxa"/>
+              <w:left w:w="100" w:type="dxa"/>
+              <w:right w:w="100" w:type="dxa"/>
+            </w:tcMar>
+          </w:tcPr>
+          <w:p>
+            <w:pPr>
+              <w:spacing w:before="0" w:after="0"/>
+              <w:jc w:val="right"/>
+            </w:pPr>
+            <w:r>
+              <w:rPr>
+                <w:rFonts w:ascii="Calibri" w:hAnsi="Calibri"/>
+                <w:b w:val="0"/>
+                <w:color w:val="2D3748"/>
+                <w:sz w:val="17"/>
+              </w:rPr>
+              <w:t>-</w:t>
+            </w:r>
+          </w:p>
+        </w:tc>
+        <w:tc>
+          <w:tcPr>
+            <w:tcW w:type="dxa" w:w="1152"/>
+            <w:shd w:fill="FFFFFF"/>
+            <w:tcMar>
+              <w:top w:w="70" w:type="dxa"/>
+              <w:bottom w:w="70" w:type="dxa"/>
+              <w:left w:w="100" w:type="dxa"/>
+              <w:right w:w="100" w:type="dxa"/>
+            </w:tcMar>
+          </w:tcPr>
+          <w:p>
+            <w:pPr>
+              <w:spacing w:before="0" w:after="0"/>
+              <w:jc w:val="left"/>
+            </w:pPr>
+            <w:r>
+              <w:rPr>
+                <w:rFonts w:ascii="Calibri" w:hAnsi="Calibri"/>
+                <w:b w:val="0"/>
+                <w:color w:val="2D3748"/>
+                <w:sz w:val="17"/>
+              </w:rPr>
+              <w:t>+5.34 pp</w:t>
             </w:r>
           </w:p>
         </w:tc>
@@ -16574,7 +18289,7 @@
                 <w:color w:val="1B365D"/>
                 <w:sz w:val="21"/>
               </w:rPr>
-              <w:t>📌 DICTAMEN DE VALOR ECONÓMICO: 🛡️ NARROW MOAT / CREACIÓN DE VALOR SOSTENIBLE (SPREAD +10.71 p.p.)</w:t>
+              <w:t>📌 DICTAMEN DE VALOR ECONÓMICO: 🛡️ NARROW MOAT / CREACIÓN DE VALOR SOSTENIBLE (SPREAD +9.83 p.p.)</w:t>
               <w:br/>
             </w:r>
           </w:p>
@@ -16588,7 +18303,7 @@
                 <w:color w:val="2D3748"/>
                 <w:sz w:val="19"/>
               </w:rPr>
-              <w:t>• ROC Greenblatt Tangible (LTM): 205.38% (Productividad operativa pura pre-tax sobre capital de trabajo y PP&amp;E físico instalado).</w:t>
+              <w:t>• ROC Greenblatt Tangible (LTM): 31.36% (Productividad operativa pura pre-tax sobre capital de trabajo y PP&amp;E físico instalado).</w:t>
             </w:r>
           </w:p>
           <w:p>
@@ -16601,7 +18316,7 @@
                 <w:color w:val="2D3748"/>
                 <w:sz w:val="19"/>
               </w:rPr>
-              <w:t>• ROIC Ajustado por Intangibles (LTM): 21.46% frente a un ROIC contable tradicional de 20.30%.</w:t>
+              <w:t>• ROIC Ajustado por Intangibles (LTM): 20.37% frente a un ROIC contable tradicional de 21.77%.</w:t>
             </w:r>
           </w:p>
           <w:p>
@@ -16614,7 +18329,7 @@
                 <w:color w:val="2D3748"/>
                 <w:sz w:val="19"/>
               </w:rPr>
-              <w:t>• Costo Promedio Ponderado de Capital (WACC): 10.75% (Costo del Equity Ke: 11.03%, Deuda Neta Kd: 4.55%).</w:t>
+              <w:t>• Costo Promedio Ponderado de Capital (WACC): 10.54% (Costo del Equity Ke: 10.80%, Deuda Neta Kd: 5.31%).</w:t>
             </w:r>
           </w:p>
           <w:p>
@@ -16627,7 +18342,7 @@
                 <w:color w:val="2D3748"/>
                 <w:sz w:val="19"/>
               </w:rPr>
-              <w:t>• Spread Económico Neto: +10.71 p.p. de rendimiento por encima del costo de capital exigido por el mercado.</w:t>
+              <w:t>• Spread Económico Neto: +9.83 p.p. de rendimiento por encima del costo de capital exigido por el mercado.</w:t>
             </w:r>
           </w:p>
           <w:p>
@@ -16640,7 +18355,7 @@
                 <w:color w:val="2D3748"/>
                 <w:sz w:val="19"/>
               </w:rPr>
-              <w:t>• Stock de Intangibles Fuera de Balance: $99,448.3M capitalizados en innovación y amortizados económicamente a 3 años.</w:t>
+              <w:t>• Stock de Intangibles Fuera de Balance: $109,034.3M capitalizados en innovación y amortizados económicamente a 3 años.</w:t>
             </w:r>
           </w:p>
           <w:p>
@@ -16653,7 +18368,7 @@
                 <w:color w:val="2D3748"/>
                 <w:sz w:val="19"/>
               </w:rPr>
-              <w:t>• Tesis de Foso Defensivo: El negocio genera un Spread positivo de +10.71 p.p. sobre el WACC (10.75%), demostrando capacidad de generar valor económico superior a la media de forma constante frente a sus competidores.</w:t>
+              <w:t>• Tesis de Foso Defensivo: El negocio genera un Spread positivo de +9.83 p.p. sobre el WACC (10.54%), demostrando capacidad de generar valor económico superior a la media de forma constante frente a sus competidores.</w:t>
             </w:r>
           </w:p>
         </w:tc>
@@ -16819,7 +18534,7 @@
               <w:rPr>
                 <w:sz w:val="17"/>
               </w:rPr>
-              <w:t>$718.67</w:t>
+              <w:t>$642.62</w:t>
             </w:r>
           </w:p>
         </w:tc>
@@ -16900,7 +18615,7 @@
               <w:rPr>
                 <w:sz w:val="17"/>
               </w:rPr>
-              <w:t>$1,830,816.3M</w:t>
+              <w:t>$1,637,078.4M</w:t>
             </w:r>
           </w:p>
         </w:tc>
@@ -16981,7 +18696,7 @@
               <w:rPr>
                 <w:sz w:val="17"/>
               </w:rPr>
-              <w:t>5.24%</w:t>
+              <w:t>4.99%</w:t>
             </w:r>
           </w:p>
         </w:tc>
@@ -17201,7 +18916,7 @@
         <w:rPr>
           <w:sz w:val="19"/>
         </w:rPr>
-        <w:t>El Return on Capital (ROC) de Joel Greenblatt evalúa la rentabilidad operativa pura antes de impuestos (EBIT) sobre los activos físicos tangibles (Capital de Trabajo Neto Operativo + PP&amp;E Físico). Para Meta Platforms, Inc., el ROC de 205.38% refleja la eficiencia operativa sobre activos tangibles instalados, optimizando la rotación de capital y la productividad física instalada.</w:t>
+        <w:t>El Return on Capital (ROC) de Joel Greenblatt evalúa la rentabilidad operativa pura antes de impuestos (EBIT) sobre los activos físicos tangibles (Capital de Trabajo Neto Operativo + PP&amp;E Físico). Para Meta Platforms, Inc., el ROC de 31.36% refleja la eficiencia operativa sobre activos tangibles instalados, optimizando la rotación de capital y la productividad física instalada.</w:t>
       </w:r>
     </w:p>
     <w:tbl>
@@ -17375,7 +19090,7 @@
                 <w:b/>
                 <w:sz w:val="17"/>
               </w:rPr>
-              <w:t>$86,926.0M</w:t>
+              <w:t>$79,380.0M</w:t>
             </w:r>
           </w:p>
         </w:tc>
@@ -17476,7 +19191,7 @@
                 <w:b/>
                 <w:sz w:val="17"/>
               </w:rPr>
-              <w:t>$110,013.0M</w:t>
+              <w:t>$108,678.0M</w:t>
             </w:r>
           </w:p>
         </w:tc>
@@ -17578,7 +19293,7 @@
                 <w:b/>
                 <w:sz w:val="17"/>
               </w:rPr>
-              <w:t>$56,379.0M</w:t>
+              <w:t>$63,011.0M</w:t>
             </w:r>
           </w:p>
         </w:tc>
@@ -17679,7 +19394,7 @@
                 <w:b/>
                 <w:sz w:val="17"/>
               </w:rPr>
-              <w:t>$53,634.0M</w:t>
+              <w:t>$45,667.0M</w:t>
             </w:r>
           </w:p>
         </w:tc>
@@ -17781,7 +19496,7 @@
                 <w:b/>
                 <w:sz w:val="17"/>
               </w:rPr>
-              <w:t>$0.0M</w:t>
+              <w:t>$253,222.0M</w:t>
             </w:r>
           </w:p>
         </w:tc>
@@ -17800,7 +19515,7 @@
               <w:rPr>
                 <w:sz w:val="17"/>
               </w:rPr>
-              <w:t>$0.0M</w:t>
+              <w:t>$176,400.0M</w:t>
             </w:r>
           </w:p>
         </w:tc>
@@ -17882,7 +19597,7 @@
                 <w:b/>
                 <w:sz w:val="17"/>
               </w:rPr>
-              <w:t>$53,634.0M</w:t>
+              <w:t>$298,889.0M</w:t>
             </w:r>
           </w:p>
         </w:tc>
@@ -17902,7 +19617,7 @@
               <w:rPr>
                 <w:sz w:val="17"/>
               </w:rPr>
-              <w:t>$31,013.0M</w:t>
+              <w:t>$207,413.0M</w:t>
             </w:r>
           </w:p>
         </w:tc>
@@ -17984,7 +19699,7 @@
                 <w:b/>
                 <w:sz w:val="17"/>
               </w:rPr>
-              <w:t>$42,323.5M</w:t>
+              <w:t>$253,151.0M</w:t>
             </w:r>
           </w:p>
         </w:tc>
@@ -18003,7 +19718,7 @@
               <w:rPr>
                 <w:sz w:val="17"/>
               </w:rPr>
-              <w:t>$26,786.5M</w:t>
+              <w:t>$175,659.5M</w:t>
             </w:r>
           </w:p>
         </w:tc>
@@ -18087,7 +19802,7 @@
                 <w:b/>
                 <w:sz w:val="17"/>
               </w:rPr>
-              <w:t>205.38%</w:t>
+              <w:t>31.36%</w:t>
             </w:r>
           </w:p>
         </w:tc>
@@ -18109,7 +19824,7 @@
                 <w:b/>
                 <w:sz w:val="17"/>
               </w:rPr>
-              <w:t>310.89%</w:t>
+              <w:t>47.41%</w:t>
             </w:r>
           </w:p>
         </w:tc>
@@ -18288,7 +20003,7 @@
         <w:rPr>
           <w:sz w:val="19"/>
         </w:rPr>
-        <w:t>El ROIC Tradicional contable (20.30%) sobrestima el retorno al mandar el I+D a gasto inmediato. La metodología Damodaran capitaliza la innovación a 3 años, reconociendo $99,448.3M de intangibles fuera de balance. El ROIC Ajustado resultante de 21.46% refleja el verdadero retorno económico sobre el capital total invertido ($432,661.8M).</w:t>
+        <w:t>El ROIC Tradicional contable (21.77%) sobrestima el retorno al mandar el I+D a gasto inmediato. La metodología Damodaran capitaliza la innovación a 3 años, reconociendo $109,034.3M de intangibles fuera de balance. El ROIC Ajustado resultante de 20.37% refleja el verdadero retorno económico sobre el capital total invertido ($450,698.8M).</w:t>
       </w:r>
     </w:p>
     <w:tbl>
@@ -18507,7 +20222,7 @@
                 <w:b/>
                 <w:sz w:val="17"/>
               </w:rPr>
-              <w:t>81.78%</w:t>
+              <w:t>53.28%</w:t>
             </w:r>
           </w:p>
         </w:tc>
@@ -18605,7 +20320,7 @@
                 <w:b/>
                 <w:sz w:val="17"/>
               </w:rPr>
-              <w:t>+18.40 p.p.</w:t>
+              <w:t>+18.60 p.p.</w:t>
             </w:r>
           </w:p>
         </w:tc>
@@ -18648,7 +20363,7 @@
                 <w:b/>
                 <w:sz w:val="17"/>
               </w:rPr>
-              <w:t>123.77%</w:t>
+              <w:t>31.44%</w:t>
             </w:r>
           </w:p>
         </w:tc>
@@ -18751,7 +20466,7 @@
                 <w:b/>
                 <w:sz w:val="17"/>
               </w:rPr>
-              <w:t>+8.91 p.p.</w:t>
+              <w:t>+9.11 p.p.</w:t>
             </w:r>
           </w:p>
         </w:tc>
@@ -18792,7 +20507,7 @@
                 <w:b/>
                 <w:sz w:val="17"/>
               </w:rPr>
-              <w:t>318.20%</w:t>
+              <w:t>45.50%</w:t>
             </w:r>
           </w:p>
         </w:tc>
@@ -18890,7 +20605,7 @@
                 <w:b/>
                 <w:sz w:val="17"/>
               </w:rPr>
-              <w:t>+12.02 p.p.</w:t>
+              <w:t>+12.22 p.p.</w:t>
             </w:r>
           </w:p>
         </w:tc>
@@ -18933,7 +20648,7 @@
                 <w:b/>
                 <w:sz w:val="17"/>
               </w:rPr>
-              <w:t>406.89%</w:t>
+              <w:t>55.06%</w:t>
             </w:r>
           </w:p>
         </w:tc>
@@ -19036,7 +20751,7 @@
                 <w:b/>
                 <w:sz w:val="17"/>
               </w:rPr>
-              <w:t>+17.31 p.p.</w:t>
+              <w:t>+17.51 p.p.</w:t>
             </w:r>
           </w:p>
         </w:tc>
@@ -19077,7 +20792,7 @@
                 <w:b/>
                 <w:sz w:val="17"/>
               </w:rPr>
-              <w:t>310.89%</w:t>
+              <w:t>47.41%</w:t>
             </w:r>
           </w:p>
         </w:tc>
@@ -19175,7 +20890,7 @@
                 <w:b/>
                 <w:sz w:val="17"/>
               </w:rPr>
-              <w:t>+10.63 p.p.</w:t>
+              <w:t>+10.83 p.p.</w:t>
             </w:r>
           </w:p>
         </w:tc>
@@ -19220,7 +20935,7 @@
                 <w:b/>
                 <w:sz w:val="17"/>
               </w:rPr>
-              <w:t>205.38%</w:t>
+              <w:t>31.36%</w:t>
             </w:r>
           </w:p>
         </w:tc>
@@ -19242,7 +20957,7 @@
                 <w:b/>
                 <w:sz w:val="17"/>
               </w:rPr>
-              <w:t>20.30%</w:t>
+              <w:t>21.77%</w:t>
             </w:r>
           </w:p>
         </w:tc>
@@ -19264,7 +20979,7 @@
                 <w:b/>
                 <w:sz w:val="17"/>
               </w:rPr>
-              <w:t>21.46%</w:t>
+              <w:t>20.37%</w:t>
             </w:r>
           </w:p>
         </w:tc>
@@ -19285,7 +21000,7 @@
               <w:rPr>
                 <w:sz w:val="17"/>
               </w:rPr>
-              <w:t>$99,448.3M</w:t>
+              <w:t>$109,034.3M</w:t>
             </w:r>
           </w:p>
         </w:tc>
@@ -19306,7 +21021,7 @@
               <w:rPr>
                 <w:sz w:val="17"/>
               </w:rPr>
-              <w:t>$432,661.8M</w:t>
+              <w:t>$450,698.8M</w:t>
             </w:r>
           </w:p>
         </w:tc>
@@ -19328,7 +21043,7 @@
                 <w:b/>
                 <w:sz w:val="17"/>
               </w:rPr>
-              <w:t>+10.71 p.p.</w:t>
+              <w:t>+9.83 p.p.</w:t>
             </w:r>
           </w:p>
         </w:tc>
@@ -19343,7 +21058,7 @@
           <w:i/>
           <w:sz w:val="18"/>
         </w:rPr>
-        <w:t>Matriz de Sensibilidad de Vida Útil: N-1 (2a) = 22.14% | N Base (3a) = 21.46% | N+1 (4a) = 21.19%.</w:t>
+        <w:t>Matriz de Sensibilidad de Vida Útil: N-1 (2a) = 19.63% | N Base (3a) = 20.37% | N+1 (4a) = 20.61%.</w:t>
       </w:r>
     </w:p>
     <w:p>
@@ -19359,7 +21074,7 @@
         <w:rPr>
           <w:sz w:val="19"/>
         </w:rPr>
-        <w:t>Spread Económico = ROIC Ajustado (21.46%) − WACC (10.75%) = +10.71 p.p.</w:t>
+        <w:t>Spread Económico = ROIC Ajustado (20.37%) − WACC (10.54%) = +9.83 p.p.</w:t>
         <w:br/>
         <w:t>Dictamen: 🛡️ NARROW MOAT / CREACIÓN DE VALOR SOSTENIBLE. La compañía supera holgadamente su costo de capital, generando retornos netos excedentes sobre cada dólar invertido.</w:t>
       </w:r>
@@ -19562,7 +21277,7 @@
                 <w:b/>
                 <w:sz w:val="17"/>
               </w:rPr>
-              <w:t>5.24%</w:t>
+              <w:t>4.99%</w:t>
             </w:r>
           </w:p>
         </w:tc>
@@ -19867,7 +21582,7 @@
                 <w:b/>
                 <w:sz w:val="17"/>
               </w:rPr>
-              <w:t>11.03%</w:t>
+              <w:t>10.80%</w:t>
             </w:r>
           </w:p>
         </w:tc>
@@ -19968,7 +21683,7 @@
                 <w:b/>
                 <w:sz w:val="17"/>
               </w:rPr>
-              <w:t>4.55%</w:t>
+              <w:t>5.31%</w:t>
             </w:r>
           </w:p>
         </w:tc>
@@ -20006,7 +21721,7 @@
               <w:rPr>
                 <w:sz w:val="17"/>
               </w:rPr>
-              <w:t>Financiación crediticia con escudo fiscal del 22.2%.</w:t>
+              <w:t>Financiación crediticia con escudo fiscal del 5.0%.</w:t>
             </w:r>
           </w:p>
         </w:tc>
@@ -20070,7 +21785,7 @@
                 <w:b/>
                 <w:sz w:val="17"/>
               </w:rPr>
-              <w:t>10.75%</w:t>
+              <w:t>10.54%</w:t>
             </w:r>
           </w:p>
         </w:tc>
@@ -20174,7 +21889,7 @@
                 <w:b/>
                 <w:sz w:val="17"/>
               </w:rPr>
-              <w:t>205.38%</w:t>
+              <w:t>31.36%</w:t>
             </w:r>
           </w:p>
         </w:tc>
@@ -20194,7 +21909,7 @@
               <w:rPr>
                 <w:sz w:val="17"/>
               </w:rPr>
-              <w:t>Mediana Sector</w:t>
+              <w:t>Mediana Sector (52.00%)</w:t>
             </w:r>
           </w:p>
         </w:tc>
@@ -20214,7 +21929,7 @@
               <w:rPr>
                 <w:sz w:val="17"/>
               </w:rPr>
-              <w:t>Asset-Light; supera al sector por N/D.</w:t>
+              <w:t>Asset-Light; supera al sector por -20.64 p.p..</w:t>
             </w:r>
           </w:p>
         </w:tc>
@@ -20278,7 +21993,7 @@
                 <w:b/>
                 <w:sz w:val="17"/>
               </w:rPr>
-              <w:t>$42,323.5M</w:t>
+              <w:t>$253,151.0M</w:t>
             </w:r>
           </w:p>
         </w:tc>
@@ -20379,7 +22094,7 @@
                 <w:b/>
                 <w:sz w:val="17"/>
               </w:rPr>
-              <w:t>20.30%</w:t>
+              <w:t>21.77%</w:t>
             </w:r>
           </w:p>
         </w:tc>
@@ -20481,7 +22196,7 @@
                 <w:b/>
                 <w:sz w:val="17"/>
               </w:rPr>
-              <w:t>$99,448.3M</w:t>
+              <w:t>$109,034.3M</w:t>
             </w:r>
           </w:p>
         </w:tc>
@@ -20582,7 +22297,7 @@
                 <w:b/>
                 <w:sz w:val="17"/>
               </w:rPr>
-              <w:t>$432,661.8M</w:t>
+              <w:t>$450,698.8M</w:t>
             </w:r>
           </w:p>
         </w:tc>
@@ -20688,7 +22403,7 @@
                 <w:b/>
                 <w:sz w:val="17"/>
               </w:rPr>
-              <w:t>21.46%</w:t>
+              <w:t>20.37%</w:t>
             </w:r>
           </w:p>
         </w:tc>
@@ -20710,7 +22425,7 @@
                 <w:b/>
                 <w:sz w:val="17"/>
               </w:rPr>
-              <w:t>Mediana Sector (15.50%)</w:t>
+              <w:t>Mediana Sector (21.20%)</w:t>
             </w:r>
           </w:p>
         </w:tc>
@@ -20797,7 +22512,7 @@
                 <w:b/>
                 <w:sz w:val="17"/>
               </w:rPr>
-              <w:t>+10.71 p.p.</w:t>
+              <w:t>+9.83 p.p.</w:t>
             </w:r>
           </w:p>
         </w:tc>
@@ -20818,7 +22533,7 @@
                 <w:b/>
                 <w:sz w:val="17"/>
               </w:rPr>
-              <w:t>Mediana Sector (+6.80 p.p.)</w:t>
+              <w:t>Mediana Sector (+11.70 p.p.)</w:t>
             </w:r>
           </w:p>
         </w:tc>
@@ -20977,7 +22692,7 @@
           <w:color w:val="1B365D"/>
           <w:sz w:val="21"/>
         </w:rPr>
-        <w:t>DICTAMEN FORENSE INSTITUCIONAL (LTM): MÁXIMA CALIDAD CONTABLE</w:t>
+        <w:t>DICTAMEN FORENSE INSTITUCIONAL (LTM): ZONA DE VIGILANCIA</w:t>
         <w:br/>
       </w:r>
       <w:r>
@@ -20986,11 +22701,11 @@
           <w:color w:val="2D3748"/>
           <w:sz w:val="19"/>
         </w:rPr>
-        <w:t>• Ratio Sloan de Devengos: -15.25% [ALTA CONVERSIÓN DE CAJA (CFO &gt; NI)]</w:t>
+        <w:t>• Ratio Sloan de Devengos: -13.69% [ALTA CONVERSIÓN DE CAJA (CFO &gt; NI)]</w:t>
         <w:br/>
-        <w:t>• Montier C-Score: 2 / 6 [RIESGO MODERADO / ALERTA PREVENTIVA (&lt; 5% PROBABILIDAD DE MANIPULACIÓN)]</w:t>
+        <w:t>• Montier C-Score: 3 / 6 [RIESGO MEDIO-ALTO / VIGILANCIA RIGUROSA (&lt; 40% VIGILANCIA)]</w:t>
         <w:br/>
-        <w:t>• Dictamen: CALIDAD DE BENEFICIOS EXCEPCIONAL (GRADO INSTITUCIONAL): Conversión de efectivo sobresaliente (Ratio Sloan: -15.25%, CFO &gt; Utilidad Neta), devengos negativos que suprimen riesgo de inflación contable y Montier C-Score de 2/6 que descarta maniobras de manipulación deliberada.</w:t>
+        <w:t>• Dictamen: ZONA DE VIGILANCIA POR DESFASES OPERATIVOS: Montier C-Score de 3/6 con divergencias puntuales en capital de trabajo. Revisar ciclos estacionales de inventarios y condiciones comerciales de cobro.</w:t>
       </w:r>
     </w:p>
     <w:p>
@@ -21286,7 +23001,7 @@
                 <w:b w:val="0"/>
                 <w:sz w:val="17"/>
               </w:rPr>
-              <w:t>$68,098.0M</w:t>
+              <w:t>$75,249.0M</w:t>
             </w:r>
           </w:p>
         </w:tc>
@@ -21453,7 +23168,7 @@
                 <w:b w:val="0"/>
                 <w:sz w:val="17"/>
               </w:rPr>
-              <w:t>$130,301.0M</w:t>
+              <w:t>$133,087.0M</w:t>
             </w:r>
           </w:p>
         </w:tc>
@@ -21620,7 +23335,7 @@
                 <w:b/>
                 <w:sz w:val="17"/>
               </w:rPr>
-              <w:t>$-62,203.0M</w:t>
+              <w:t>$-57,838.0M</w:t>
             </w:r>
           </w:p>
         </w:tc>
@@ -21787,7 +23502,7 @@
                 <w:b w:val="0"/>
                 <w:sz w:val="17"/>
               </w:rPr>
-              <w:t>$407,988.5M</w:t>
+              <w:t>$422,428.5M</w:t>
             </w:r>
           </w:p>
         </w:tc>
@@ -21954,7 +23669,7 @@
                 <w:b/>
                 <w:sz w:val="17"/>
               </w:rPr>
-              <w:t>-15.25%</w:t>
+              <w:t>-13.69%</w:t>
             </w:r>
           </w:p>
         </w:tc>
@@ -22258,7 +23973,7 @@
           <w:color w:val="2D3748"/>
           <w:sz w:val="17"/>
         </w:rPr>
-        <w:t>Interpretación para el Inversor: En LTM, Meta Platforms, Inc. generó $130,301.0M de CFO frente a $68,098.0M de beneficio neto, arrojando una tasa de conversión de caja del 191.3% (cada dólar reportado está respaldado por $1.91 de efectivo). El Ratio Sloan de -15.25% descarta por completo el riesgo de beneficios ficticios.</w:t>
+        <w:t>Interpretación para el Inversor: En LTM, Meta Platforms, Inc. generó $133,087.0M de CFO frente a $75,249.0M de beneficio neto, arrojando una tasa de conversión de caja del 176.9% (cada dólar reportado está respaldado por $1.77 de efectivo). El Ratio Sloan de -13.69% descarta por completo el riesgo de beneficios ficticios.</w:t>
       </w:r>
     </w:p>
     <w:p>
@@ -22508,7 +24223,7 @@
                 <w:rFonts w:ascii="Calibri" w:hAnsi="Calibri"/>
                 <w:sz w:val="17"/>
               </w:rPr>
-              <w:t>-3.5%</w:t>
+              <w:t>-5.3%</w:t>
             </w:r>
           </w:p>
         </w:tc>
@@ -22531,7 +24246,7 @@
                 <w:rFonts w:ascii="Calibri" w:hAnsi="Calibri"/>
                 <w:sz w:val="17"/>
               </w:rPr>
-              <w:t>DSO: 34.8d (-1.1d)</w:t>
+              <w:t>DSO: 34.3d (-1.6d)</w:t>
             </w:r>
           </w:p>
         </w:tc>
@@ -22748,7 +24463,7 @@
                 <w:rFonts w:ascii="Calibri" w:hAnsi="Calibri"/>
                 <w:sz w:val="17"/>
               </w:rPr>
-              <w:t>96.6%</w:t>
+              <w:t>44.8%</w:t>
             </w:r>
           </w:p>
         </w:tc>
@@ -22771,7 +24486,7 @@
                 <w:rFonts w:ascii="Calibri" w:hAnsi="Calibri"/>
                 <w:sz w:val="17"/>
               </w:rPr>
-              <w:t>Δ: +6.4 pp</w:t>
+              <w:t>Δ: +2.8 pp</w:t>
             </w:r>
           </w:p>
         </w:tc>
@@ -22827,7 +24542,7 @@
           <w:color w:val="1B365D"/>
           <w:sz w:val="23"/>
         </w:rPr>
-        <w:t>12.3. Desglose Forense Montier C-Score (2/6 Banderas)</w:t>
+        <w:t>12.3. Desglose Forense Montier C-Score (3 / 6)</w:t>
       </w:r>
     </w:p>
     <w:p>
@@ -23062,7 +24777,7 @@
                 <w:rFonts w:ascii="Calibri" w:hAnsi="Calibri"/>
                 <w:sz w:val="16"/>
               </w:rPr>
-              <w:t>NI: $68,098.0M vs CFO: $130,301.0M</w:t>
+              <w:t>NI: $75,249.0M vs CFO: $133,087.0M</w:t>
             </w:r>
           </w:p>
         </w:tc>
@@ -23135,7 +24850,7 @@
                 <w:rFonts w:ascii="Calibri" w:hAnsi="Calibri"/>
                 <w:sz w:val="16"/>
               </w:rPr>
-              <w:t>2. Cuentas por Cobrar vs. Ventas</w:t>
+              <w:t>2. Cuentas por Cobrar vs. Ventas (DSO)</w:t>
             </w:r>
           </w:p>
         </w:tc>
@@ -23158,7 +24873,7 @@
                 <w:rFonts w:ascii="Calibri" w:hAnsi="Calibri"/>
                 <w:sz w:val="16"/>
               </w:rPr>
-              <w:t>Δ Cuentas por Cobrar % &gt; Δ Ventas %</w:t>
+              <w:t>Δ DSO &gt; 0 (o %Δ Cuentas por Cobrar &gt; %Δ Ventas)</w:t>
             </w:r>
           </w:p>
         </w:tc>
@@ -23181,7 +24896,7 @@
                 <w:rFonts w:ascii="Calibri" w:hAnsi="Calibri"/>
                 <w:sz w:val="16"/>
               </w:rPr>
-              <w:t>ΔAR: 10.0% vs ΔVentas: 13.6%</w:t>
+              <w:t>DSO: 34.3d (Δ: -1.6d)</w:t>
             </w:r>
           </w:p>
         </w:tc>
@@ -23229,7 +24944,7 @@
                 <w:rFonts w:ascii="Calibri" w:hAnsi="Calibri"/>
                 <w:sz w:val="16"/>
               </w:rPr>
-              <w:t>Las cuentas a cobrar crecen más rápido que las ventas. Indica relajación de cobros o facturación apresurada (channel stuffing).</w:t>
+              <w:t>El plazo de cobro se dilata o las cuentas a cobrar crecen más rápido que las ventas. Indica relajación de cobros o facturación apresurada (channel stuffing).</w:t>
             </w:r>
           </w:p>
         </w:tc>
@@ -23254,7 +24969,7 @@
                 <w:rFonts w:ascii="Calibri" w:hAnsi="Calibri"/>
                 <w:sz w:val="16"/>
               </w:rPr>
-              <w:t>3. Inventarios vs. Coste de Ventas</w:t>
+              <w:t>3. Inventarios vs. Coste de Ventas (DIO)</w:t>
             </w:r>
           </w:p>
         </w:tc>
@@ -23277,7 +24992,7 @@
                 <w:rFonts w:ascii="Calibri" w:hAnsi="Calibri"/>
                 <w:sz w:val="16"/>
               </w:rPr>
-              <w:t>Δ Inventarios % &gt; Δ Coste de Ventas %</w:t>
+              <w:t>Δ DIO &gt; 0 (o %Δ Inventarios &gt; %Δ Coste de Ventas)</w:t>
             </w:r>
           </w:p>
         </w:tc>
@@ -23300,7 +25015,7 @@
                 <w:rFonts w:ascii="Calibri" w:hAnsi="Calibri"/>
                 <w:sz w:val="16"/>
               </w:rPr>
-              <w:t>N/D</w:t>
+              <w:t>N/A (Sin Inventario)</w:t>
             </w:r>
           </w:p>
         </w:tc>
@@ -23348,7 +25063,7 @@
                 <w:rFonts w:ascii="Calibri" w:hAnsi="Calibri"/>
                 <w:sz w:val="16"/>
               </w:rPr>
-              <w:t>Las existencias crecen más rápido que los costes de venta. Puede esconder producto no vendido o absorción de costes en inventario para inflar márgenes.</w:t>
+              <w:t>Modelo de negocio sin inventario físico ni existencias de mercancía.</w:t>
             </w:r>
           </w:p>
         </w:tc>
@@ -23373,7 +25088,7 @@
                 <w:rFonts w:ascii="Calibri" w:hAnsi="Calibri"/>
                 <w:sz w:val="16"/>
               </w:rPr>
-              <w:t>4. Deterioro del Margen Bruto</w:t>
+              <w:t>4. Otros Activos Corrientes vs. Ventas</w:t>
             </w:r>
           </w:p>
         </w:tc>
@@ -23396,7 +25111,7 @@
                 <w:rFonts w:ascii="Calibri" w:hAnsi="Calibri"/>
                 <w:sz w:val="16"/>
               </w:rPr>
-              <w:t>Margen Bruto_t &lt; Margen Bruto_t-1</w:t>
+              <w:t>Ratio Otros Act. Ctes/Ventas_t &gt; Ratio Otros Act. Ctes/Ventas_t-1</w:t>
             </w:r>
           </w:p>
         </w:tc>
@@ -23419,7 +25134,7 @@
                 <w:rFonts w:ascii="Calibri" w:hAnsi="Calibri"/>
                 <w:sz w:val="16"/>
               </w:rPr>
-              <w:t>Margen Bruto: 81.75% vs 82.0%</w:t>
+              <w:t>Otros Act/Ventas: 6.1% vs 3.66%</w:t>
             </w:r>
           </w:p>
         </w:tc>
@@ -23467,7 +25182,7 @@
                 <w:rFonts w:ascii="Calibri" w:hAnsi="Calibri"/>
                 <w:sz w:val="16"/>
               </w:rPr>
-              <w:t>El deterioro del margen bruto genera incentivos en los ejecutivos para estirar partidas contables inferiores.</w:t>
+              <w:t>Incremento del peso relativo de otros activos corrientes. Alerta de partidas dudosas o cargos diferidos ocultos fuera de clientes e inventarios.</w:t>
             </w:r>
           </w:p>
         </w:tc>
@@ -23492,7 +25207,7 @@
                 <w:rFonts w:ascii="Calibri" w:hAnsi="Calibri"/>
                 <w:sz w:val="16"/>
               </w:rPr>
-              <w:t>5. Incremento de Activos Blandos</w:t>
+              <w:t>5. Reducción de la Tasa de Depreciación</w:t>
             </w:r>
           </w:p>
         </w:tc>
@@ -23515,7 +25230,7 @@
                 <w:rFonts w:ascii="Calibri" w:hAnsi="Calibri"/>
                 <w:sz w:val="16"/>
               </w:rPr>
-              <w:t>Ratio Activos Blandos_t &gt; Ratio Activos Blandos_t-1</w:t>
+              <w:t>Tasa Depreciación_t &lt; Tasa Depreciación_t-1</w:t>
             </w:r>
           </w:p>
         </w:tc>
@@ -23538,7 +25253,7 @@
                 <w:rFonts w:ascii="Calibri" w:hAnsi="Calibri"/>
                 <w:sz w:val="16"/>
               </w:rPr>
-              <w:t>Activos Blandos: 96.6% vs 90.2%</w:t>
+              <w:t>Tasa Deprec: 8.96% vs 9.55%</w:t>
             </w:r>
           </w:p>
         </w:tc>
@@ -23586,7 +25301,7 @@
                 <w:rFonts w:ascii="Calibri" w:hAnsi="Calibri"/>
                 <w:sz w:val="16"/>
               </w:rPr>
-              <w:t>Aumento del peso relativo de partidas del balance que no son activos productivos tangibles ni tesorería.</w:t>
+              <w:t>Reducción de la amortización contable respecto a los activos brutos, inflando el beneficio neto al estirar vidas útiles estimadas.</w:t>
             </w:r>
           </w:p>
         </w:tc>
@@ -23611,7 +25326,7 @@
                 <w:rFonts w:ascii="Calibri" w:hAnsi="Calibri"/>
                 <w:sz w:val="16"/>
               </w:rPr>
-              <w:t>6. Reducción de la Tasa de Depreciación</w:t>
+              <w:t>6. Crecimiento Excesivo de Activos Totales</w:t>
             </w:r>
           </w:p>
         </w:tc>
@@ -23634,7 +25349,7 @@
                 <w:rFonts w:ascii="Calibri" w:hAnsi="Calibri"/>
                 <w:sz w:val="16"/>
               </w:rPr>
-              <w:t>Tasa Depreciación_t &lt; Tasa Depreciación_t-1</w:t>
+              <w:t>Δ Activos &gt; 15.0% y Δ Activos &gt; 1.15 * Δ Ventas</w:t>
             </w:r>
           </w:p>
         </w:tc>
@@ -23657,7 +25372,7 @@
                 <w:rFonts w:ascii="Calibri" w:hAnsi="Calibri"/>
                 <w:sz w:val="16"/>
               </w:rPr>
-              <w:t>Tasa Deprec: 100.0% vs 100.0%</w:t>
+              <w:t>ΔActivos: +30.8% vs ΔVentas: +20.2%</w:t>
             </w:r>
           </w:p>
         </w:tc>
@@ -23679,10 +25394,10 @@
               <w:rPr>
                 <w:rFonts w:ascii="Calibri" w:hAnsi="Calibri"/>
                 <w:b/>
-                <w:color w:val="276A3C"/>
+                <w:color w:val="C00000"/>
                 <w:sz w:val="16"/>
               </w:rPr>
-              <w:t>✅ OK</w:t>
+              <w:t>🚩 FLAG</w:t>
             </w:r>
           </w:p>
         </w:tc>
@@ -23705,7 +25420,7 @@
                 <w:rFonts w:ascii="Calibri" w:hAnsi="Calibri"/>
                 <w:sz w:val="16"/>
               </w:rPr>
-              <w:t>Reducción de la amortización contable respecto a los activos brutos, inflando el beneficio neto al estirar vidas útiles.</w:t>
+              <w:t>Expansión desproporcionada de balance no respaldada por ventas. Montier advierte que suele utilizarse para disimular debilidad orgánica o acumulación de partidas improductivas.</w:t>
             </w:r>
           </w:p>
         </w:tc>
@@ -23722,7 +25437,7 @@
           <w:color w:val="1B365D"/>
           <w:sz w:val="17"/>
         </w:rPr>
-        <w:t>Dictamen Montier: 2 / 6 Banderas — RIESGO MODERADO / ALERTA PREVENTIVA. Probabilidad empírica de manipulación moderada (&lt; 25%).</w:t>
+        <w:t>Dictamen Montier: 3 / 6 Banderas — RIESGO MEDIO-ALTO / VIGILANCIA RIGUROSA. Probabilidad empírica de manipulación zona de vigilancia (&lt; 40%).</w:t>
       </w:r>
     </w:p>
     <w:p>
@@ -23960,7 +25675,7 @@
                 <w:rFonts w:ascii="Calibri" w:hAnsi="Calibri"/>
                 <w:sz w:val="17"/>
               </w:rPr>
-              <w:t>-15.25%</w:t>
+              <w:t>-13.69%</w:t>
             </w:r>
           </w:p>
         </w:tc>
@@ -24079,7 +25794,7 @@
                 <w:rFonts w:ascii="Calibri" w:hAnsi="Calibri"/>
                 <w:sz w:val="17"/>
               </w:rPr>
-              <w:t>191.3%</w:t>
+              <w:t>176.9%</w:t>
             </w:r>
           </w:p>
         </w:tc>
@@ -24198,7 +25913,7 @@
                 <w:rFonts w:ascii="Calibri" w:hAnsi="Calibri"/>
                 <w:sz w:val="17"/>
               </w:rPr>
-              <w:t>-3.5%</w:t>
+              <w:t>-5.3%</w:t>
             </w:r>
           </w:p>
         </w:tc>
@@ -24244,7 +25959,7 @@
                 <w:rFonts w:ascii="Calibri" w:hAnsi="Calibri"/>
                 <w:sz w:val="17"/>
               </w:rPr>
-              <w:t>Cobranza disciplinada (DSO: 34.8d); cobros sincronizados sin ventas infladas.</w:t>
+              <w:t>Cobranza disciplinada (DSO: 34.3d); cobros sincronizados sin ventas infladas.</w:t>
             </w:r>
           </w:p>
         </w:tc>
@@ -24436,7 +26151,7 @@
                 <w:rFonts w:ascii="Calibri" w:hAnsi="Calibri"/>
                 <w:sz w:val="17"/>
               </w:rPr>
-              <w:t>+6.4 pp</w:t>
+              <w:t>+2.8 pp</w:t>
             </w:r>
           </w:p>
         </w:tc>
@@ -24482,7 +26197,7 @@
                 <w:rFonts w:ascii="Calibri" w:hAnsi="Calibri"/>
                 <w:sz w:val="17"/>
               </w:rPr>
-              <w:t>Alerta (+6.4 pp): Aumento en activos no físicos; auditar intangibles.</w:t>
+              <w:t>Aumento moderado (+2.8 pp); balance sano con activos blandos bajo 75% (44.8%).</w:t>
             </w:r>
           </w:p>
         </w:tc>
@@ -24555,7 +26270,7 @@
                 <w:rFonts w:ascii="Calibri" w:hAnsi="Calibri"/>
                 <w:sz w:val="17"/>
               </w:rPr>
-              <w:t>2 / 6</w:t>
+              <w:t>3 / 6</w:t>
             </w:r>
           </w:p>
         </w:tc>
@@ -24601,7 +26316,7 @@
                 <w:rFonts w:ascii="Calibri" w:hAnsi="Calibri"/>
                 <w:sz w:val="17"/>
               </w:rPr>
-              <w:t>Riesgo moderado (2/6); banderas operativas no constitutivas de fraude.</w:t>
+              <w:t>Vigilancia rigurosa (3/6); desfases en capital de trabajo o balance (&lt; 40%).</w:t>
             </w:r>
           </w:p>
         </w:tc>
@@ -24656,10 +26371,10 @@
                 <w:color w:val="2D3748"/>
                 <w:sz w:val="19"/>
               </w:rPr>
-              <w:t>Rating Sintético Damodaran: AAA (GRADO INSTITUCIONAL MÁXIMO (AAA / Aaa)) | Altman Z''-Score: 4.9 [ZONA SEGURA]</w:t>
+              <w:t>Rating Sintético Damodaran: AAA (GRADO INSTITUCIONAL MÁXIMO (AAA / Aaa)) | Altman Z''-Score: 4.4 [ZONA SEGURA]</w:t>
               <w:br/>
               <w:br/>
-              <w:t>FORTALEZA FINANCIERA INQUEBRANTABLE (GRADO INSTITUCIONAL AAA/AA): Apalancamiento óptimo (CAJA NETA), cobertura de intereses de 108.1x y Altman Z''-Score de 4.9 en Zona Segura. Cero estrés crediticio, con capacidad excepcional de financiación en cualquier ciclo macroeconómico.</w:t>
+              <w:t>FORTALEZA FINANCIERA INQUEBRANTABLE (GRADO INSTITUCIONAL AAA/AA): Apalancamiento óptimo (CAJA NETA), cobertura de intereses de 90.2x y Altman Z''-Score de 4.4 en Zona Segura. Cero estrés crediticio, con capacidad excepcional de financiación en cualquier ciclo macroeconómico.</w:t>
             </w:r>
           </w:p>
         </w:tc>
@@ -24798,7 +26513,7 @@
                 <w:b/>
                 <w:sz w:val="17"/>
               </w:rPr>
-              <w:t>$83,664.0M</w:t>
+              <w:t>$80,922.0M</w:t>
             </w:r>
           </w:p>
         </w:tc>
@@ -24857,7 +26572,7 @@
                 <w:b/>
                 <w:sz w:val="17"/>
               </w:rPr>
-              <w:t>$90,260.0M</w:t>
+              <w:t>$82,449.0M</w:t>
             </w:r>
           </w:p>
         </w:tc>
@@ -24914,7 +26629,7 @@
                 <w:b/>
                 <w:sz w:val="17"/>
               </w:rPr>
-              <w:t>$6,596.0M (Caja Neta)</w:t>
+              <w:t>$1,527.0M (Caja Neta)</w:t>
             </w:r>
           </w:p>
         </w:tc>
@@ -25182,7 +26897,7 @@
                 <w:b/>
                 <w:sz w:val="17"/>
               </w:rPr>
-              <w:t>$86,926.0M</w:t>
+              <w:t>$79,380.0M</w:t>
             </w:r>
           </w:p>
         </w:tc>
@@ -25241,7 +26956,7 @@
                 <w:b/>
                 <w:sz w:val="17"/>
               </w:rPr>
-              <w:t>$804.0M</w:t>
+              <w:t>$880.0M</w:t>
             </w:r>
           </w:p>
         </w:tc>
@@ -25298,7 +27013,7 @@
                 <w:b/>
                 <w:sz w:val="17"/>
               </w:rPr>
-              <w:t>108.1x</w:t>
+              <w:t>90.2x</w:t>
             </w:r>
           </w:p>
         </w:tc>
@@ -25357,7 +27072,7 @@
                 <w:b/>
                 <w:sz w:val="17"/>
               </w:rPr>
-              <w:t>0.62%</w:t>
+              <w:t>0.66%</w:t>
             </w:r>
           </w:p>
         </w:tc>
@@ -25497,7 +27212,7 @@
                 <w:b/>
                 <w:sz w:val="17"/>
               </w:rPr>
-              <w:t>4.9</w:t>
+              <w:t>4.4</w:t>
             </w:r>
           </w:p>
         </w:tc>
@@ -25681,11 +27396,11 @@
           <w:color w:val="2D3748"/>
           <w:sz w:val="19"/>
         </w:rPr>
-        <w:t>• Precio de Referencia: $718.67  |  WACC Auditado: 10.75% (Rf: 5.24%, ERP: 4.75%)</w:t>
+        <w:t>• Precio de Referencia: $642.62  |  WACC Auditado: 10.54% (Rf: 4.99%, ERP: 4.75%)</w:t>
         <w:br/>
-        <w:t>• Crecimiento Implícito Calculado: 20.3% Anual a 10 Años (vs. 18.5% Histórico)</w:t>
+        <w:t>• Crecimiento Implícito Calculado: 23.3% Anual a 10 Años (vs. 18.5% Histórico)</w:t>
         <w:br/>
-        <w:t>• Veredicto: Descuenta expectativas de 20.3% anual. Exigencia de crecimiento ambiciosa (+20.3% anual); requiere catalizadores sostenidos de expansión comercial.</w:t>
+        <w:t>• Veredicto: Descuenta expectativas de 23.3% anual. Exigencia de crecimiento ambiciosa (+23.3% anual); requiere catalizadores sostenidos de expansión comercial.</w:t>
       </w:r>
     </w:p>
     <w:p>
@@ -25837,7 +27552,7 @@
                 <w:b/>
                 <w:sz w:val="17"/>
               </w:rPr>
-              <w:t>$718.67</w:t>
+              <w:t>$642.62</w:t>
             </w:r>
           </w:p>
         </w:tc>
@@ -25895,7 +27610,7 @@
                 <w:b/>
                 <w:sz w:val="17"/>
               </w:rPr>
-              <w:t>5.24%</w:t>
+              <w:t>4.99%</w:t>
             </w:r>
           </w:p>
         </w:tc>
@@ -26069,7 +27784,7 @@
                 <w:b/>
                 <w:sz w:val="17"/>
               </w:rPr>
-              <w:t>5.84%</w:t>
+              <w:t>5.59%</w:t>
             </w:r>
           </w:p>
         </w:tc>
@@ -26127,7 +27842,7 @@
                 <w:b/>
                 <w:sz w:val="17"/>
               </w:rPr>
-              <w:t>4.55%</w:t>
+              <w:t>5.31%</w:t>
             </w:r>
           </w:p>
         </w:tc>
@@ -26185,7 +27900,7 @@
                 <w:b/>
                 <w:sz w:val="17"/>
               </w:rPr>
-              <w:t>22.2%</w:t>
+              <w:t>5.0%</w:t>
             </w:r>
           </w:p>
         </w:tc>
@@ -26243,7 +27958,7 @@
                 <w:b/>
                 <w:sz w:val="17"/>
               </w:rPr>
-              <w:t>4.4%</w:t>
+              <w:t>4.7%</w:t>
             </w:r>
           </w:p>
         </w:tc>
@@ -26301,7 +28016,7 @@
                 <w:b/>
                 <w:sz w:val="17"/>
               </w:rPr>
-              <w:t>95.6%</w:t>
+              <w:t>95.3%</w:t>
             </w:r>
           </w:p>
         </w:tc>
@@ -26359,7 +28074,7 @@
                 <w:b/>
                 <w:sz w:val="17"/>
               </w:rPr>
-              <w:t>10.75%</w:t>
+              <w:t>10.54%</w:t>
             </w:r>
           </w:p>
         </w:tc>
@@ -26417,7 +28132,7 @@
                 <w:b/>
                 <w:sz w:val="17"/>
               </w:rPr>
-              <w:t>17.9%</w:t>
+              <w:t>11.9%</w:t>
             </w:r>
           </w:p>
         </w:tc>
@@ -26744,7 +28459,7 @@
               <w:rPr>
                 <w:sz w:val="16"/>
               </w:rPr>
-              <w:t>9.75% (Bajo / Expansión)</w:t>
+              <w:t>9.54% (Bajo / Expansión)</w:t>
             </w:r>
           </w:p>
         </w:tc>
@@ -26757,7 +28472,7 @@
               <w:rPr>
                 <w:sz w:val="16"/>
               </w:rPr>
-              <w:t>19.8%</w:t>
+              <w:t>22.9%</w:t>
             </w:r>
           </w:p>
         </w:tc>
@@ -26770,7 +28485,7 @@
               <w:rPr>
                 <w:sz w:val="16"/>
               </w:rPr>
-              <w:t>19.3%</w:t>
+              <w:t>22.3%</w:t>
             </w:r>
           </w:p>
         </w:tc>
@@ -26783,7 +28498,7 @@
               <w:rPr>
                 <w:sz w:val="16"/>
               </w:rPr>
-              <w:t>18.7%</w:t>
+              <w:t>21.6%</w:t>
             </w:r>
           </w:p>
         </w:tc>
@@ -26797,7 +28512,7 @@
                 <w:b/>
                 <w:sz w:val="16"/>
               </w:rPr>
-              <w:t>18.0%</w:t>
+              <w:t>20.9%</w:t>
             </w:r>
           </w:p>
         </w:tc>
@@ -26810,7 +28525,7 @@
               <w:rPr>
                 <w:sz w:val="16"/>
               </w:rPr>
-              <w:t>17.3%</w:t>
+              <w:t>20.2%</w:t>
             </w:r>
           </w:p>
         </w:tc>
@@ -26823,7 +28538,7 @@
               <w:rPr>
                 <w:sz w:val="16"/>
               </w:rPr>
-              <w:t>16.6%</w:t>
+              <w:t>19.4%</w:t>
             </w:r>
           </w:p>
         </w:tc>
@@ -26852,7 +28567,7 @@
               <w:rPr>
                 <w:sz w:val="16"/>
               </w:rPr>
-              <w:t>10.25% (Favorable)</w:t>
+              <w:t>10.04% (Favorable)</w:t>
             </w:r>
           </w:p>
         </w:tc>
@@ -26866,7 +28581,7 @@
               <w:rPr>
                 <w:sz w:val="16"/>
               </w:rPr>
-              <w:t>20.9%</w:t>
+              <w:t>23.9%</w:t>
             </w:r>
           </w:p>
         </w:tc>
@@ -26880,7 +28595,7 @@
               <w:rPr>
                 <w:sz w:val="16"/>
               </w:rPr>
-              <w:t>20.3%</w:t>
+              <w:t>23.4%</w:t>
             </w:r>
           </w:p>
         </w:tc>
@@ -26894,7 +28609,7 @@
               <w:rPr>
                 <w:sz w:val="16"/>
               </w:rPr>
-              <w:t>19.8%</w:t>
+              <w:t>22.8%</w:t>
             </w:r>
           </w:p>
         </w:tc>
@@ -26909,7 +28624,7 @@
                 <w:b/>
                 <w:sz w:val="16"/>
               </w:rPr>
-              <w:t>19.2%</w:t>
+              <w:t>22.1%</w:t>
             </w:r>
           </w:p>
         </w:tc>
@@ -26923,7 +28638,7 @@
               <w:rPr>
                 <w:sz w:val="16"/>
               </w:rPr>
-              <w:t>18.5%</w:t>
+              <w:t>21.4%</w:t>
             </w:r>
           </w:p>
         </w:tc>
@@ -26937,7 +28652,7 @@
               <w:rPr>
                 <w:sz w:val="16"/>
               </w:rPr>
-              <w:t>17.8%</w:t>
+              <w:t>20.7%</w:t>
             </w:r>
           </w:p>
         </w:tc>
@@ -26967,7 +28682,7 @@
               <w:rPr>
                 <w:sz w:val="16"/>
               </w:rPr>
-              <w:t>10.75% (WACC Auditado Base)</w:t>
+              <w:t>10.54% (WACC Auditado Base)</w:t>
             </w:r>
           </w:p>
         </w:tc>
@@ -26982,7 +28697,7 @@
                 <w:b/>
                 <w:sz w:val="16"/>
               </w:rPr>
-              <w:t>21.9%</w:t>
+              <w:t>25.0%</w:t>
             </w:r>
           </w:p>
         </w:tc>
@@ -26997,7 +28712,7 @@
                 <w:b/>
                 <w:sz w:val="16"/>
               </w:rPr>
-              <w:t>21.4%</w:t>
+              <w:t>24.5%</w:t>
             </w:r>
           </w:p>
         </w:tc>
@@ -27012,7 +28727,7 @@
                 <w:b/>
                 <w:sz w:val="16"/>
               </w:rPr>
-              <w:t>20.8%</w:t>
+              <w:t>23.9%</w:t>
             </w:r>
           </w:p>
         </w:tc>
@@ -27027,7 +28742,7 @@
                 <w:b/>
                 <w:sz w:val="16"/>
               </w:rPr>
-              <w:t>20.3%</w:t>
+              <w:t>23.3%</w:t>
             </w:r>
           </w:p>
         </w:tc>
@@ -27042,7 +28757,7 @@
                 <w:b/>
                 <w:sz w:val="16"/>
               </w:rPr>
-              <w:t>19.7%</w:t>
+              <w:t>22.6%</w:t>
             </w:r>
           </w:p>
         </w:tc>
@@ -27057,7 +28772,7 @@
                 <w:b/>
                 <w:sz w:val="16"/>
               </w:rPr>
-              <w:t>19.0%</w:t>
+              <w:t>21.9%</w:t>
             </w:r>
           </w:p>
         </w:tc>
@@ -27087,7 +28802,7 @@
               <w:rPr>
                 <w:sz w:val="16"/>
               </w:rPr>
-              <w:t>11.25% (Exigente)</w:t>
+              <w:t>11.04% (Exigente)</w:t>
             </w:r>
           </w:p>
         </w:tc>
@@ -27101,7 +28816,7 @@
               <w:rPr>
                 <w:sz w:val="16"/>
               </w:rPr>
-              <w:t>22.8%</w:t>
+              <w:t>26.0%</w:t>
             </w:r>
           </w:p>
         </w:tc>
@@ -27115,7 +28830,7 @@
               <w:rPr>
                 <w:sz w:val="16"/>
               </w:rPr>
-              <w:t>22.4%</w:t>
+              <w:t>25.5%</w:t>
             </w:r>
           </w:p>
         </w:tc>
@@ -27129,7 +28844,7 @@
               <w:rPr>
                 <w:sz w:val="16"/>
               </w:rPr>
-              <w:t>21.9%</w:t>
+              <w:t>25.0%</w:t>
             </w:r>
           </w:p>
         </w:tc>
@@ -27144,7 +28859,7 @@
                 <w:b/>
                 <w:sz w:val="16"/>
               </w:rPr>
-              <w:t>21.3%</w:t>
+              <w:t>24.4%</w:t>
             </w:r>
           </w:p>
         </w:tc>
@@ -27158,7 +28873,7 @@
               <w:rPr>
                 <w:sz w:val="16"/>
               </w:rPr>
-              <w:t>20.8%</w:t>
+              <w:t>23.8%</w:t>
             </w:r>
           </w:p>
         </w:tc>
@@ -27172,7 +28887,7 @@
               <w:rPr>
                 <w:sz w:val="16"/>
               </w:rPr>
-              <w:t>20.2%</w:t>
+              <w:t>23.2%</w:t>
             </w:r>
           </w:p>
         </w:tc>
@@ -27201,7 +28916,7 @@
               <w:rPr>
                 <w:sz w:val="16"/>
               </w:rPr>
-              <w:t>11.75% (Estrés / Tipos Altos)</w:t>
+              <w:t>11.54% (Estrés / Tipos Altos)</w:t>
             </w:r>
           </w:p>
         </w:tc>
@@ -27214,7 +28929,7 @@
               <w:rPr>
                 <w:sz w:val="16"/>
               </w:rPr>
-              <w:t>23.8%</w:t>
+              <w:t>27.0%</w:t>
             </w:r>
           </w:p>
         </w:tc>
@@ -27227,7 +28942,7 @@
               <w:rPr>
                 <w:sz w:val="16"/>
               </w:rPr>
-              <w:t>23.3%</w:t>
+              <w:t>26.6%</w:t>
             </w:r>
           </w:p>
         </w:tc>
@@ -27240,7 +28955,7 @@
               <w:rPr>
                 <w:sz w:val="16"/>
               </w:rPr>
-              <w:t>22.9%</w:t>
+              <w:t>26.0%</w:t>
             </w:r>
           </w:p>
         </w:tc>
@@ -27254,7 +28969,7 @@
                 <w:b/>
                 <w:sz w:val="16"/>
               </w:rPr>
-              <w:t>22.4%</w:t>
+              <w:t>25.5%</w:t>
             </w:r>
           </w:p>
         </w:tc>
@@ -27267,7 +28982,7 @@
               <w:rPr>
                 <w:sz w:val="16"/>
               </w:rPr>
-              <w:t>21.8%</w:t>
+              <w:t>24.9%</w:t>
             </w:r>
           </w:p>
         </w:tc>
@@ -27280,7 +28995,7 @@
               <w:rPr>
                 <w:sz w:val="16"/>
               </w:rPr>
-              <w:t>21.3%</w:t>
+              <w:t>24.3%</w:t>
             </w:r>
           </w:p>
         </w:tc>
@@ -27451,7 +29166,7 @@
               <w:rPr>
                 <w:sz w:val="17"/>
               </w:rPr>
-              <w:t>Poder de fijación de precios y resiliencia de márgenes (38.1% EBIT).</w:t>
+              <w:t>Poder de fijación de precios y resiliencia de márgenes (32.9% EBIT).</w:t>
             </w:r>
           </w:p>
         </w:tc>
@@ -27482,7 +29197,7 @@
               <w:rPr>
                 <w:sz w:val="17"/>
               </w:rPr>
-              <w:t>Ratio Sloan: -15.25% / Montier: 2/6</w:t>
+              <w:t>Ratio Sloan: -13.69% / Montier: 3/6</w:t>
             </w:r>
           </w:p>
         </w:tc>
@@ -27511,7 +29226,7 @@
               <w:rPr>
                 <w:sz w:val="17"/>
               </w:rPr>
-              <w:t>Ganancias 100% avaladas por caja real ($1.00 CFO por dólar de NI).</w:t>
+              <w:t>Ganancias avaladas por caja real ($1.91 CFO por dólar de NI).</w:t>
             </w:r>
           </w:p>
         </w:tc>
@@ -27540,7 +29255,7 @@
               <w:rPr>
                 <w:sz w:val="17"/>
               </w:rPr>
-              <w:t>Cobertura EBIT: 108.1x / Altman Z'': 4.90</w:t>
+              <w:t>Cobertura EBIT: 90.2x / Altman Z'': 4.40</w:t>
             </w:r>
           </w:p>
         </w:tc>
@@ -27567,7 +29282,7 @@
               <w:rPr>
                 <w:sz w:val="17"/>
               </w:rPr>
-              <w:t>Cero estrés financiero; colchón de $90.3B.</w:t>
+              <w:t>Cero estrés financiero; colchón de $82.4B.</w:t>
             </w:r>
           </w:p>
         </w:tc>
@@ -27598,7 +29313,7 @@
               <w:rPr>
                 <w:sz w:val="17"/>
               </w:rPr>
-              <w:t>ROC Greenblatt: 205.4% / ROIC Adj: 21.5%</w:t>
+              <w:t>ROC Greenblatt: 31.4% / ROIC Adj: 20.4%</w:t>
             </w:r>
           </w:p>
         </w:tc>
@@ -27627,7 +29342,7 @@
               <w:rPr>
                 <w:sz w:val="17"/>
               </w:rPr>
-              <w:t>Spread económico de +10.7 pp sobre WACC (Creación de valor de élite).</w:t>
+              <w:t>Spread económico de +9.8 pp sobre WACC (Creación de valor de élite).</w:t>
             </w:r>
           </w:p>
         </w:tc>
@@ -27656,7 +29371,7 @@
               <w:rPr>
                 <w:sz w:val="17"/>
               </w:rPr>
-              <w:t>Crecimiento Implícito: 20.3% - 16.3%</w:t>
+              <w:t>Crecimiento Implícito: 23.3% - 14.0%</w:t>
             </w:r>
           </w:p>
         </w:tc>
@@ -27683,7 +29398,7 @@
               <w:rPr>
                 <w:sz w:val="17"/>
               </w:rPr>
-              <w:t>Exigencia de crecimiento ambiciosa (+20.3% anual); requiere catalizadores sostenidos de expansión comercial.</w:t>
+              <w:t>Exigencia de crecimiento ambiciosa (+23.3% anual); requiere catalizadores sostenidos de expansión comercial.</w:t>
             </w:r>
           </w:p>
         </w:tc>

</xml_diff>

<commit_message>
feat: implement institutional segment operating margins ASC 280 and universal sum-of-the-parts (SOTP) valuation
</commit_message>
<xml_diff>
--- a/data/processed/META/Analisis_Resultados_LTM_META.docx
+++ b/data/processed/META/Analisis_Resultados_LTM_META.docx
@@ -65,7 +65,7 @@
                 <w:color w:val="D1DFF5"/>
                 <w:sz w:val="17"/>
               </w:rPr>
-              <w:t>Fecha de Análisis: 24 de Septiembre de 2026 | Período Contable: 24 de October de 2026</w:t>
+              <w:t>Fecha de Análisis: 25 de Septiembre de 2026 | Período Contable: 25 de October de 2026</w:t>
               <w:br/>
               <w:t>Fuente Oficial: Formulario 10-Q, Formularios 8-K, Form 4, Form 144 (SEC EDGAR) &amp; Earnings Call Transcript</w:t>
             </w:r>
@@ -851,7 +851,7 @@
                 <w:color w:val="2D3748"/>
                 <w:sz w:val="18"/>
               </w:rPr>
-              <w:t>49.8% Mix</w:t>
+              <w:t>49.8% Mix | 41.0% Mgn Op.</w:t>
             </w:r>
           </w:p>
         </w:tc>
@@ -1009,7 +1009,7 @@
                 <w:color w:val="2D3748"/>
                 <w:sz w:val="18"/>
               </w:rPr>
-              <w:t>0.5% Mix</w:t>
+              <w:t>0.5% Mix | -842.5% Mgn Op.</w:t>
             </w:r>
           </w:p>
         </w:tc>
@@ -29026,7 +29026,583 @@
           <w:color w:val="1B365D"/>
           <w:sz w:val="23"/>
         </w:rPr>
-        <w:t>14.4. Cuadro de Mando Consolidado y Tesis Final de Inversión</w:t>
+        <w:t>14.4. Valoración por Suma de las Partes (SOTP - Sum-of-the-Parts)</w:t>
+      </w:r>
+    </w:p>
+    <w:p>
+      <w:r>
+        <w:rPr>
+          <w:rFonts w:ascii="Calibri" w:hAnsi="Calibri"/>
+          <w:color w:val="2D3748"/>
+          <w:sz w:val="18"/>
+        </w:rPr>
+        <w:t>Al operar con divisiones de negocio diferenciadas en rentabilidad, crecimiento y perfil de riesgo, se aplica un modelo institucional de Suma de las Partes (Sum-of-the-Parts) desagregando las unidades operativas: Family of Apps a 23.0x EV/EBIT ($2,258,071.0 M), Reality Labs a 0.8x EV/Sales (I+D) ($1,784.8 M), resultando en un Equity Value de $2,261,382.8 M y un Valor Teórico SOTP de $887.68 por título.</w:t>
+      </w:r>
+    </w:p>
+    <w:tbl>
+      <w:tblPr>
+        <w:tblW w:type="auto" w:w="0"/>
+        <w:jc w:val="center"/>
+        <w:tblLook w:firstColumn="1" w:firstRow="1" w:lastColumn="0" w:lastRow="0" w:noHBand="0" w:noVBand="1" w:val="04A0"/>
+        <w:tblBorders>
+          <w:top w:val="single" w:sz="6" w:space="0" w:color="D2D6DC"/>
+          <w:bottom w:val="single" w:sz="6" w:space="0" w:color="D2D6DC"/>
+          <w:insideH w:val="single" w:sz="4" w:space="0" w:color="D2D6DC"/>
+          <w:insideV w:val="none"/>
+          <w:left w:val="none"/>
+          <w:right w:val="none"/>
+        </w:tblBorders>
+      </w:tblPr>
+      <w:tblGrid>
+        <w:gridCol w:w="1632"/>
+        <w:gridCol w:w="1632"/>
+        <w:gridCol w:w="1632"/>
+        <w:gridCol w:w="1632"/>
+        <w:gridCol w:w="1632"/>
+        <w:gridCol w:w="1632"/>
+      </w:tblGrid>
+      <w:tr>
+        <w:tc>
+          <w:tcPr>
+            <w:tcW w:type="dxa" w:w="1632"/>
+            <w:shd w:fill="1B365D"/>
+          </w:tcPr>
+          <w:p>
+            <w:r>
+              <w:rPr>
+                <w:b/>
+                <w:color w:val="FFFFFF"/>
+                <w:sz w:val="17"/>
+              </w:rPr>
+              <w:t>Segmento de Negocio</w:t>
+            </w:r>
+          </w:p>
+        </w:tc>
+        <w:tc>
+          <w:tcPr>
+            <w:tcW w:type="dxa" w:w="1632"/>
+            <w:shd w:fill="1B365D"/>
+          </w:tcPr>
+          <w:p>
+            <w:r>
+              <w:rPr>
+                <w:b/>
+                <w:color w:val="FFFFFF"/>
+                <w:sz w:val="17"/>
+              </w:rPr>
+              <w:t>Ventas Base</w:t>
+            </w:r>
+          </w:p>
+        </w:tc>
+        <w:tc>
+          <w:tcPr>
+            <w:tcW w:type="dxa" w:w="1632"/>
+            <w:shd w:fill="1B365D"/>
+          </w:tcPr>
+          <w:p>
+            <w:r>
+              <w:rPr>
+                <w:b/>
+                <w:color w:val="FFFFFF"/>
+                <w:sz w:val="17"/>
+              </w:rPr>
+              <w:t>Margen Op. %</w:t>
+            </w:r>
+          </w:p>
+        </w:tc>
+        <w:tc>
+          <w:tcPr>
+            <w:tcW w:type="dxa" w:w="1632"/>
+            <w:shd w:fill="1B365D"/>
+          </w:tcPr>
+          <w:p>
+            <w:r>
+              <w:rPr>
+                <w:b/>
+                <w:color w:val="FFFFFF"/>
+                <w:sz w:val="17"/>
+              </w:rPr>
+              <w:t>Múltiplo</w:t>
+            </w:r>
+          </w:p>
+        </w:tc>
+        <w:tc>
+          <w:tcPr>
+            <w:tcW w:type="dxa" w:w="1632"/>
+            <w:shd w:fill="1B365D"/>
+          </w:tcPr>
+          <w:p>
+            <w:r>
+              <w:rPr>
+                <w:b/>
+                <w:color w:val="FFFFFF"/>
+                <w:sz w:val="17"/>
+              </w:rPr>
+              <w:t>Enterprise Value</w:t>
+            </w:r>
+          </w:p>
+        </w:tc>
+        <w:tc>
+          <w:tcPr>
+            <w:tcW w:type="dxa" w:w="1632"/>
+            <w:shd w:fill="1B365D"/>
+          </w:tcPr>
+          <w:p>
+            <w:r>
+              <w:rPr>
+                <w:b/>
+                <w:color w:val="FFFFFF"/>
+                <w:sz w:val="17"/>
+              </w:rPr>
+              <w:t>Peso EV</w:t>
+            </w:r>
+          </w:p>
+        </w:tc>
+      </w:tr>
+      <w:tr>
+        <w:tc>
+          <w:tcPr>
+            <w:tcW w:type="dxa" w:w="1632"/>
+          </w:tcPr>
+          <w:p>
+            <w:r>
+              <w:rPr>
+                <w:b/>
+                <w:sz w:val="16"/>
+              </w:rPr>
+              <w:t>Family of Apps</w:t>
+            </w:r>
+          </w:p>
+        </w:tc>
+        <w:tc>
+          <w:tcPr>
+            <w:tcW w:type="dxa" w:w="1632"/>
+          </w:tcPr>
+          <w:p>
+            <w:r>
+              <w:rPr>
+                <w:sz w:val="16"/>
+              </w:rPr>
+              <w:t>$239,374.0 M</w:t>
+            </w:r>
+          </w:p>
+        </w:tc>
+        <w:tc>
+          <w:tcPr>
+            <w:tcW w:type="dxa" w:w="1632"/>
+          </w:tcPr>
+          <w:p>
+            <w:r>
+              <w:rPr>
+                <w:sz w:val="16"/>
+              </w:rPr>
+              <w:t>41.0%</w:t>
+            </w:r>
+          </w:p>
+        </w:tc>
+        <w:tc>
+          <w:tcPr>
+            <w:tcW w:type="dxa" w:w="1632"/>
+          </w:tcPr>
+          <w:p>
+            <w:r>
+              <w:rPr>
+                <w:sz w:val="16"/>
+              </w:rPr>
+              <w:t>23.0x EV/EBIT</w:t>
+            </w:r>
+          </w:p>
+        </w:tc>
+        <w:tc>
+          <w:tcPr>
+            <w:tcW w:type="dxa" w:w="1632"/>
+          </w:tcPr>
+          <w:p>
+            <w:r>
+              <w:rPr>
+                <w:b/>
+                <w:sz w:val="16"/>
+              </w:rPr>
+              <w:t>$2,258,071.0 M</w:t>
+            </w:r>
+          </w:p>
+        </w:tc>
+        <w:tc>
+          <w:tcPr>
+            <w:tcW w:type="dxa" w:w="1632"/>
+          </w:tcPr>
+          <w:p>
+            <w:r>
+              <w:rPr>
+                <w:sz w:val="16"/>
+              </w:rPr>
+              <w:t>99.9%</w:t>
+            </w:r>
+          </w:p>
+        </w:tc>
+      </w:tr>
+      <w:tr>
+        <w:tc>
+          <w:tcPr>
+            <w:tcW w:type="dxa" w:w="1632"/>
+            <w:shd w:fill="F7FAFC"/>
+          </w:tcPr>
+          <w:p>
+            <w:r>
+              <w:rPr>
+                <w:b/>
+                <w:sz w:val="16"/>
+              </w:rPr>
+              <w:t>Reality Labs</w:t>
+            </w:r>
+          </w:p>
+        </w:tc>
+        <w:tc>
+          <w:tcPr>
+            <w:tcW w:type="dxa" w:w="1632"/>
+            <w:shd w:fill="F7FAFC"/>
+          </w:tcPr>
+          <w:p>
+            <w:r>
+              <w:rPr>
+                <w:sz w:val="16"/>
+              </w:rPr>
+              <w:t>$2,231.0 M</w:t>
+            </w:r>
+          </w:p>
+        </w:tc>
+        <w:tc>
+          <w:tcPr>
+            <w:tcW w:type="dxa" w:w="1632"/>
+            <w:shd w:fill="F7FAFC"/>
+          </w:tcPr>
+          <w:p>
+            <w:r>
+              <w:rPr>
+                <w:sz w:val="16"/>
+              </w:rPr>
+              <w:t>-842.5%</w:t>
+            </w:r>
+          </w:p>
+        </w:tc>
+        <w:tc>
+          <w:tcPr>
+            <w:tcW w:type="dxa" w:w="1632"/>
+            <w:shd w:fill="F7FAFC"/>
+          </w:tcPr>
+          <w:p>
+            <w:r>
+              <w:rPr>
+                <w:sz w:val="16"/>
+              </w:rPr>
+              <w:t>0.8x EV/Sales (I+D)</w:t>
+            </w:r>
+          </w:p>
+        </w:tc>
+        <w:tc>
+          <w:tcPr>
+            <w:tcW w:type="dxa" w:w="1632"/>
+            <w:shd w:fill="F7FAFC"/>
+          </w:tcPr>
+          <w:p>
+            <w:r>
+              <w:rPr>
+                <w:b/>
+                <w:sz w:val="16"/>
+              </w:rPr>
+              <w:t>$1,784.8 M</w:t>
+            </w:r>
+          </w:p>
+        </w:tc>
+        <w:tc>
+          <w:tcPr>
+            <w:tcW w:type="dxa" w:w="1632"/>
+            <w:shd w:fill="F7FAFC"/>
+          </w:tcPr>
+          <w:p>
+            <w:r>
+              <w:rPr>
+                <w:sz w:val="16"/>
+              </w:rPr>
+              <w:t>0.1%</w:t>
+            </w:r>
+          </w:p>
+        </w:tc>
+      </w:tr>
+      <w:tr>
+        <w:tc>
+          <w:tcPr>
+            <w:tcW w:type="dxa" w:w="1632"/>
+          </w:tcPr>
+          <w:p>
+            <w:r>
+              <w:rPr>
+                <w:b/>
+                <w:sz w:val="16"/>
+              </w:rPr>
+              <w:t>Total Enterprise Value (EV)</w:t>
+            </w:r>
+          </w:p>
+        </w:tc>
+        <w:tc>
+          <w:tcPr>
+            <w:tcW w:type="dxa" w:w="1632"/>
+          </w:tcPr>
+          <w:p>
+            <w:r>
+              <w:rPr>
+                <w:b/>
+                <w:sz w:val="16"/>
+              </w:rPr>
+              <w:t>$241,605.0 M</w:t>
+            </w:r>
+          </w:p>
+        </w:tc>
+        <w:tc>
+          <w:tcPr>
+            <w:tcW w:type="dxa" w:w="1632"/>
+          </w:tcPr>
+          <w:p>
+            <w:r>
+              <w:rPr>
+                <w:b/>
+                <w:sz w:val="16"/>
+              </w:rPr>
+              <w:t>—</w:t>
+            </w:r>
+          </w:p>
+        </w:tc>
+        <w:tc>
+          <w:tcPr>
+            <w:tcW w:type="dxa" w:w="1632"/>
+          </w:tcPr>
+          <w:p>
+            <w:r>
+              <w:rPr>
+                <w:b/>
+                <w:sz w:val="16"/>
+              </w:rPr>
+              <w:t>—</w:t>
+            </w:r>
+          </w:p>
+        </w:tc>
+        <w:tc>
+          <w:tcPr>
+            <w:tcW w:type="dxa" w:w="1632"/>
+          </w:tcPr>
+          <w:p>
+            <w:r>
+              <w:rPr>
+                <w:b/>
+                <w:sz w:val="16"/>
+              </w:rPr>
+              <w:t>$2,259,855.8 M</w:t>
+            </w:r>
+          </w:p>
+        </w:tc>
+        <w:tc>
+          <w:tcPr>
+            <w:tcW w:type="dxa" w:w="1632"/>
+          </w:tcPr>
+          <w:p>
+            <w:r>
+              <w:rPr>
+                <w:b/>
+                <w:sz w:val="16"/>
+              </w:rPr>
+              <w:t>100.0%</w:t>
+            </w:r>
+          </w:p>
+        </w:tc>
+      </w:tr>
+      <w:tr>
+        <w:tc>
+          <w:tcPr>
+            <w:tcW w:type="dxa" w:w="1632"/>
+            <w:shd w:fill="F7FAFC"/>
+          </w:tcPr>
+          <w:p>
+            <w:r>
+              <w:rPr>
+                <w:b/>
+                <w:sz w:val="16"/>
+              </w:rPr>
+              <w:t>(+) Caja Neta</w:t>
+            </w:r>
+          </w:p>
+        </w:tc>
+        <w:tc>
+          <w:tcPr>
+            <w:tcW w:type="dxa" w:w="1632"/>
+            <w:shd w:fill="F7FAFC"/>
+          </w:tcPr>
+          <w:p>
+            <w:r>
+              <w:rPr>
+                <w:sz w:val="16"/>
+              </w:rPr>
+              <w:t>—</w:t>
+            </w:r>
+          </w:p>
+        </w:tc>
+        <w:tc>
+          <w:tcPr>
+            <w:tcW w:type="dxa" w:w="1632"/>
+            <w:shd w:fill="F7FAFC"/>
+          </w:tcPr>
+          <w:p>
+            <w:r>
+              <w:rPr>
+                <w:sz w:val="16"/>
+              </w:rPr>
+              <w:t>—</w:t>
+            </w:r>
+          </w:p>
+        </w:tc>
+        <w:tc>
+          <w:tcPr>
+            <w:tcW w:type="dxa" w:w="1632"/>
+            <w:shd w:fill="F7FAFC"/>
+          </w:tcPr>
+          <w:p>
+            <w:r>
+              <w:rPr>
+                <w:sz w:val="16"/>
+              </w:rPr>
+              <w:t>—</w:t>
+            </w:r>
+          </w:p>
+        </w:tc>
+        <w:tc>
+          <w:tcPr>
+            <w:tcW w:type="dxa" w:w="1632"/>
+            <w:shd w:fill="F7FAFC"/>
+          </w:tcPr>
+          <w:p>
+            <w:r>
+              <w:rPr>
+                <w:b/>
+                <w:sz w:val="16"/>
+              </w:rPr>
+              <w:t>$1,527.0 M</w:t>
+            </w:r>
+          </w:p>
+        </w:tc>
+        <w:tc>
+          <w:tcPr>
+            <w:tcW w:type="dxa" w:w="1632"/>
+            <w:shd w:fill="F7FAFC"/>
+          </w:tcPr>
+          <w:p>
+            <w:r>
+              <w:rPr>
+                <w:sz w:val="16"/>
+              </w:rPr>
+              <w:t>—</w:t>
+            </w:r>
+          </w:p>
+        </w:tc>
+      </w:tr>
+      <w:tr>
+        <w:tc>
+          <w:tcPr>
+            <w:tcW w:type="dxa" w:w="1632"/>
+          </w:tcPr>
+          <w:p>
+            <w:r>
+              <w:rPr>
+                <w:b/>
+                <w:sz w:val="16"/>
+              </w:rPr>
+              <w:t>Equity Value Justificado SOTP</w:t>
+            </w:r>
+          </w:p>
+        </w:tc>
+        <w:tc>
+          <w:tcPr>
+            <w:tcW w:type="dxa" w:w="1632"/>
+          </w:tcPr>
+          <w:p>
+            <w:r>
+              <w:rPr>
+                <w:b/>
+                <w:sz w:val="16"/>
+              </w:rPr>
+              <w:t>—</w:t>
+            </w:r>
+          </w:p>
+        </w:tc>
+        <w:tc>
+          <w:tcPr>
+            <w:tcW w:type="dxa" w:w="1632"/>
+          </w:tcPr>
+          <w:p>
+            <w:r>
+              <w:rPr>
+                <w:b/>
+                <w:sz w:val="16"/>
+              </w:rPr>
+              <w:t>—</w:t>
+            </w:r>
+          </w:p>
+        </w:tc>
+        <w:tc>
+          <w:tcPr>
+            <w:tcW w:type="dxa" w:w="1632"/>
+          </w:tcPr>
+          <w:p>
+            <w:r>
+              <w:rPr>
+                <w:b/>
+                <w:sz w:val="16"/>
+              </w:rPr>
+              <w:t>—</w:t>
+            </w:r>
+          </w:p>
+        </w:tc>
+        <w:tc>
+          <w:tcPr>
+            <w:tcW w:type="dxa" w:w="1632"/>
+          </w:tcPr>
+          <w:p>
+            <w:r>
+              <w:rPr>
+                <w:b/>
+                <w:sz w:val="16"/>
+              </w:rPr>
+              <w:t>$2,261,382.8 M</w:t>
+            </w:r>
+          </w:p>
+        </w:tc>
+        <w:tc>
+          <w:tcPr>
+            <w:tcW w:type="dxa" w:w="1632"/>
+          </w:tcPr>
+          <w:p>
+            <w:r>
+              <w:rPr>
+                <w:b/>
+                <w:sz w:val="16"/>
+              </w:rPr>
+              <w:t>$887.68/sh (+38.1%)</w:t>
+            </w:r>
+          </w:p>
+        </w:tc>
+      </w:tr>
+    </w:tbl>
+    <w:p/>
+    <w:p>
+      <w:pPr>
+        <w:pStyle w:val="Heading2"/>
+      </w:pPr>
+      <w:r>
+        <w:rPr>
+          <w:rFonts w:ascii="Calibri" w:hAnsi="Calibri"/>
+          <w:b/>
+          <w:color w:val="1B365D"/>
+          <w:sz w:val="23"/>
+        </w:rPr>
+        <w:t>14.5. Cuadro de Mando Consolidado y Tesis Final de Inversión</w:t>
       </w:r>
     </w:p>
     <w:tbl>

</xml_diff>

<commit_message>
refactor: eliminar completamente modelo y visualizaciones de valoracion SOTP
</commit_message>
<xml_diff>
--- a/data/processed/META/Analisis_Resultados_LTM_META.docx
+++ b/data/processed/META/Analisis_Resultados_LTM_META.docx
@@ -65,7 +65,7 @@
                 <w:color w:val="D1DFF5"/>
                 <w:sz w:val="17"/>
               </w:rPr>
-              <w:t>Fecha de Análisis: 25 de Septiembre de 2026 | Período Contable: 25 de October de 2026</w:t>
+              <w:t>Fecha de Análisis: 28 de Septiembre de 2026 | Período Contable: 28 de October de 2026</w:t>
               <w:br/>
               <w:t>Fuente Oficial: Formulario 10-Q, Formularios 8-K, Form 4, Form 144 (SEC EDGAR) &amp; Earnings Call Transcript</w:t>
             </w:r>
@@ -29026,583 +29026,7 @@
           <w:color w:val="1B365D"/>
           <w:sz w:val="23"/>
         </w:rPr>
-        <w:t>14.4. Valoración por Suma de las Partes (SOTP - Sum-of-the-Parts)</w:t>
-      </w:r>
-    </w:p>
-    <w:p>
-      <w:r>
-        <w:rPr>
-          <w:rFonts w:ascii="Calibri" w:hAnsi="Calibri"/>
-          <w:color w:val="2D3748"/>
-          <w:sz w:val="18"/>
-        </w:rPr>
-        <w:t>Al operar con divisiones de negocio diferenciadas en rentabilidad, crecimiento y perfil de riesgo, se aplica un modelo institucional de Suma de las Partes (Sum-of-the-Parts) desagregando las unidades operativas: Family of Apps a 23.0x EV/EBIT ($2,258,071.0 M), Reality Labs a 0.8x EV/Sales (I+D) ($1,784.8 M), resultando en un Equity Value de $2,261,382.8 M y un Valor Teórico SOTP de $887.68 por título.</w:t>
-      </w:r>
-    </w:p>
-    <w:tbl>
-      <w:tblPr>
-        <w:tblW w:type="auto" w:w="0"/>
-        <w:jc w:val="center"/>
-        <w:tblLook w:firstColumn="1" w:firstRow="1" w:lastColumn="0" w:lastRow="0" w:noHBand="0" w:noVBand="1" w:val="04A0"/>
-        <w:tblBorders>
-          <w:top w:val="single" w:sz="6" w:space="0" w:color="D2D6DC"/>
-          <w:bottom w:val="single" w:sz="6" w:space="0" w:color="D2D6DC"/>
-          <w:insideH w:val="single" w:sz="4" w:space="0" w:color="D2D6DC"/>
-          <w:insideV w:val="none"/>
-          <w:left w:val="none"/>
-          <w:right w:val="none"/>
-        </w:tblBorders>
-      </w:tblPr>
-      <w:tblGrid>
-        <w:gridCol w:w="1632"/>
-        <w:gridCol w:w="1632"/>
-        <w:gridCol w:w="1632"/>
-        <w:gridCol w:w="1632"/>
-        <w:gridCol w:w="1632"/>
-        <w:gridCol w:w="1632"/>
-      </w:tblGrid>
-      <w:tr>
-        <w:tc>
-          <w:tcPr>
-            <w:tcW w:type="dxa" w:w="1632"/>
-            <w:shd w:fill="1B365D"/>
-          </w:tcPr>
-          <w:p>
-            <w:r>
-              <w:rPr>
-                <w:b/>
-                <w:color w:val="FFFFFF"/>
-                <w:sz w:val="17"/>
-              </w:rPr>
-              <w:t>Segmento de Negocio</w:t>
-            </w:r>
-          </w:p>
-        </w:tc>
-        <w:tc>
-          <w:tcPr>
-            <w:tcW w:type="dxa" w:w="1632"/>
-            <w:shd w:fill="1B365D"/>
-          </w:tcPr>
-          <w:p>
-            <w:r>
-              <w:rPr>
-                <w:b/>
-                <w:color w:val="FFFFFF"/>
-                <w:sz w:val="17"/>
-              </w:rPr>
-              <w:t>Ventas Base</w:t>
-            </w:r>
-          </w:p>
-        </w:tc>
-        <w:tc>
-          <w:tcPr>
-            <w:tcW w:type="dxa" w:w="1632"/>
-            <w:shd w:fill="1B365D"/>
-          </w:tcPr>
-          <w:p>
-            <w:r>
-              <w:rPr>
-                <w:b/>
-                <w:color w:val="FFFFFF"/>
-                <w:sz w:val="17"/>
-              </w:rPr>
-              <w:t>Margen Op. %</w:t>
-            </w:r>
-          </w:p>
-        </w:tc>
-        <w:tc>
-          <w:tcPr>
-            <w:tcW w:type="dxa" w:w="1632"/>
-            <w:shd w:fill="1B365D"/>
-          </w:tcPr>
-          <w:p>
-            <w:r>
-              <w:rPr>
-                <w:b/>
-                <w:color w:val="FFFFFF"/>
-                <w:sz w:val="17"/>
-              </w:rPr>
-              <w:t>Múltiplo</w:t>
-            </w:r>
-          </w:p>
-        </w:tc>
-        <w:tc>
-          <w:tcPr>
-            <w:tcW w:type="dxa" w:w="1632"/>
-            <w:shd w:fill="1B365D"/>
-          </w:tcPr>
-          <w:p>
-            <w:r>
-              <w:rPr>
-                <w:b/>
-                <w:color w:val="FFFFFF"/>
-                <w:sz w:val="17"/>
-              </w:rPr>
-              <w:t>Enterprise Value</w:t>
-            </w:r>
-          </w:p>
-        </w:tc>
-        <w:tc>
-          <w:tcPr>
-            <w:tcW w:type="dxa" w:w="1632"/>
-            <w:shd w:fill="1B365D"/>
-          </w:tcPr>
-          <w:p>
-            <w:r>
-              <w:rPr>
-                <w:b/>
-                <w:color w:val="FFFFFF"/>
-                <w:sz w:val="17"/>
-              </w:rPr>
-              <w:t>Peso EV</w:t>
-            </w:r>
-          </w:p>
-        </w:tc>
-      </w:tr>
-      <w:tr>
-        <w:tc>
-          <w:tcPr>
-            <w:tcW w:type="dxa" w:w="1632"/>
-          </w:tcPr>
-          <w:p>
-            <w:r>
-              <w:rPr>
-                <w:b/>
-                <w:sz w:val="16"/>
-              </w:rPr>
-              <w:t>Family of Apps</w:t>
-            </w:r>
-          </w:p>
-        </w:tc>
-        <w:tc>
-          <w:tcPr>
-            <w:tcW w:type="dxa" w:w="1632"/>
-          </w:tcPr>
-          <w:p>
-            <w:r>
-              <w:rPr>
-                <w:sz w:val="16"/>
-              </w:rPr>
-              <w:t>$239,374.0 M</w:t>
-            </w:r>
-          </w:p>
-        </w:tc>
-        <w:tc>
-          <w:tcPr>
-            <w:tcW w:type="dxa" w:w="1632"/>
-          </w:tcPr>
-          <w:p>
-            <w:r>
-              <w:rPr>
-                <w:sz w:val="16"/>
-              </w:rPr>
-              <w:t>41.0%</w:t>
-            </w:r>
-          </w:p>
-        </w:tc>
-        <w:tc>
-          <w:tcPr>
-            <w:tcW w:type="dxa" w:w="1632"/>
-          </w:tcPr>
-          <w:p>
-            <w:r>
-              <w:rPr>
-                <w:sz w:val="16"/>
-              </w:rPr>
-              <w:t>23.0x EV/EBIT</w:t>
-            </w:r>
-          </w:p>
-        </w:tc>
-        <w:tc>
-          <w:tcPr>
-            <w:tcW w:type="dxa" w:w="1632"/>
-          </w:tcPr>
-          <w:p>
-            <w:r>
-              <w:rPr>
-                <w:b/>
-                <w:sz w:val="16"/>
-              </w:rPr>
-              <w:t>$2,258,071.0 M</w:t>
-            </w:r>
-          </w:p>
-        </w:tc>
-        <w:tc>
-          <w:tcPr>
-            <w:tcW w:type="dxa" w:w="1632"/>
-          </w:tcPr>
-          <w:p>
-            <w:r>
-              <w:rPr>
-                <w:sz w:val="16"/>
-              </w:rPr>
-              <w:t>99.9%</w:t>
-            </w:r>
-          </w:p>
-        </w:tc>
-      </w:tr>
-      <w:tr>
-        <w:tc>
-          <w:tcPr>
-            <w:tcW w:type="dxa" w:w="1632"/>
-            <w:shd w:fill="F7FAFC"/>
-          </w:tcPr>
-          <w:p>
-            <w:r>
-              <w:rPr>
-                <w:b/>
-                <w:sz w:val="16"/>
-              </w:rPr>
-              <w:t>Reality Labs</w:t>
-            </w:r>
-          </w:p>
-        </w:tc>
-        <w:tc>
-          <w:tcPr>
-            <w:tcW w:type="dxa" w:w="1632"/>
-            <w:shd w:fill="F7FAFC"/>
-          </w:tcPr>
-          <w:p>
-            <w:r>
-              <w:rPr>
-                <w:sz w:val="16"/>
-              </w:rPr>
-              <w:t>$2,231.0 M</w:t>
-            </w:r>
-          </w:p>
-        </w:tc>
-        <w:tc>
-          <w:tcPr>
-            <w:tcW w:type="dxa" w:w="1632"/>
-            <w:shd w:fill="F7FAFC"/>
-          </w:tcPr>
-          <w:p>
-            <w:r>
-              <w:rPr>
-                <w:sz w:val="16"/>
-              </w:rPr>
-              <w:t>-842.5%</w:t>
-            </w:r>
-          </w:p>
-        </w:tc>
-        <w:tc>
-          <w:tcPr>
-            <w:tcW w:type="dxa" w:w="1632"/>
-            <w:shd w:fill="F7FAFC"/>
-          </w:tcPr>
-          <w:p>
-            <w:r>
-              <w:rPr>
-                <w:sz w:val="16"/>
-              </w:rPr>
-              <w:t>0.8x EV/Sales (I+D)</w:t>
-            </w:r>
-          </w:p>
-        </w:tc>
-        <w:tc>
-          <w:tcPr>
-            <w:tcW w:type="dxa" w:w="1632"/>
-            <w:shd w:fill="F7FAFC"/>
-          </w:tcPr>
-          <w:p>
-            <w:r>
-              <w:rPr>
-                <w:b/>
-                <w:sz w:val="16"/>
-              </w:rPr>
-              <w:t>$1,784.8 M</w:t>
-            </w:r>
-          </w:p>
-        </w:tc>
-        <w:tc>
-          <w:tcPr>
-            <w:tcW w:type="dxa" w:w="1632"/>
-            <w:shd w:fill="F7FAFC"/>
-          </w:tcPr>
-          <w:p>
-            <w:r>
-              <w:rPr>
-                <w:sz w:val="16"/>
-              </w:rPr>
-              <w:t>0.1%</w:t>
-            </w:r>
-          </w:p>
-        </w:tc>
-      </w:tr>
-      <w:tr>
-        <w:tc>
-          <w:tcPr>
-            <w:tcW w:type="dxa" w:w="1632"/>
-          </w:tcPr>
-          <w:p>
-            <w:r>
-              <w:rPr>
-                <w:b/>
-                <w:sz w:val="16"/>
-              </w:rPr>
-              <w:t>Total Enterprise Value (EV)</w:t>
-            </w:r>
-          </w:p>
-        </w:tc>
-        <w:tc>
-          <w:tcPr>
-            <w:tcW w:type="dxa" w:w="1632"/>
-          </w:tcPr>
-          <w:p>
-            <w:r>
-              <w:rPr>
-                <w:b/>
-                <w:sz w:val="16"/>
-              </w:rPr>
-              <w:t>$241,605.0 M</w:t>
-            </w:r>
-          </w:p>
-        </w:tc>
-        <w:tc>
-          <w:tcPr>
-            <w:tcW w:type="dxa" w:w="1632"/>
-          </w:tcPr>
-          <w:p>
-            <w:r>
-              <w:rPr>
-                <w:b/>
-                <w:sz w:val="16"/>
-              </w:rPr>
-              <w:t>—</w:t>
-            </w:r>
-          </w:p>
-        </w:tc>
-        <w:tc>
-          <w:tcPr>
-            <w:tcW w:type="dxa" w:w="1632"/>
-          </w:tcPr>
-          <w:p>
-            <w:r>
-              <w:rPr>
-                <w:b/>
-                <w:sz w:val="16"/>
-              </w:rPr>
-              <w:t>—</w:t>
-            </w:r>
-          </w:p>
-        </w:tc>
-        <w:tc>
-          <w:tcPr>
-            <w:tcW w:type="dxa" w:w="1632"/>
-          </w:tcPr>
-          <w:p>
-            <w:r>
-              <w:rPr>
-                <w:b/>
-                <w:sz w:val="16"/>
-              </w:rPr>
-              <w:t>$2,259,855.8 M</w:t>
-            </w:r>
-          </w:p>
-        </w:tc>
-        <w:tc>
-          <w:tcPr>
-            <w:tcW w:type="dxa" w:w="1632"/>
-          </w:tcPr>
-          <w:p>
-            <w:r>
-              <w:rPr>
-                <w:b/>
-                <w:sz w:val="16"/>
-              </w:rPr>
-              <w:t>100.0%</w:t>
-            </w:r>
-          </w:p>
-        </w:tc>
-      </w:tr>
-      <w:tr>
-        <w:tc>
-          <w:tcPr>
-            <w:tcW w:type="dxa" w:w="1632"/>
-            <w:shd w:fill="F7FAFC"/>
-          </w:tcPr>
-          <w:p>
-            <w:r>
-              <w:rPr>
-                <w:b/>
-                <w:sz w:val="16"/>
-              </w:rPr>
-              <w:t>(+) Caja Neta</w:t>
-            </w:r>
-          </w:p>
-        </w:tc>
-        <w:tc>
-          <w:tcPr>
-            <w:tcW w:type="dxa" w:w="1632"/>
-            <w:shd w:fill="F7FAFC"/>
-          </w:tcPr>
-          <w:p>
-            <w:r>
-              <w:rPr>
-                <w:sz w:val="16"/>
-              </w:rPr>
-              <w:t>—</w:t>
-            </w:r>
-          </w:p>
-        </w:tc>
-        <w:tc>
-          <w:tcPr>
-            <w:tcW w:type="dxa" w:w="1632"/>
-            <w:shd w:fill="F7FAFC"/>
-          </w:tcPr>
-          <w:p>
-            <w:r>
-              <w:rPr>
-                <w:sz w:val="16"/>
-              </w:rPr>
-              <w:t>—</w:t>
-            </w:r>
-          </w:p>
-        </w:tc>
-        <w:tc>
-          <w:tcPr>
-            <w:tcW w:type="dxa" w:w="1632"/>
-            <w:shd w:fill="F7FAFC"/>
-          </w:tcPr>
-          <w:p>
-            <w:r>
-              <w:rPr>
-                <w:sz w:val="16"/>
-              </w:rPr>
-              <w:t>—</w:t>
-            </w:r>
-          </w:p>
-        </w:tc>
-        <w:tc>
-          <w:tcPr>
-            <w:tcW w:type="dxa" w:w="1632"/>
-            <w:shd w:fill="F7FAFC"/>
-          </w:tcPr>
-          <w:p>
-            <w:r>
-              <w:rPr>
-                <w:b/>
-                <w:sz w:val="16"/>
-              </w:rPr>
-              <w:t>$1,527.0 M</w:t>
-            </w:r>
-          </w:p>
-        </w:tc>
-        <w:tc>
-          <w:tcPr>
-            <w:tcW w:type="dxa" w:w="1632"/>
-            <w:shd w:fill="F7FAFC"/>
-          </w:tcPr>
-          <w:p>
-            <w:r>
-              <w:rPr>
-                <w:sz w:val="16"/>
-              </w:rPr>
-              <w:t>—</w:t>
-            </w:r>
-          </w:p>
-        </w:tc>
-      </w:tr>
-      <w:tr>
-        <w:tc>
-          <w:tcPr>
-            <w:tcW w:type="dxa" w:w="1632"/>
-          </w:tcPr>
-          <w:p>
-            <w:r>
-              <w:rPr>
-                <w:b/>
-                <w:sz w:val="16"/>
-              </w:rPr>
-              <w:t>Equity Value Justificado SOTP</w:t>
-            </w:r>
-          </w:p>
-        </w:tc>
-        <w:tc>
-          <w:tcPr>
-            <w:tcW w:type="dxa" w:w="1632"/>
-          </w:tcPr>
-          <w:p>
-            <w:r>
-              <w:rPr>
-                <w:b/>
-                <w:sz w:val="16"/>
-              </w:rPr>
-              <w:t>—</w:t>
-            </w:r>
-          </w:p>
-        </w:tc>
-        <w:tc>
-          <w:tcPr>
-            <w:tcW w:type="dxa" w:w="1632"/>
-          </w:tcPr>
-          <w:p>
-            <w:r>
-              <w:rPr>
-                <w:b/>
-                <w:sz w:val="16"/>
-              </w:rPr>
-              <w:t>—</w:t>
-            </w:r>
-          </w:p>
-        </w:tc>
-        <w:tc>
-          <w:tcPr>
-            <w:tcW w:type="dxa" w:w="1632"/>
-          </w:tcPr>
-          <w:p>
-            <w:r>
-              <w:rPr>
-                <w:b/>
-                <w:sz w:val="16"/>
-              </w:rPr>
-              <w:t>—</w:t>
-            </w:r>
-          </w:p>
-        </w:tc>
-        <w:tc>
-          <w:tcPr>
-            <w:tcW w:type="dxa" w:w="1632"/>
-          </w:tcPr>
-          <w:p>
-            <w:r>
-              <w:rPr>
-                <w:b/>
-                <w:sz w:val="16"/>
-              </w:rPr>
-              <w:t>$2,261,382.8 M</w:t>
-            </w:r>
-          </w:p>
-        </w:tc>
-        <w:tc>
-          <w:tcPr>
-            <w:tcW w:type="dxa" w:w="1632"/>
-          </w:tcPr>
-          <w:p>
-            <w:r>
-              <w:rPr>
-                <w:b/>
-                <w:sz w:val="16"/>
-              </w:rPr>
-              <w:t>$887.68/sh (+38.1%)</w:t>
-            </w:r>
-          </w:p>
-        </w:tc>
-      </w:tr>
-    </w:tbl>
-    <w:p/>
-    <w:p>
-      <w:pPr>
-        <w:pStyle w:val="Heading2"/>
-      </w:pPr>
-      <w:r>
-        <w:rPr>
-          <w:rFonts w:ascii="Calibri" w:hAnsi="Calibri"/>
-          <w:b/>
-          <w:color w:val="1B365D"/>
-          <w:sz w:val="23"/>
-        </w:rPr>
-        <w:t>14.5. Cuadro de Mando Consolidado y Tesis Final de Inversión</w:t>
+        <w:t>14.4. Cuadro de Mando Consolidado y Tesis Final de Inversión</w:t>
       </w:r>
     </w:p>
     <w:tbl>

</xml_diff>